<commit_message>
Redshift load data part II
</commit_message>
<xml_diff>
--- a/New folder/Redshift load data- Doc 4-DE.docx
+++ b/New folder/Redshift load data- Doc 4-DE.docx
@@ -651,7 +651,6 @@
               </w:rPr>
               <w:t xml:space="preserve">create table </w:t>
             </w:r>
-            <w:proofErr w:type="spellStart"/>
             <w:proofErr w:type="gramStart"/>
             <w:r>
               <w:rPr>
@@ -662,7 +661,6 @@
               </w:rPr>
               <w:t>test.listing</w:t>
             </w:r>
-            <w:proofErr w:type="spellEnd"/>
             <w:proofErr w:type="gramEnd"/>
             <w:r>
               <w:rPr>
@@ -692,38 +690,90 @@
                 <w:szCs w:val="24"/>
               </w:rPr>
               <w:tab/>
-            </w:r>
-            <w:proofErr w:type="spellStart"/>
-            <w:r>
-              <w:rPr>
-                <w:rFonts w:ascii="Calibri" w:eastAsia="Calibri" w:hAnsi="Calibri" w:cs="Calibri"/>
-                <w:color w:val="16191F"/>
-                <w:sz w:val="24"/>
-                <w:szCs w:val="24"/>
-              </w:rPr>
-              <w:t>listid</w:t>
-            </w:r>
-            <w:proofErr w:type="spellEnd"/>
-            <w:r>
-              <w:rPr>
-                <w:rFonts w:ascii="Calibri" w:eastAsia="Calibri" w:hAnsi="Calibri" w:cs="Calibri"/>
-                <w:color w:val="16191F"/>
-                <w:sz w:val="24"/>
-                <w:szCs w:val="24"/>
-              </w:rPr>
-              <w:t xml:space="preserve"> integer not null </w:t>
-            </w:r>
-            <w:proofErr w:type="spellStart"/>
-            <w:r>
-              <w:rPr>
-                <w:rFonts w:ascii="Calibri" w:eastAsia="Calibri" w:hAnsi="Calibri" w:cs="Calibri"/>
-                <w:color w:val="16191F"/>
-                <w:sz w:val="24"/>
-                <w:szCs w:val="24"/>
-              </w:rPr>
-              <w:t>distkey</w:t>
-            </w:r>
-            <w:proofErr w:type="spellEnd"/>
+              <w:t>listid integer not null distkey,</w:t>
+            </w:r>
+          </w:p>
+          <w:p>
+            <w:pPr>
+              <w:jc w:val="both"/>
+              <w:rPr>
+                <w:rFonts w:ascii="Calibri" w:eastAsia="Calibri" w:hAnsi="Calibri" w:cs="Calibri"/>
+                <w:color w:val="16191F"/>
+                <w:sz w:val="24"/>
+                <w:szCs w:val="24"/>
+              </w:rPr>
+            </w:pPr>
+            <w:r>
+              <w:rPr>
+                <w:rFonts w:ascii="Calibri" w:eastAsia="Calibri" w:hAnsi="Calibri" w:cs="Calibri"/>
+                <w:color w:val="16191F"/>
+                <w:sz w:val="24"/>
+                <w:szCs w:val="24"/>
+              </w:rPr>
+              <w:tab/>
+              <w:t>sellerid integer not null,</w:t>
+            </w:r>
+          </w:p>
+          <w:p>
+            <w:pPr>
+              <w:jc w:val="both"/>
+              <w:rPr>
+                <w:rFonts w:ascii="Calibri" w:eastAsia="Calibri" w:hAnsi="Calibri" w:cs="Calibri"/>
+                <w:color w:val="16191F"/>
+                <w:sz w:val="24"/>
+                <w:szCs w:val="24"/>
+              </w:rPr>
+            </w:pPr>
+            <w:r>
+              <w:rPr>
+                <w:rFonts w:ascii="Calibri" w:eastAsia="Calibri" w:hAnsi="Calibri" w:cs="Calibri"/>
+                <w:color w:val="16191F"/>
+                <w:sz w:val="24"/>
+                <w:szCs w:val="24"/>
+              </w:rPr>
+              <w:tab/>
+              <w:t>eventid integer not null,</w:t>
+            </w:r>
+          </w:p>
+          <w:p>
+            <w:pPr>
+              <w:jc w:val="both"/>
+              <w:rPr>
+                <w:rFonts w:ascii="Calibri" w:eastAsia="Calibri" w:hAnsi="Calibri" w:cs="Calibri"/>
+                <w:color w:val="16191F"/>
+                <w:sz w:val="24"/>
+                <w:szCs w:val="24"/>
+              </w:rPr>
+            </w:pPr>
+            <w:r>
+              <w:rPr>
+                <w:rFonts w:ascii="Calibri" w:eastAsia="Calibri" w:hAnsi="Calibri" w:cs="Calibri"/>
+                <w:color w:val="16191F"/>
+                <w:sz w:val="24"/>
+                <w:szCs w:val="24"/>
+              </w:rPr>
+              <w:tab/>
+            </w:r>
+            <w:r>
+              <w:rPr>
+                <w:rFonts w:ascii="Calibri" w:eastAsia="Calibri" w:hAnsi="Calibri" w:cs="Calibri"/>
+                <w:color w:val="16191F"/>
+                <w:sz w:val="24"/>
+                <w:szCs w:val="24"/>
+              </w:rPr>
+              <w:t xml:space="preserve">dateid smallint not </w:t>
+            </w:r>
+            <w:proofErr w:type="gramStart"/>
+            <w:r>
+              <w:rPr>
+                <w:rFonts w:ascii="Calibri" w:eastAsia="Calibri" w:hAnsi="Calibri" w:cs="Calibri"/>
+                <w:color w:val="16191F"/>
+                <w:sz w:val="24"/>
+                <w:szCs w:val="24"/>
+              </w:rPr>
+              <w:t>null  sortkey</w:t>
+            </w:r>
+            <w:proofErr w:type="gramEnd"/>
             <w:r>
               <w:rPr>
                 <w:rFonts w:ascii="Calibri" w:eastAsia="Calibri" w:hAnsi="Calibri" w:cs="Calibri"/>
@@ -752,26 +802,7 @@
                 <w:szCs w:val="24"/>
               </w:rPr>
               <w:tab/>
-            </w:r>
-            <w:proofErr w:type="spellStart"/>
-            <w:r>
-              <w:rPr>
-                <w:rFonts w:ascii="Calibri" w:eastAsia="Calibri" w:hAnsi="Calibri" w:cs="Calibri"/>
-                <w:color w:val="16191F"/>
-                <w:sz w:val="24"/>
-                <w:szCs w:val="24"/>
-              </w:rPr>
-              <w:t>sellerid</w:t>
-            </w:r>
-            <w:proofErr w:type="spellEnd"/>
-            <w:r>
-              <w:rPr>
-                <w:rFonts w:ascii="Calibri" w:eastAsia="Calibri" w:hAnsi="Calibri" w:cs="Calibri"/>
-                <w:color w:val="16191F"/>
-                <w:sz w:val="24"/>
-                <w:szCs w:val="24"/>
-              </w:rPr>
-              <w:t xml:space="preserve"> integer not null,</w:t>
+              <w:t>numtickets smallint not null,</w:t>
             </w:r>
           </w:p>
           <w:p>
@@ -792,26 +823,27 @@
                 <w:szCs w:val="24"/>
               </w:rPr>
               <w:tab/>
-            </w:r>
-            <w:proofErr w:type="spellStart"/>
-            <w:r>
-              <w:rPr>
-                <w:rFonts w:ascii="Calibri" w:eastAsia="Calibri" w:hAnsi="Calibri" w:cs="Calibri"/>
-                <w:color w:val="16191F"/>
-                <w:sz w:val="24"/>
-                <w:szCs w:val="24"/>
-              </w:rPr>
-              <w:t>eventid</w:t>
-            </w:r>
-            <w:proofErr w:type="spellEnd"/>
-            <w:r>
-              <w:rPr>
-                <w:rFonts w:ascii="Calibri" w:eastAsia="Calibri" w:hAnsi="Calibri" w:cs="Calibri"/>
-                <w:color w:val="16191F"/>
-                <w:sz w:val="24"/>
-                <w:szCs w:val="24"/>
-              </w:rPr>
-              <w:t xml:space="preserve"> integer not null,</w:t>
+              <w:t xml:space="preserve">priceperticket </w:t>
+            </w:r>
+            <w:proofErr w:type="gramStart"/>
+            <w:r>
+              <w:rPr>
+                <w:rFonts w:ascii="Calibri" w:eastAsia="Calibri" w:hAnsi="Calibri" w:cs="Calibri"/>
+                <w:color w:val="16191F"/>
+                <w:sz w:val="24"/>
+                <w:szCs w:val="24"/>
+              </w:rPr>
+              <w:t>decimal(</w:t>
+            </w:r>
+            <w:proofErr w:type="gramEnd"/>
+            <w:r>
+              <w:rPr>
+                <w:rFonts w:ascii="Calibri" w:eastAsia="Calibri" w:hAnsi="Calibri" w:cs="Calibri"/>
+                <w:color w:val="16191F"/>
+                <w:sz w:val="24"/>
+                <w:szCs w:val="24"/>
+              </w:rPr>
+              <w:t>8,2),</w:t>
             </w:r>
           </w:p>
           <w:p>
@@ -832,46 +864,7 @@
                 <w:szCs w:val="24"/>
               </w:rPr>
               <w:tab/>
-            </w:r>
-            <w:proofErr w:type="spellStart"/>
-            <w:r>
-              <w:rPr>
-                <w:rFonts w:ascii="Calibri" w:eastAsia="Calibri" w:hAnsi="Calibri" w:cs="Calibri"/>
-                <w:color w:val="16191F"/>
-                <w:sz w:val="24"/>
-                <w:szCs w:val="24"/>
-              </w:rPr>
-              <w:t>dateid</w:t>
-            </w:r>
-            <w:proofErr w:type="spellEnd"/>
-            <w:r>
-              <w:rPr>
-                <w:rFonts w:ascii="Calibri" w:eastAsia="Calibri" w:hAnsi="Calibri" w:cs="Calibri"/>
-                <w:color w:val="16191F"/>
-                <w:sz w:val="24"/>
-                <w:szCs w:val="24"/>
-              </w:rPr>
-              <w:t xml:space="preserve"> </w:t>
-            </w:r>
-            <w:proofErr w:type="spellStart"/>
-            <w:r>
-              <w:rPr>
-                <w:rFonts w:ascii="Calibri" w:eastAsia="Calibri" w:hAnsi="Calibri" w:cs="Calibri"/>
-                <w:color w:val="16191F"/>
-                <w:sz w:val="24"/>
-                <w:szCs w:val="24"/>
-              </w:rPr>
-              <w:t>smallint</w:t>
-            </w:r>
-            <w:proofErr w:type="spellEnd"/>
-            <w:r>
-              <w:rPr>
-                <w:rFonts w:ascii="Calibri" w:eastAsia="Calibri" w:hAnsi="Calibri" w:cs="Calibri"/>
-                <w:color w:val="16191F"/>
-                <w:sz w:val="24"/>
-                <w:szCs w:val="24"/>
-              </w:rPr>
-              <w:t xml:space="preserve"> not </w:t>
+              <w:t xml:space="preserve">totalprice </w:t>
             </w:r>
             <w:proofErr w:type="gramStart"/>
             <w:r>
@@ -881,19 +874,8 @@
                 <w:sz w:val="24"/>
                 <w:szCs w:val="24"/>
               </w:rPr>
-              <w:t xml:space="preserve">null  </w:t>
-            </w:r>
-            <w:proofErr w:type="spellStart"/>
-            <w:r>
-              <w:rPr>
-                <w:rFonts w:ascii="Calibri" w:eastAsia="Calibri" w:hAnsi="Calibri" w:cs="Calibri"/>
-                <w:color w:val="16191F"/>
-                <w:sz w:val="24"/>
-                <w:szCs w:val="24"/>
-              </w:rPr>
-              <w:t>sortkey</w:t>
-            </w:r>
-            <w:proofErr w:type="spellEnd"/>
+              <w:t>decimal(</w:t>
+            </w:r>
             <w:proofErr w:type="gramEnd"/>
             <w:r>
               <w:rPr>
@@ -902,7 +884,7 @@
                 <w:sz w:val="24"/>
                 <w:szCs w:val="24"/>
               </w:rPr>
-              <w:t>,</w:t>
+              <w:t>8,2),</w:t>
             </w:r>
           </w:p>
           <w:p>
@@ -923,206 +905,7 @@
                 <w:szCs w:val="24"/>
               </w:rPr>
               <w:tab/>
-            </w:r>
-            <w:proofErr w:type="spellStart"/>
-            <w:r>
-              <w:rPr>
-                <w:rFonts w:ascii="Calibri" w:eastAsia="Calibri" w:hAnsi="Calibri" w:cs="Calibri"/>
-                <w:color w:val="16191F"/>
-                <w:sz w:val="24"/>
-                <w:szCs w:val="24"/>
-              </w:rPr>
-              <w:t>numtickets</w:t>
-            </w:r>
-            <w:proofErr w:type="spellEnd"/>
-            <w:r>
-              <w:rPr>
-                <w:rFonts w:ascii="Calibri" w:eastAsia="Calibri" w:hAnsi="Calibri" w:cs="Calibri"/>
-                <w:color w:val="16191F"/>
-                <w:sz w:val="24"/>
-                <w:szCs w:val="24"/>
-              </w:rPr>
-              <w:t xml:space="preserve"> </w:t>
-            </w:r>
-            <w:proofErr w:type="spellStart"/>
-            <w:r>
-              <w:rPr>
-                <w:rFonts w:ascii="Calibri" w:eastAsia="Calibri" w:hAnsi="Calibri" w:cs="Calibri"/>
-                <w:color w:val="16191F"/>
-                <w:sz w:val="24"/>
-                <w:szCs w:val="24"/>
-              </w:rPr>
-              <w:t>smallint</w:t>
-            </w:r>
-            <w:proofErr w:type="spellEnd"/>
-            <w:r>
-              <w:rPr>
-                <w:rFonts w:ascii="Calibri" w:eastAsia="Calibri" w:hAnsi="Calibri" w:cs="Calibri"/>
-                <w:color w:val="16191F"/>
-                <w:sz w:val="24"/>
-                <w:szCs w:val="24"/>
-              </w:rPr>
-              <w:t xml:space="preserve"> not null,</w:t>
-            </w:r>
-          </w:p>
-          <w:p>
-            <w:pPr>
-              <w:jc w:val="both"/>
-              <w:rPr>
-                <w:rFonts w:ascii="Calibri" w:eastAsia="Calibri" w:hAnsi="Calibri" w:cs="Calibri"/>
-                <w:color w:val="16191F"/>
-                <w:sz w:val="24"/>
-                <w:szCs w:val="24"/>
-              </w:rPr>
-            </w:pPr>
-            <w:r>
-              <w:rPr>
-                <w:rFonts w:ascii="Calibri" w:eastAsia="Calibri" w:hAnsi="Calibri" w:cs="Calibri"/>
-                <w:color w:val="16191F"/>
-                <w:sz w:val="24"/>
-                <w:szCs w:val="24"/>
-              </w:rPr>
-              <w:tab/>
-            </w:r>
-            <w:proofErr w:type="spellStart"/>
-            <w:r>
-              <w:rPr>
-                <w:rFonts w:ascii="Calibri" w:eastAsia="Calibri" w:hAnsi="Calibri" w:cs="Calibri"/>
-                <w:color w:val="16191F"/>
-                <w:sz w:val="24"/>
-                <w:szCs w:val="24"/>
-              </w:rPr>
-              <w:t>priceperticket</w:t>
-            </w:r>
-            <w:proofErr w:type="spellEnd"/>
-            <w:r>
-              <w:rPr>
-                <w:rFonts w:ascii="Calibri" w:eastAsia="Calibri" w:hAnsi="Calibri" w:cs="Calibri"/>
-                <w:color w:val="16191F"/>
-                <w:sz w:val="24"/>
-                <w:szCs w:val="24"/>
-              </w:rPr>
-              <w:t xml:space="preserve"> </w:t>
-            </w:r>
-            <w:proofErr w:type="gramStart"/>
-            <w:r>
-              <w:rPr>
-                <w:rFonts w:ascii="Calibri" w:eastAsia="Calibri" w:hAnsi="Calibri" w:cs="Calibri"/>
-                <w:color w:val="16191F"/>
-                <w:sz w:val="24"/>
-                <w:szCs w:val="24"/>
-              </w:rPr>
-              <w:t>decimal(</w:t>
-            </w:r>
-            <w:proofErr w:type="gramEnd"/>
-            <w:r>
-              <w:rPr>
-                <w:rFonts w:ascii="Calibri" w:eastAsia="Calibri" w:hAnsi="Calibri" w:cs="Calibri"/>
-                <w:color w:val="16191F"/>
-                <w:sz w:val="24"/>
-                <w:szCs w:val="24"/>
-              </w:rPr>
-              <w:t>8,2),</w:t>
-            </w:r>
-          </w:p>
-          <w:p>
-            <w:pPr>
-              <w:jc w:val="both"/>
-              <w:rPr>
-                <w:rFonts w:ascii="Calibri" w:eastAsia="Calibri" w:hAnsi="Calibri" w:cs="Calibri"/>
-                <w:color w:val="16191F"/>
-                <w:sz w:val="24"/>
-                <w:szCs w:val="24"/>
-              </w:rPr>
-            </w:pPr>
-            <w:r>
-              <w:rPr>
-                <w:rFonts w:ascii="Calibri" w:eastAsia="Calibri" w:hAnsi="Calibri" w:cs="Calibri"/>
-                <w:color w:val="16191F"/>
-                <w:sz w:val="24"/>
-                <w:szCs w:val="24"/>
-              </w:rPr>
-              <w:tab/>
-            </w:r>
-            <w:proofErr w:type="spellStart"/>
-            <w:r>
-              <w:rPr>
-                <w:rFonts w:ascii="Calibri" w:eastAsia="Calibri" w:hAnsi="Calibri" w:cs="Calibri"/>
-                <w:color w:val="16191F"/>
-                <w:sz w:val="24"/>
-                <w:szCs w:val="24"/>
-              </w:rPr>
-              <w:t>totalprice</w:t>
-            </w:r>
-            <w:proofErr w:type="spellEnd"/>
-            <w:r>
-              <w:rPr>
-                <w:rFonts w:ascii="Calibri" w:eastAsia="Calibri" w:hAnsi="Calibri" w:cs="Calibri"/>
-                <w:color w:val="16191F"/>
-                <w:sz w:val="24"/>
-                <w:szCs w:val="24"/>
-              </w:rPr>
-              <w:t xml:space="preserve"> </w:t>
-            </w:r>
-            <w:proofErr w:type="gramStart"/>
-            <w:r>
-              <w:rPr>
-                <w:rFonts w:ascii="Calibri" w:eastAsia="Calibri" w:hAnsi="Calibri" w:cs="Calibri"/>
-                <w:color w:val="16191F"/>
-                <w:sz w:val="24"/>
-                <w:szCs w:val="24"/>
-              </w:rPr>
-              <w:t>decimal(</w:t>
-            </w:r>
-            <w:proofErr w:type="gramEnd"/>
-            <w:r>
-              <w:rPr>
-                <w:rFonts w:ascii="Calibri" w:eastAsia="Calibri" w:hAnsi="Calibri" w:cs="Calibri"/>
-                <w:color w:val="16191F"/>
-                <w:sz w:val="24"/>
-                <w:szCs w:val="24"/>
-              </w:rPr>
-              <w:t>8,2),</w:t>
-            </w:r>
-          </w:p>
-          <w:p>
-            <w:pPr>
-              <w:jc w:val="both"/>
-              <w:rPr>
-                <w:rFonts w:ascii="Calibri" w:eastAsia="Calibri" w:hAnsi="Calibri" w:cs="Calibri"/>
-                <w:color w:val="16191F"/>
-                <w:sz w:val="24"/>
-                <w:szCs w:val="24"/>
-              </w:rPr>
-            </w:pPr>
-            <w:r>
-              <w:rPr>
-                <w:rFonts w:ascii="Calibri" w:eastAsia="Calibri" w:hAnsi="Calibri" w:cs="Calibri"/>
-                <w:color w:val="16191F"/>
-                <w:sz w:val="24"/>
-                <w:szCs w:val="24"/>
-              </w:rPr>
-              <w:tab/>
-            </w:r>
-            <w:proofErr w:type="spellStart"/>
-            <w:r>
-              <w:rPr>
-                <w:rFonts w:ascii="Calibri" w:eastAsia="Calibri" w:hAnsi="Calibri" w:cs="Calibri"/>
-                <w:color w:val="16191F"/>
-                <w:sz w:val="24"/>
-                <w:szCs w:val="24"/>
-              </w:rPr>
-              <w:t>listtime</w:t>
-            </w:r>
-            <w:proofErr w:type="spellEnd"/>
-            <w:r>
-              <w:rPr>
-                <w:rFonts w:ascii="Calibri" w:eastAsia="Calibri" w:hAnsi="Calibri" w:cs="Calibri"/>
-                <w:color w:val="16191F"/>
-                <w:sz w:val="24"/>
-                <w:szCs w:val="24"/>
-              </w:rPr>
-              <w:t xml:space="preserve"> timestamp);</w:t>
+              <w:t>listtime timestamp);</w:t>
             </w:r>
           </w:p>
           <w:p>
@@ -1260,7 +1043,6 @@
               </w:rPr>
               <w:t xml:space="preserve">copy </w:t>
             </w:r>
-            <w:proofErr w:type="spellStart"/>
             <w:proofErr w:type="gramStart"/>
             <w:r>
               <w:rPr>
@@ -1271,7 +1053,6 @@
               </w:rPr>
               <w:t>test.listing</w:t>
             </w:r>
-            <w:proofErr w:type="spellEnd"/>
             <w:proofErr w:type="gramEnd"/>
             <w:r>
               <w:rPr>
@@ -1300,60 +1081,28 @@
                 <w:sz w:val="24"/>
                 <w:szCs w:val="24"/>
               </w:rPr>
-              <w:t>from 's3://</w:t>
-            </w:r>
-            <w:proofErr w:type="spellStart"/>
-            <w:r>
-              <w:rPr>
-                <w:rFonts w:ascii="Calibri" w:eastAsia="Calibri" w:hAnsi="Calibri" w:cs="Calibri"/>
-                <w:color w:val="16191F"/>
-                <w:sz w:val="24"/>
-                <w:szCs w:val="24"/>
-              </w:rPr>
-              <w:t>mybucket</w:t>
-            </w:r>
-            <w:proofErr w:type="spellEnd"/>
-            <w:r>
-              <w:rPr>
-                <w:rFonts w:ascii="Calibri" w:eastAsia="Calibri" w:hAnsi="Calibri" w:cs="Calibri"/>
-                <w:color w:val="16191F"/>
-                <w:sz w:val="24"/>
-                <w:szCs w:val="24"/>
-              </w:rPr>
-              <w:t xml:space="preserve">/data/listings_pipe.txt' </w:t>
-            </w:r>
-          </w:p>
-          <w:p>
-            <w:pPr>
-              <w:jc w:val="both"/>
-              <w:rPr>
-                <w:rFonts w:ascii="Calibri" w:eastAsia="Calibri" w:hAnsi="Calibri" w:cs="Calibri"/>
-                <w:color w:val="16191F"/>
-                <w:sz w:val="24"/>
-                <w:szCs w:val="24"/>
-              </w:rPr>
-            </w:pPr>
-            <w:proofErr w:type="spellStart"/>
-            <w:r>
-              <w:rPr>
-                <w:rFonts w:ascii="Calibri" w:eastAsia="Calibri" w:hAnsi="Calibri" w:cs="Calibri"/>
-                <w:color w:val="16191F"/>
-                <w:sz w:val="24"/>
-                <w:szCs w:val="24"/>
-              </w:rPr>
-              <w:t>iam_role</w:t>
-            </w:r>
-            <w:proofErr w:type="spellEnd"/>
-            <w:r>
-              <w:rPr>
-                <w:rFonts w:ascii="Calibri" w:eastAsia="Calibri" w:hAnsi="Calibri" w:cs="Calibri"/>
-                <w:color w:val="16191F"/>
-                <w:sz w:val="24"/>
-                <w:szCs w:val="24"/>
-              </w:rPr>
-              <w:t xml:space="preserve"> '</w:t>
-            </w:r>
-            <w:proofErr w:type="spellStart"/>
+              <w:t xml:space="preserve">from 's3://mybucket/data/listings_pipe.txt' </w:t>
+            </w:r>
+          </w:p>
+          <w:p>
+            <w:pPr>
+              <w:jc w:val="both"/>
+              <w:rPr>
+                <w:rFonts w:ascii="Calibri" w:eastAsia="Calibri" w:hAnsi="Calibri" w:cs="Calibri"/>
+                <w:color w:val="16191F"/>
+                <w:sz w:val="24"/>
+                <w:szCs w:val="24"/>
+              </w:rPr>
+            </w:pPr>
+            <w:r>
+              <w:rPr>
+                <w:rFonts w:ascii="Calibri" w:eastAsia="Calibri" w:hAnsi="Calibri" w:cs="Calibri"/>
+                <w:color w:val="16191F"/>
+                <w:sz w:val="24"/>
+                <w:szCs w:val="24"/>
+              </w:rPr>
+              <w:t>iam_role '</w:t>
+            </w:r>
             <w:proofErr w:type="gramStart"/>
             <w:r>
               <w:rPr>
@@ -1382,17 +1131,7 @@
                 <w:sz w:val="24"/>
                 <w:szCs w:val="24"/>
               </w:rPr>
-              <w:t>iam</w:t>
-            </w:r>
-            <w:proofErr w:type="spellEnd"/>
-            <w:r>
-              <w:rPr>
-                <w:rFonts w:ascii="Calibri" w:eastAsia="Calibri" w:hAnsi="Calibri" w:cs="Calibri"/>
-                <w:color w:val="16191F"/>
-                <w:sz w:val="24"/>
-                <w:szCs w:val="24"/>
-              </w:rPr>
-              <w:t>::0123456789012:role</w:t>
+              <w:t>iam::0123456789012:role</w:t>
             </w:r>
             <w:proofErr w:type="gramEnd"/>
             <w:r>
@@ -1402,27 +1141,7 @@
                 <w:sz w:val="24"/>
                 <w:szCs w:val="24"/>
               </w:rPr>
-              <w:t>/</w:t>
-            </w:r>
-            <w:proofErr w:type="spellStart"/>
-            <w:r>
-              <w:rPr>
-                <w:rFonts w:ascii="Calibri" w:eastAsia="Calibri" w:hAnsi="Calibri" w:cs="Calibri"/>
-                <w:color w:val="16191F"/>
-                <w:sz w:val="24"/>
-                <w:szCs w:val="24"/>
-              </w:rPr>
-              <w:t>MyRedshiftRole</w:t>
-            </w:r>
-            <w:proofErr w:type="spellEnd"/>
-            <w:r>
-              <w:rPr>
-                <w:rFonts w:ascii="Calibri" w:eastAsia="Calibri" w:hAnsi="Calibri" w:cs="Calibri"/>
-                <w:color w:val="16191F"/>
-                <w:sz w:val="24"/>
-                <w:szCs w:val="24"/>
-              </w:rPr>
-              <w:t>';</w:t>
+              <w:t>/MyRedshiftRole';</w:t>
             </w:r>
           </w:p>
         </w:tc>
@@ -1551,7 +1270,6 @@
               </w:rPr>
               <w:t xml:space="preserve">unload ('select * from </w:t>
             </w:r>
-            <w:proofErr w:type="spellStart"/>
             <w:proofErr w:type="gramStart"/>
             <w:r>
               <w:rPr>
@@ -1562,7 +1280,6 @@
               </w:rPr>
               <w:t>test.listing</w:t>
             </w:r>
-            <w:proofErr w:type="spellEnd"/>
             <w:proofErr w:type="gramEnd"/>
             <w:r>
               <w:rPr>
@@ -1591,60 +1308,28 @@
                 <w:sz w:val="24"/>
                 <w:szCs w:val="24"/>
               </w:rPr>
-              <w:t>to 's3://bootcamp-</w:t>
-            </w:r>
-            <w:proofErr w:type="spellStart"/>
-            <w:r>
-              <w:rPr>
-                <w:rFonts w:ascii="Calibri" w:eastAsia="Calibri" w:hAnsi="Calibri" w:cs="Calibri"/>
-                <w:color w:val="16191F"/>
-                <w:sz w:val="24"/>
-                <w:szCs w:val="24"/>
-              </w:rPr>
-              <w:t>buct</w:t>
-            </w:r>
-            <w:proofErr w:type="spellEnd"/>
-            <w:r>
-              <w:rPr>
-                <w:rFonts w:ascii="Calibri" w:eastAsia="Calibri" w:hAnsi="Calibri" w:cs="Calibri"/>
-                <w:color w:val="16191F"/>
-                <w:sz w:val="24"/>
-                <w:szCs w:val="24"/>
-              </w:rPr>
-              <w:t>/data/listing/parquet/file'</w:t>
-            </w:r>
-          </w:p>
-          <w:p>
-            <w:pPr>
-              <w:jc w:val="both"/>
-              <w:rPr>
-                <w:rFonts w:ascii="Calibri" w:eastAsia="Calibri" w:hAnsi="Calibri" w:cs="Calibri"/>
-                <w:color w:val="16191F"/>
-                <w:sz w:val="24"/>
-                <w:szCs w:val="24"/>
-              </w:rPr>
-            </w:pPr>
-            <w:proofErr w:type="spellStart"/>
-            <w:r>
-              <w:rPr>
-                <w:rFonts w:ascii="Calibri" w:eastAsia="Calibri" w:hAnsi="Calibri" w:cs="Calibri"/>
-                <w:color w:val="16191F"/>
-                <w:sz w:val="24"/>
-                <w:szCs w:val="24"/>
-              </w:rPr>
-              <w:t>iam_role</w:t>
-            </w:r>
-            <w:proofErr w:type="spellEnd"/>
-            <w:r>
-              <w:rPr>
-                <w:rFonts w:ascii="Calibri" w:eastAsia="Calibri" w:hAnsi="Calibri" w:cs="Calibri"/>
-                <w:color w:val="16191F"/>
-                <w:sz w:val="24"/>
-                <w:szCs w:val="24"/>
-              </w:rPr>
-              <w:t xml:space="preserve"> '</w:t>
-            </w:r>
-            <w:proofErr w:type="spellStart"/>
+              <w:t>to 's3://bootcamp-buct/data/listing/parquet/file'</w:t>
+            </w:r>
+          </w:p>
+          <w:p>
+            <w:pPr>
+              <w:jc w:val="both"/>
+              <w:rPr>
+                <w:rFonts w:ascii="Calibri" w:eastAsia="Calibri" w:hAnsi="Calibri" w:cs="Calibri"/>
+                <w:color w:val="16191F"/>
+                <w:sz w:val="24"/>
+                <w:szCs w:val="24"/>
+              </w:rPr>
+            </w:pPr>
+            <w:r>
+              <w:rPr>
+                <w:rFonts w:ascii="Calibri" w:eastAsia="Calibri" w:hAnsi="Calibri" w:cs="Calibri"/>
+                <w:color w:val="16191F"/>
+                <w:sz w:val="24"/>
+                <w:szCs w:val="24"/>
+              </w:rPr>
+              <w:t>iam_role '</w:t>
+            </w:r>
             <w:proofErr w:type="gramStart"/>
             <w:r>
               <w:rPr>
@@ -1673,17 +1358,7 @@
                 <w:sz w:val="24"/>
                 <w:szCs w:val="24"/>
               </w:rPr>
-              <w:t>iam</w:t>
-            </w:r>
-            <w:proofErr w:type="spellEnd"/>
-            <w:r>
-              <w:rPr>
-                <w:rFonts w:ascii="Calibri" w:eastAsia="Calibri" w:hAnsi="Calibri" w:cs="Calibri"/>
-                <w:color w:val="16191F"/>
-                <w:sz w:val="24"/>
-                <w:szCs w:val="24"/>
-              </w:rPr>
-              <w:t>::111081800296:role</w:t>
+              <w:t>iam::111081800296:role</w:t>
             </w:r>
             <w:proofErr w:type="gramEnd"/>
             <w:r>
@@ -1693,27 +1368,7 @@
                 <w:sz w:val="24"/>
                 <w:szCs w:val="24"/>
               </w:rPr>
-              <w:t>/</w:t>
-            </w:r>
-            <w:proofErr w:type="spellStart"/>
-            <w:r>
-              <w:rPr>
-                <w:rFonts w:ascii="Calibri" w:eastAsia="Calibri" w:hAnsi="Calibri" w:cs="Calibri"/>
-                <w:color w:val="16191F"/>
-                <w:sz w:val="24"/>
-                <w:szCs w:val="24"/>
-              </w:rPr>
-              <w:t>Redshift_admin</w:t>
-            </w:r>
-            <w:proofErr w:type="spellEnd"/>
-            <w:r>
-              <w:rPr>
-                <w:rFonts w:ascii="Calibri" w:eastAsia="Calibri" w:hAnsi="Calibri" w:cs="Calibri"/>
-                <w:color w:val="16191F"/>
-                <w:sz w:val="24"/>
-                <w:szCs w:val="24"/>
-              </w:rPr>
-              <w:t>'</w:t>
+              <w:t>/Redshift_admin'</w:t>
             </w:r>
           </w:p>
           <w:p>
@@ -1860,7 +1515,6 @@
               </w:rPr>
               <w:t xml:space="preserve">unload ('select * from </w:t>
             </w:r>
-            <w:proofErr w:type="spellStart"/>
             <w:proofErr w:type="gramStart"/>
             <w:r>
               <w:rPr>
@@ -1871,7 +1525,6 @@
               </w:rPr>
               <w:t>test.listing</w:t>
             </w:r>
-            <w:proofErr w:type="spellEnd"/>
             <w:proofErr w:type="gramEnd"/>
             <w:r>
               <w:rPr>
@@ -1913,27 +1566,15 @@
                 <w:szCs w:val="24"/>
               </w:rPr>
             </w:pPr>
-            <w:proofErr w:type="spellStart"/>
-            <w:r>
-              <w:rPr>
-                <w:rFonts w:ascii="Calibri" w:eastAsia="Calibri" w:hAnsi="Calibri" w:cs="Calibri"/>
-                <w:color w:val="16191F"/>
-                <w:sz w:val="24"/>
-                <w:szCs w:val="24"/>
-              </w:rPr>
-              <w:t>iam_role</w:t>
-            </w:r>
-            <w:proofErr w:type="spellEnd"/>
-            <w:r>
-              <w:rPr>
-                <w:rFonts w:ascii="Calibri" w:eastAsia="Calibri" w:hAnsi="Calibri" w:cs="Calibri"/>
-                <w:color w:val="16191F"/>
-                <w:sz w:val="24"/>
-                <w:szCs w:val="24"/>
-              </w:rPr>
-              <w:t xml:space="preserve"> '</w:t>
-            </w:r>
-            <w:proofErr w:type="spellStart"/>
+            <w:r>
+              <w:rPr>
+                <w:rFonts w:ascii="Calibri" w:eastAsia="Calibri" w:hAnsi="Calibri" w:cs="Calibri"/>
+                <w:color w:val="16191F"/>
+                <w:sz w:val="24"/>
+                <w:szCs w:val="24"/>
+              </w:rPr>
+              <w:t>iam_role '</w:t>
+            </w:r>
             <w:proofErr w:type="gramStart"/>
             <w:r>
               <w:rPr>
@@ -1962,17 +1603,7 @@
                 <w:sz w:val="24"/>
                 <w:szCs w:val="24"/>
               </w:rPr>
-              <w:t>iam</w:t>
-            </w:r>
-            <w:proofErr w:type="spellEnd"/>
-            <w:r>
-              <w:rPr>
-                <w:rFonts w:ascii="Calibri" w:eastAsia="Calibri" w:hAnsi="Calibri" w:cs="Calibri"/>
-                <w:color w:val="16191F"/>
-                <w:sz w:val="24"/>
-                <w:szCs w:val="24"/>
-              </w:rPr>
-              <w:t>::111081800296:role</w:t>
+              <w:t>iam::111081800296:role</w:t>
             </w:r>
             <w:proofErr w:type="gramEnd"/>
             <w:r>
@@ -1982,27 +1613,7 @@
                 <w:sz w:val="24"/>
                 <w:szCs w:val="24"/>
               </w:rPr>
-              <w:t>/</w:t>
-            </w:r>
-            <w:proofErr w:type="spellStart"/>
-            <w:r>
-              <w:rPr>
-                <w:rFonts w:ascii="Calibri" w:eastAsia="Calibri" w:hAnsi="Calibri" w:cs="Calibri"/>
-                <w:color w:val="16191F"/>
-                <w:sz w:val="24"/>
-                <w:szCs w:val="24"/>
-              </w:rPr>
-              <w:t>Redshift_admin</w:t>
-            </w:r>
-            <w:proofErr w:type="spellEnd"/>
-            <w:r>
-              <w:rPr>
-                <w:rFonts w:ascii="Calibri" w:eastAsia="Calibri" w:hAnsi="Calibri" w:cs="Calibri"/>
-                <w:color w:val="16191F"/>
-                <w:sz w:val="24"/>
-                <w:szCs w:val="24"/>
-              </w:rPr>
-              <w:t>'</w:t>
+              <w:t>/Redshift_admin'</w:t>
             </w:r>
           </w:p>
           <w:p>
@@ -2082,6 +1693,2780 @@
           <w:color w:val="16191F"/>
           <w:sz w:val="24"/>
           <w:szCs w:val="24"/>
+        </w:rPr>
+      </w:pPr>
+    </w:p>
+    <w:p>
+      <w:pPr>
+        <w:jc w:val="both"/>
+        <w:rPr>
+          <w:rFonts w:ascii="Calibri" w:eastAsia="Calibri" w:hAnsi="Calibri" w:cs="Calibri"/>
+          <w:color w:val="16191F"/>
+          <w:sz w:val="24"/>
+          <w:szCs w:val="24"/>
+        </w:rPr>
+      </w:pPr>
+      <w:r>
+        <w:rPr>
+          <w:rFonts w:ascii="Calibri" w:eastAsia="Calibri" w:hAnsi="Calibri" w:cs="Calibri"/>
+          <w:color w:val="16191F"/>
+          <w:sz w:val="24"/>
+          <w:szCs w:val="24"/>
+        </w:rPr>
+        <w:t>Copy from parquet to S3</w:t>
+      </w:r>
+    </w:p>
+    <w:p>
+      <w:pPr>
+        <w:jc w:val="both"/>
+        <w:rPr>
+          <w:rFonts w:ascii="Calibri" w:eastAsia="Calibri" w:hAnsi="Calibri" w:cs="Calibri"/>
+          <w:color w:val="16191F"/>
+          <w:sz w:val="24"/>
+          <w:szCs w:val="24"/>
+        </w:rPr>
+      </w:pPr>
+    </w:p>
+    <w:p>
+      <w:pPr>
+        <w:jc w:val="both"/>
+        <w:rPr>
+          <w:rFonts w:ascii="Calibri" w:eastAsia="Calibri" w:hAnsi="Calibri" w:cs="Calibri"/>
+          <w:color w:val="16191F"/>
+          <w:sz w:val="24"/>
+          <w:szCs w:val="24"/>
+        </w:rPr>
+      </w:pPr>
+    </w:p>
+    <w:tbl>
+      <w:tblPr>
+        <w:tblW w:w="9029" w:type="dxa"/>
+        <w:tblBorders>
+          <w:top w:val="single" w:sz="8" w:space="0" w:color="000000"/>
+          <w:left w:val="single" w:sz="8" w:space="0" w:color="000000"/>
+          <w:bottom w:val="single" w:sz="8" w:space="0" w:color="000000"/>
+          <w:right w:val="single" w:sz="8" w:space="0" w:color="000000"/>
+          <w:insideH w:val="single" w:sz="8" w:space="0" w:color="000000"/>
+          <w:insideV w:val="single" w:sz="8" w:space="0" w:color="000000"/>
+        </w:tblBorders>
+        <w:tblLayout w:type="fixed"/>
+        <w:tblLook w:val="0600" w:firstRow="0" w:lastRow="0" w:firstColumn="0" w:lastColumn="0" w:noHBand="1" w:noVBand="1"/>
+      </w:tblPr>
+      <w:tblGrid>
+        <w:gridCol w:w="9029"/>
+      </w:tblGrid>
+      <w:tr>
+        <w:tc>
+          <w:tcPr>
+            <w:tcW w:w="9029" w:type="dxa"/>
+            <w:tcMar>
+              <w:top w:w="100" w:type="dxa"/>
+              <w:left w:w="100" w:type="dxa"/>
+              <w:bottom w:w="100" w:type="dxa"/>
+              <w:right w:w="100" w:type="dxa"/>
+            </w:tcMar>
+          </w:tcPr>
+          <w:p>
+            <w:pPr>
+              <w:jc w:val="both"/>
+              <w:rPr>
+                <w:rFonts w:ascii="Calibri" w:eastAsia="Calibri" w:hAnsi="Calibri" w:cs="Calibri"/>
+                <w:color w:val="16191F"/>
+                <w:sz w:val="24"/>
+                <w:szCs w:val="24"/>
+              </w:rPr>
+            </w:pPr>
+            <w:r>
+              <w:rPr>
+                <w:rFonts w:ascii="Calibri" w:eastAsia="Calibri" w:hAnsi="Calibri" w:cs="Calibri"/>
+                <w:color w:val="16191F"/>
+                <w:sz w:val="24"/>
+                <w:szCs w:val="24"/>
+              </w:rPr>
+              <w:t xml:space="preserve">create table </w:t>
+            </w:r>
+            <w:proofErr w:type="gramStart"/>
+            <w:r>
+              <w:rPr>
+                <w:rFonts w:ascii="Calibri" w:eastAsia="Calibri" w:hAnsi="Calibri" w:cs="Calibri"/>
+                <w:color w:val="16191F"/>
+                <w:sz w:val="24"/>
+                <w:szCs w:val="24"/>
+              </w:rPr>
+              <w:t>test.listing</w:t>
+            </w:r>
+            <w:proofErr w:type="gramEnd"/>
+            <w:r>
+              <w:rPr>
+                <w:rFonts w:ascii="Calibri" w:eastAsia="Calibri" w:hAnsi="Calibri" w:cs="Calibri"/>
+                <w:color w:val="16191F"/>
+                <w:sz w:val="24"/>
+                <w:szCs w:val="24"/>
+              </w:rPr>
+              <w:t>_</w:t>
+            </w:r>
+            <w:proofErr w:type="gramStart"/>
+            <w:r>
+              <w:rPr>
+                <w:rFonts w:ascii="Calibri" w:eastAsia="Calibri" w:hAnsi="Calibri" w:cs="Calibri"/>
+                <w:color w:val="16191F"/>
+                <w:sz w:val="24"/>
+                <w:szCs w:val="24"/>
+              </w:rPr>
+              <w:t>parquet(</w:t>
+            </w:r>
+            <w:proofErr w:type="gramEnd"/>
+          </w:p>
+          <w:p>
+            <w:pPr>
+              <w:jc w:val="both"/>
+              <w:rPr>
+                <w:rFonts w:ascii="Calibri" w:eastAsia="Calibri" w:hAnsi="Calibri" w:cs="Calibri"/>
+                <w:color w:val="16191F"/>
+                <w:sz w:val="24"/>
+                <w:szCs w:val="24"/>
+              </w:rPr>
+            </w:pPr>
+            <w:r>
+              <w:rPr>
+                <w:rFonts w:ascii="Calibri" w:eastAsia="Calibri" w:hAnsi="Calibri" w:cs="Calibri"/>
+                <w:color w:val="16191F"/>
+                <w:sz w:val="24"/>
+                <w:szCs w:val="24"/>
+              </w:rPr>
+              <w:tab/>
+              <w:t>listid integer not null distkey,</w:t>
+            </w:r>
+          </w:p>
+          <w:p>
+            <w:pPr>
+              <w:jc w:val="both"/>
+              <w:rPr>
+                <w:rFonts w:ascii="Calibri" w:eastAsia="Calibri" w:hAnsi="Calibri" w:cs="Calibri"/>
+                <w:color w:val="16191F"/>
+                <w:sz w:val="24"/>
+                <w:szCs w:val="24"/>
+              </w:rPr>
+            </w:pPr>
+            <w:r>
+              <w:rPr>
+                <w:rFonts w:ascii="Calibri" w:eastAsia="Calibri" w:hAnsi="Calibri" w:cs="Calibri"/>
+                <w:color w:val="16191F"/>
+                <w:sz w:val="24"/>
+                <w:szCs w:val="24"/>
+              </w:rPr>
+              <w:tab/>
+              <w:t>sellerid integer not null,</w:t>
+            </w:r>
+          </w:p>
+          <w:p>
+            <w:pPr>
+              <w:jc w:val="both"/>
+              <w:rPr>
+                <w:rFonts w:ascii="Calibri" w:eastAsia="Calibri" w:hAnsi="Calibri" w:cs="Calibri"/>
+                <w:color w:val="16191F"/>
+                <w:sz w:val="24"/>
+                <w:szCs w:val="24"/>
+              </w:rPr>
+            </w:pPr>
+            <w:r>
+              <w:rPr>
+                <w:rFonts w:ascii="Calibri" w:eastAsia="Calibri" w:hAnsi="Calibri" w:cs="Calibri"/>
+                <w:color w:val="16191F"/>
+                <w:sz w:val="24"/>
+                <w:szCs w:val="24"/>
+              </w:rPr>
+              <w:tab/>
+              <w:t>eventid integer not null,</w:t>
+            </w:r>
+          </w:p>
+          <w:p>
+            <w:pPr>
+              <w:jc w:val="both"/>
+              <w:rPr>
+                <w:rFonts w:ascii="Calibri" w:eastAsia="Calibri" w:hAnsi="Calibri" w:cs="Calibri"/>
+                <w:color w:val="16191F"/>
+                <w:sz w:val="24"/>
+                <w:szCs w:val="24"/>
+              </w:rPr>
+            </w:pPr>
+            <w:r>
+              <w:rPr>
+                <w:rFonts w:ascii="Calibri" w:eastAsia="Calibri" w:hAnsi="Calibri" w:cs="Calibri"/>
+                <w:color w:val="16191F"/>
+                <w:sz w:val="24"/>
+                <w:szCs w:val="24"/>
+              </w:rPr>
+              <w:tab/>
+              <w:t xml:space="preserve">dateid smallint not </w:t>
+            </w:r>
+            <w:proofErr w:type="gramStart"/>
+            <w:r>
+              <w:rPr>
+                <w:rFonts w:ascii="Calibri" w:eastAsia="Calibri" w:hAnsi="Calibri" w:cs="Calibri"/>
+                <w:color w:val="16191F"/>
+                <w:sz w:val="24"/>
+                <w:szCs w:val="24"/>
+              </w:rPr>
+              <w:t>null  sortkey</w:t>
+            </w:r>
+            <w:proofErr w:type="gramEnd"/>
+            <w:r>
+              <w:rPr>
+                <w:rFonts w:ascii="Calibri" w:eastAsia="Calibri" w:hAnsi="Calibri" w:cs="Calibri"/>
+                <w:color w:val="16191F"/>
+                <w:sz w:val="24"/>
+                <w:szCs w:val="24"/>
+              </w:rPr>
+              <w:t>,</w:t>
+            </w:r>
+          </w:p>
+          <w:p>
+            <w:pPr>
+              <w:jc w:val="both"/>
+              <w:rPr>
+                <w:rFonts w:ascii="Calibri" w:eastAsia="Calibri" w:hAnsi="Calibri" w:cs="Calibri"/>
+                <w:color w:val="16191F"/>
+                <w:sz w:val="24"/>
+                <w:szCs w:val="24"/>
+              </w:rPr>
+            </w:pPr>
+            <w:r>
+              <w:rPr>
+                <w:rFonts w:ascii="Calibri" w:eastAsia="Calibri" w:hAnsi="Calibri" w:cs="Calibri"/>
+                <w:color w:val="16191F"/>
+                <w:sz w:val="24"/>
+                <w:szCs w:val="24"/>
+              </w:rPr>
+              <w:lastRenderedPageBreak/>
+              <w:tab/>
+              <w:t>numtickets smallint not null,</w:t>
+            </w:r>
+          </w:p>
+          <w:p>
+            <w:pPr>
+              <w:jc w:val="both"/>
+              <w:rPr>
+                <w:rFonts w:ascii="Calibri" w:eastAsia="Calibri" w:hAnsi="Calibri" w:cs="Calibri"/>
+                <w:color w:val="16191F"/>
+                <w:sz w:val="24"/>
+                <w:szCs w:val="24"/>
+              </w:rPr>
+            </w:pPr>
+            <w:r>
+              <w:rPr>
+                <w:rFonts w:ascii="Calibri" w:eastAsia="Calibri" w:hAnsi="Calibri" w:cs="Calibri"/>
+                <w:color w:val="16191F"/>
+                <w:sz w:val="24"/>
+                <w:szCs w:val="24"/>
+              </w:rPr>
+              <w:tab/>
+              <w:t xml:space="preserve">priceperticket </w:t>
+            </w:r>
+            <w:proofErr w:type="gramStart"/>
+            <w:r>
+              <w:rPr>
+                <w:rFonts w:ascii="Calibri" w:eastAsia="Calibri" w:hAnsi="Calibri" w:cs="Calibri"/>
+                <w:color w:val="16191F"/>
+                <w:sz w:val="24"/>
+                <w:szCs w:val="24"/>
+              </w:rPr>
+              <w:t>decimal(</w:t>
+            </w:r>
+            <w:proofErr w:type="gramEnd"/>
+            <w:r>
+              <w:rPr>
+                <w:rFonts w:ascii="Calibri" w:eastAsia="Calibri" w:hAnsi="Calibri" w:cs="Calibri"/>
+                <w:color w:val="16191F"/>
+                <w:sz w:val="24"/>
+                <w:szCs w:val="24"/>
+              </w:rPr>
+              <w:t>8,2),</w:t>
+            </w:r>
+          </w:p>
+          <w:p>
+            <w:pPr>
+              <w:jc w:val="both"/>
+              <w:rPr>
+                <w:rFonts w:ascii="Calibri" w:eastAsia="Calibri" w:hAnsi="Calibri" w:cs="Calibri"/>
+                <w:color w:val="16191F"/>
+                <w:sz w:val="24"/>
+                <w:szCs w:val="24"/>
+              </w:rPr>
+            </w:pPr>
+            <w:r>
+              <w:rPr>
+                <w:rFonts w:ascii="Calibri" w:eastAsia="Calibri" w:hAnsi="Calibri" w:cs="Calibri"/>
+                <w:color w:val="16191F"/>
+                <w:sz w:val="24"/>
+                <w:szCs w:val="24"/>
+              </w:rPr>
+              <w:tab/>
+              <w:t xml:space="preserve">totalprice </w:t>
+            </w:r>
+            <w:proofErr w:type="gramStart"/>
+            <w:r>
+              <w:rPr>
+                <w:rFonts w:ascii="Calibri" w:eastAsia="Calibri" w:hAnsi="Calibri" w:cs="Calibri"/>
+                <w:color w:val="16191F"/>
+                <w:sz w:val="24"/>
+                <w:szCs w:val="24"/>
+              </w:rPr>
+              <w:t>decimal(</w:t>
+            </w:r>
+            <w:proofErr w:type="gramEnd"/>
+            <w:r>
+              <w:rPr>
+                <w:rFonts w:ascii="Calibri" w:eastAsia="Calibri" w:hAnsi="Calibri" w:cs="Calibri"/>
+                <w:color w:val="16191F"/>
+                <w:sz w:val="24"/>
+                <w:szCs w:val="24"/>
+              </w:rPr>
+              <w:t>8,2),</w:t>
+            </w:r>
+          </w:p>
+          <w:p>
+            <w:pPr>
+              <w:jc w:val="both"/>
+              <w:rPr>
+                <w:rFonts w:ascii="Calibri" w:eastAsia="Calibri" w:hAnsi="Calibri" w:cs="Calibri"/>
+                <w:color w:val="16191F"/>
+                <w:sz w:val="24"/>
+                <w:szCs w:val="24"/>
+              </w:rPr>
+            </w:pPr>
+            <w:r>
+              <w:rPr>
+                <w:rFonts w:ascii="Calibri" w:eastAsia="Calibri" w:hAnsi="Calibri" w:cs="Calibri"/>
+                <w:color w:val="16191F"/>
+                <w:sz w:val="24"/>
+                <w:szCs w:val="24"/>
+              </w:rPr>
+              <w:tab/>
+              <w:t>listtime timestamp);</w:t>
+            </w:r>
+          </w:p>
+          <w:p>
+            <w:pPr>
+              <w:widowControl w:val="0"/>
+              <w:pBdr>
+                <w:top w:val="nil"/>
+                <w:left w:val="nil"/>
+                <w:bottom w:val="nil"/>
+                <w:right w:val="nil"/>
+                <w:between w:val="nil"/>
+              </w:pBdr>
+              <w:spacing w:line="240" w:lineRule="auto"/>
+              <w:jc w:val="both"/>
+              <w:rPr>
+                <w:rFonts w:ascii="Calibri" w:eastAsia="Calibri" w:hAnsi="Calibri" w:cs="Calibri"/>
+                <w:color w:val="16191F"/>
+                <w:sz w:val="24"/>
+                <w:szCs w:val="24"/>
+              </w:rPr>
+            </w:pPr>
+          </w:p>
+        </w:tc>
+      </w:tr>
+    </w:tbl>
+    <w:p>
+      <w:pPr>
+        <w:jc w:val="both"/>
+        <w:rPr>
+          <w:rFonts w:ascii="Calibri" w:eastAsia="Calibri" w:hAnsi="Calibri" w:cs="Calibri"/>
+          <w:color w:val="16191F"/>
+          <w:sz w:val="24"/>
+          <w:szCs w:val="24"/>
+        </w:rPr>
+      </w:pPr>
+    </w:p>
+    <w:p>
+      <w:pPr>
+        <w:jc w:val="both"/>
+        <w:rPr>
+          <w:rFonts w:ascii="Calibri" w:eastAsia="Calibri" w:hAnsi="Calibri" w:cs="Calibri"/>
+          <w:color w:val="16191F"/>
+          <w:sz w:val="24"/>
+          <w:szCs w:val="24"/>
+        </w:rPr>
+      </w:pPr>
+    </w:p>
+    <w:p>
+      <w:pPr>
+        <w:jc w:val="both"/>
+        <w:rPr>
+          <w:rFonts w:ascii="Calibri" w:eastAsia="Calibri" w:hAnsi="Calibri" w:cs="Calibri"/>
+          <w:color w:val="16191F"/>
+          <w:sz w:val="24"/>
+          <w:szCs w:val="24"/>
+        </w:rPr>
+      </w:pPr>
+    </w:p>
+    <w:tbl>
+      <w:tblPr>
+        <w:tblW w:w="9029" w:type="dxa"/>
+        <w:tblBorders>
+          <w:top w:val="single" w:sz="8" w:space="0" w:color="000000"/>
+          <w:left w:val="single" w:sz="8" w:space="0" w:color="000000"/>
+          <w:bottom w:val="single" w:sz="8" w:space="0" w:color="000000"/>
+          <w:right w:val="single" w:sz="8" w:space="0" w:color="000000"/>
+          <w:insideH w:val="single" w:sz="8" w:space="0" w:color="000000"/>
+          <w:insideV w:val="single" w:sz="8" w:space="0" w:color="000000"/>
+        </w:tblBorders>
+        <w:tblLayout w:type="fixed"/>
+        <w:tblLook w:val="0600" w:firstRow="0" w:lastRow="0" w:firstColumn="0" w:lastColumn="0" w:noHBand="1" w:noVBand="1"/>
+      </w:tblPr>
+      <w:tblGrid>
+        <w:gridCol w:w="9029"/>
+      </w:tblGrid>
+      <w:tr>
+        <w:tc>
+          <w:tcPr>
+            <w:tcW w:w="9029" w:type="dxa"/>
+            <w:tcMar>
+              <w:top w:w="100" w:type="dxa"/>
+              <w:left w:w="100" w:type="dxa"/>
+              <w:bottom w:w="100" w:type="dxa"/>
+              <w:right w:w="100" w:type="dxa"/>
+            </w:tcMar>
+          </w:tcPr>
+          <w:p>
+            <w:pPr>
+              <w:jc w:val="both"/>
+              <w:rPr>
+                <w:rFonts w:ascii="Calibri" w:eastAsia="Calibri" w:hAnsi="Calibri" w:cs="Calibri"/>
+                <w:color w:val="16191F"/>
+                <w:sz w:val="24"/>
+                <w:szCs w:val="24"/>
+              </w:rPr>
+            </w:pPr>
+          </w:p>
+          <w:p>
+            <w:pPr>
+              <w:jc w:val="both"/>
+              <w:rPr>
+                <w:rFonts w:ascii="Calibri" w:eastAsia="Calibri" w:hAnsi="Calibri" w:cs="Calibri"/>
+                <w:color w:val="16191F"/>
+                <w:sz w:val="24"/>
+                <w:szCs w:val="24"/>
+              </w:rPr>
+            </w:pPr>
+            <w:r>
+              <w:rPr>
+                <w:rFonts w:ascii="Calibri" w:eastAsia="Calibri" w:hAnsi="Calibri" w:cs="Calibri"/>
+                <w:color w:val="16191F"/>
+                <w:sz w:val="24"/>
+                <w:szCs w:val="24"/>
+              </w:rPr>
+              <w:t xml:space="preserve">copy </w:t>
+            </w:r>
+            <w:proofErr w:type="gramStart"/>
+            <w:r>
+              <w:rPr>
+                <w:rFonts w:ascii="Calibri" w:eastAsia="Calibri" w:hAnsi="Calibri" w:cs="Calibri"/>
+                <w:color w:val="16191F"/>
+                <w:sz w:val="24"/>
+                <w:szCs w:val="24"/>
+              </w:rPr>
+              <w:t>test.listing</w:t>
+            </w:r>
+            <w:proofErr w:type="gramEnd"/>
+            <w:r>
+              <w:rPr>
+                <w:rFonts w:ascii="Calibri" w:eastAsia="Calibri" w:hAnsi="Calibri" w:cs="Calibri"/>
+                <w:color w:val="16191F"/>
+                <w:sz w:val="24"/>
+                <w:szCs w:val="24"/>
+              </w:rPr>
+              <w:t xml:space="preserve">_parquet </w:t>
+            </w:r>
+          </w:p>
+          <w:p>
+            <w:pPr>
+              <w:jc w:val="both"/>
+              <w:rPr>
+                <w:rFonts w:ascii="Calibri" w:eastAsia="Calibri" w:hAnsi="Calibri" w:cs="Calibri"/>
+                <w:color w:val="16191F"/>
+                <w:sz w:val="24"/>
+                <w:szCs w:val="24"/>
+              </w:rPr>
+            </w:pPr>
+            <w:r>
+              <w:rPr>
+                <w:rFonts w:ascii="Calibri" w:eastAsia="Calibri" w:hAnsi="Calibri" w:cs="Calibri"/>
+                <w:color w:val="16191F"/>
+                <w:sz w:val="24"/>
+                <w:szCs w:val="24"/>
+              </w:rPr>
+              <w:t xml:space="preserve">from 's3://bootcamp-bucket/data/listings/parquet/file' </w:t>
+            </w:r>
+          </w:p>
+          <w:p>
+            <w:pPr>
+              <w:jc w:val="both"/>
+              <w:rPr>
+                <w:rFonts w:ascii="Calibri" w:eastAsia="Calibri" w:hAnsi="Calibri" w:cs="Calibri"/>
+                <w:color w:val="16191F"/>
+                <w:sz w:val="24"/>
+                <w:szCs w:val="24"/>
+              </w:rPr>
+            </w:pPr>
+            <w:r>
+              <w:rPr>
+                <w:rFonts w:ascii="Calibri" w:eastAsia="Calibri" w:hAnsi="Calibri" w:cs="Calibri"/>
+                <w:color w:val="16191F"/>
+                <w:sz w:val="24"/>
+                <w:szCs w:val="24"/>
+              </w:rPr>
+              <w:t>iam_role '</w:t>
+            </w:r>
+            <w:proofErr w:type="gramStart"/>
+            <w:r>
+              <w:rPr>
+                <w:rFonts w:ascii="Calibri" w:eastAsia="Calibri" w:hAnsi="Calibri" w:cs="Calibri"/>
+                <w:color w:val="16191F"/>
+                <w:sz w:val="24"/>
+                <w:szCs w:val="24"/>
+              </w:rPr>
+              <w:t>arn:aws</w:t>
+            </w:r>
+            <w:proofErr w:type="gramEnd"/>
+            <w:r>
+              <w:rPr>
+                <w:rFonts w:ascii="Calibri" w:eastAsia="Calibri" w:hAnsi="Calibri" w:cs="Calibri"/>
+                <w:color w:val="16191F"/>
+                <w:sz w:val="24"/>
+                <w:szCs w:val="24"/>
+              </w:rPr>
+              <w:t>:</w:t>
+            </w:r>
+            <w:proofErr w:type="gramStart"/>
+            <w:r>
+              <w:rPr>
+                <w:rFonts w:ascii="Calibri" w:eastAsia="Calibri" w:hAnsi="Calibri" w:cs="Calibri"/>
+                <w:color w:val="16191F"/>
+                <w:sz w:val="24"/>
+                <w:szCs w:val="24"/>
+              </w:rPr>
+              <w:t>iam::111081800296:role</w:t>
+            </w:r>
+            <w:proofErr w:type="gramEnd"/>
+            <w:r>
+              <w:rPr>
+                <w:rFonts w:ascii="Calibri" w:eastAsia="Calibri" w:hAnsi="Calibri" w:cs="Calibri"/>
+                <w:color w:val="16191F"/>
+                <w:sz w:val="24"/>
+                <w:szCs w:val="24"/>
+              </w:rPr>
+              <w:t>/Redshift_admin'</w:t>
+            </w:r>
+          </w:p>
+          <w:p>
+            <w:pPr>
+              <w:jc w:val="both"/>
+              <w:rPr>
+                <w:rFonts w:ascii="Calibri" w:eastAsia="Calibri" w:hAnsi="Calibri" w:cs="Calibri"/>
+                <w:color w:val="16191F"/>
+                <w:sz w:val="24"/>
+                <w:szCs w:val="24"/>
+              </w:rPr>
+            </w:pPr>
+            <w:r>
+              <w:rPr>
+                <w:rFonts w:ascii="Calibri" w:eastAsia="Calibri" w:hAnsi="Calibri" w:cs="Calibri"/>
+                <w:color w:val="16191F"/>
+                <w:sz w:val="24"/>
+                <w:szCs w:val="24"/>
+              </w:rPr>
+              <w:t>format as parquet;</w:t>
+            </w:r>
+          </w:p>
+          <w:p>
+            <w:pPr>
+              <w:widowControl w:val="0"/>
+              <w:pBdr>
+                <w:top w:val="nil"/>
+                <w:left w:val="nil"/>
+                <w:bottom w:val="nil"/>
+                <w:right w:val="nil"/>
+                <w:between w:val="nil"/>
+              </w:pBdr>
+              <w:spacing w:line="240" w:lineRule="auto"/>
+              <w:jc w:val="both"/>
+              <w:rPr>
+                <w:rFonts w:ascii="Calibri" w:eastAsia="Calibri" w:hAnsi="Calibri" w:cs="Calibri"/>
+                <w:color w:val="16191F"/>
+                <w:sz w:val="24"/>
+                <w:szCs w:val="24"/>
+              </w:rPr>
+            </w:pPr>
+          </w:p>
+        </w:tc>
+      </w:tr>
+    </w:tbl>
+    <w:p>
+      <w:pPr>
+        <w:jc w:val="both"/>
+        <w:rPr>
+          <w:rFonts w:ascii="Calibri" w:eastAsia="Calibri" w:hAnsi="Calibri" w:cs="Calibri"/>
+          <w:color w:val="16191F"/>
+          <w:sz w:val="24"/>
+          <w:szCs w:val="24"/>
+        </w:rPr>
+      </w:pPr>
+    </w:p>
+    <w:p>
+      <w:pPr>
+        <w:jc w:val="both"/>
+        <w:rPr>
+          <w:rFonts w:ascii="Calibri" w:eastAsia="Calibri" w:hAnsi="Calibri" w:cs="Calibri"/>
+          <w:color w:val="16191F"/>
+          <w:sz w:val="24"/>
+          <w:szCs w:val="24"/>
+        </w:rPr>
+      </w:pPr>
+    </w:p>
+    <w:p>
+      <w:pPr>
+        <w:pStyle w:val="Heading2"/>
+        <w:keepNext w:val="0"/>
+        <w:keepLines w:val="0"/>
+        <w:pBdr>
+          <w:top w:val="none" w:sz="0" w:space="17" w:color="auto"/>
+        </w:pBdr>
+        <w:shd w:val="clear" w:color="auto" w:fill="FFFFFF"/>
+        <w:spacing w:before="560" w:after="420" w:line="294" w:lineRule="auto"/>
+        <w:jc w:val="both"/>
+        <w:rPr>
+          <w:rFonts w:ascii="Calibri" w:eastAsia="Calibri" w:hAnsi="Calibri" w:cs="Calibri"/>
+          <w:b/>
+          <w:color w:val="16191F"/>
+          <w:sz w:val="24"/>
+          <w:szCs w:val="24"/>
+        </w:rPr>
+      </w:pPr>
+      <w:bookmarkStart w:id="1" w:name="_wubb8kb178cz" w:colFirst="0" w:colLast="0"/>
+      <w:bookmarkEnd w:id="1"/>
+      <w:r>
+        <w:rPr>
+          <w:rFonts w:ascii="Calibri" w:eastAsia="Calibri" w:hAnsi="Calibri" w:cs="Calibri"/>
+          <w:b/>
+          <w:color w:val="16191F"/>
+          <w:sz w:val="24"/>
+          <w:szCs w:val="24"/>
+        </w:rPr>
+        <w:t>Load EVENT with options</w:t>
+      </w:r>
+    </w:p>
+    <w:p>
+      <w:pPr>
+        <w:shd w:val="clear" w:color="auto" w:fill="FFFFFF"/>
+        <w:spacing w:before="240" w:after="240" w:line="360" w:lineRule="auto"/>
+        <w:jc w:val="both"/>
+        <w:rPr>
+          <w:rFonts w:ascii="Calibri" w:eastAsia="Calibri" w:hAnsi="Calibri" w:cs="Calibri"/>
+          <w:color w:val="16191F"/>
+          <w:sz w:val="24"/>
+          <w:szCs w:val="24"/>
+        </w:rPr>
+      </w:pPr>
+      <w:r>
+        <w:rPr>
+          <w:rFonts w:ascii="Calibri" w:eastAsia="Calibri" w:hAnsi="Calibri" w:cs="Calibri"/>
+          <w:color w:val="16191F"/>
+          <w:sz w:val="24"/>
+          <w:szCs w:val="24"/>
+        </w:rPr>
+        <w:t>The following example loads pipe-delimited data into the EVENT table and applies the following rules:</w:t>
+      </w:r>
+    </w:p>
+    <w:p>
+      <w:pPr>
+        <w:numPr>
+          <w:ilvl w:val="0"/>
+          <w:numId w:val="1"/>
+        </w:numPr>
+        <w:spacing w:line="360" w:lineRule="auto"/>
+        <w:jc w:val="both"/>
+        <w:rPr>
+          <w:rFonts w:ascii="Calibri" w:eastAsia="Calibri" w:hAnsi="Calibri" w:cs="Calibri"/>
+        </w:rPr>
+      </w:pPr>
+      <w:r>
+        <w:rPr>
+          <w:rFonts w:ascii="Calibri" w:eastAsia="Calibri" w:hAnsi="Calibri" w:cs="Calibri"/>
+          <w:color w:val="16191F"/>
+          <w:sz w:val="24"/>
+          <w:szCs w:val="24"/>
+        </w:rPr>
+        <w:t>If pairs of quotation marks are used to surround any character strings, they are removed.</w:t>
+      </w:r>
+    </w:p>
+    <w:p>
+      <w:pPr>
+        <w:numPr>
+          <w:ilvl w:val="0"/>
+          <w:numId w:val="1"/>
+        </w:numPr>
+        <w:pBdr>
+          <w:top w:val="none" w:sz="0" w:space="3" w:color="auto"/>
+        </w:pBdr>
+        <w:spacing w:line="360" w:lineRule="auto"/>
+        <w:jc w:val="both"/>
+        <w:rPr>
+          <w:rFonts w:ascii="Calibri" w:eastAsia="Calibri" w:hAnsi="Calibri" w:cs="Calibri"/>
+        </w:rPr>
+      </w:pPr>
+      <w:r>
+        <w:rPr>
+          <w:rFonts w:ascii="Calibri" w:eastAsia="Calibri" w:hAnsi="Calibri" w:cs="Calibri"/>
+          <w:color w:val="16191F"/>
+          <w:sz w:val="24"/>
+          <w:szCs w:val="24"/>
+        </w:rPr>
+        <w:t>Both empty strings and strings that contain blanks are loaded as NULL values.</w:t>
+      </w:r>
+    </w:p>
+    <w:p>
+      <w:pPr>
+        <w:numPr>
+          <w:ilvl w:val="0"/>
+          <w:numId w:val="1"/>
+        </w:numPr>
+        <w:pBdr>
+          <w:top w:val="none" w:sz="0" w:space="3" w:color="auto"/>
+        </w:pBdr>
+        <w:spacing w:line="360" w:lineRule="auto"/>
+        <w:jc w:val="both"/>
+        <w:rPr>
+          <w:rFonts w:ascii="Calibri" w:eastAsia="Calibri" w:hAnsi="Calibri" w:cs="Calibri"/>
+        </w:rPr>
+      </w:pPr>
+      <w:r>
+        <w:rPr>
+          <w:rFonts w:ascii="Calibri" w:eastAsia="Calibri" w:hAnsi="Calibri" w:cs="Calibri"/>
+          <w:color w:val="16191F"/>
+          <w:sz w:val="24"/>
+          <w:szCs w:val="24"/>
+        </w:rPr>
+        <w:t>The load fails if more than 5 errors are returned.</w:t>
+      </w:r>
+    </w:p>
+    <w:p>
+      <w:pPr>
+        <w:numPr>
+          <w:ilvl w:val="0"/>
+          <w:numId w:val="1"/>
+        </w:numPr>
+        <w:pBdr>
+          <w:top w:val="none" w:sz="0" w:space="3" w:color="auto"/>
+        </w:pBdr>
+        <w:spacing w:after="160" w:line="360" w:lineRule="auto"/>
+        <w:jc w:val="both"/>
+      </w:pPr>
+      <w:r>
+        <w:rPr>
+          <w:rFonts w:ascii="Calibri" w:eastAsia="Calibri" w:hAnsi="Calibri" w:cs="Calibri"/>
+          <w:color w:val="16191F"/>
+          <w:sz w:val="24"/>
+          <w:szCs w:val="24"/>
+        </w:rPr>
+        <w:t>Timestamp values must comply with the specified format; for example, a valid timestamp is 2008-09-26 05:43:12.</w:t>
+      </w:r>
+    </w:p>
+    <w:p>
+      <w:pPr>
+        <w:jc w:val="both"/>
+        <w:rPr>
+          <w:rFonts w:ascii="Calibri" w:eastAsia="Calibri" w:hAnsi="Calibri" w:cs="Calibri"/>
+          <w:color w:val="16191F"/>
+          <w:sz w:val="24"/>
+          <w:szCs w:val="24"/>
+        </w:rPr>
+      </w:pPr>
+    </w:p>
+    <w:p>
+      <w:pPr>
+        <w:jc w:val="both"/>
+        <w:rPr>
+          <w:rFonts w:ascii="Calibri" w:eastAsia="Calibri" w:hAnsi="Calibri" w:cs="Calibri"/>
+          <w:color w:val="16191F"/>
+          <w:sz w:val="24"/>
+          <w:szCs w:val="24"/>
+        </w:rPr>
+      </w:pPr>
+    </w:p>
+    <w:tbl>
+      <w:tblPr>
+        <w:tblW w:w="9029" w:type="dxa"/>
+        <w:tblBorders>
+          <w:top w:val="single" w:sz="8" w:space="0" w:color="000000"/>
+          <w:left w:val="single" w:sz="8" w:space="0" w:color="000000"/>
+          <w:bottom w:val="single" w:sz="8" w:space="0" w:color="000000"/>
+          <w:right w:val="single" w:sz="8" w:space="0" w:color="000000"/>
+          <w:insideH w:val="single" w:sz="8" w:space="0" w:color="000000"/>
+          <w:insideV w:val="single" w:sz="8" w:space="0" w:color="000000"/>
+        </w:tblBorders>
+        <w:tblLayout w:type="fixed"/>
+        <w:tblLook w:val="0600" w:firstRow="0" w:lastRow="0" w:firstColumn="0" w:lastColumn="0" w:noHBand="1" w:noVBand="1"/>
+      </w:tblPr>
+      <w:tblGrid>
+        <w:gridCol w:w="9029"/>
+      </w:tblGrid>
+      <w:tr>
+        <w:tc>
+          <w:tcPr>
+            <w:tcW w:w="9029" w:type="dxa"/>
+            <w:tcMar>
+              <w:top w:w="100" w:type="dxa"/>
+              <w:left w:w="100" w:type="dxa"/>
+              <w:bottom w:w="100" w:type="dxa"/>
+              <w:right w:w="100" w:type="dxa"/>
+            </w:tcMar>
+          </w:tcPr>
+          <w:p>
+            <w:pPr>
+              <w:widowControl w:val="0"/>
+              <w:pBdr>
+                <w:top w:val="nil"/>
+                <w:left w:val="nil"/>
+                <w:bottom w:val="nil"/>
+                <w:right w:val="nil"/>
+                <w:between w:val="nil"/>
+              </w:pBdr>
+              <w:spacing w:line="240" w:lineRule="auto"/>
+              <w:rPr>
+                <w:rFonts w:ascii="Calibri" w:eastAsia="Calibri" w:hAnsi="Calibri" w:cs="Calibri"/>
+                <w:color w:val="16191F"/>
+                <w:sz w:val="24"/>
+                <w:szCs w:val="24"/>
+              </w:rPr>
+            </w:pPr>
+            <w:r>
+              <w:rPr>
+                <w:rFonts w:ascii="Calibri" w:eastAsia="Calibri" w:hAnsi="Calibri" w:cs="Calibri"/>
+                <w:color w:val="16191F"/>
+                <w:sz w:val="24"/>
+                <w:szCs w:val="24"/>
+              </w:rPr>
+              <w:t>1|305|8|1851|Gotterdammerung|2008-01-25 14:30:00</w:t>
+            </w:r>
+          </w:p>
+          <w:p>
+            <w:pPr>
+              <w:widowControl w:val="0"/>
+              <w:pBdr>
+                <w:top w:val="nil"/>
+                <w:left w:val="nil"/>
+                <w:bottom w:val="nil"/>
+                <w:right w:val="nil"/>
+                <w:between w:val="nil"/>
+              </w:pBdr>
+              <w:spacing w:line="240" w:lineRule="auto"/>
+              <w:rPr>
+                <w:rFonts w:ascii="Calibri" w:eastAsia="Calibri" w:hAnsi="Calibri" w:cs="Calibri"/>
+                <w:color w:val="16191F"/>
+                <w:sz w:val="24"/>
+                <w:szCs w:val="24"/>
+              </w:rPr>
+            </w:pPr>
+            <w:r>
+              <w:rPr>
+                <w:rFonts w:ascii="Calibri" w:eastAsia="Calibri" w:hAnsi="Calibri" w:cs="Calibri"/>
+                <w:color w:val="16191F"/>
+                <w:sz w:val="24"/>
+                <w:szCs w:val="24"/>
+              </w:rPr>
+              <w:t>2|306|8|2114|Boris Godunov|2008-10-15 20:00:00</w:t>
+            </w:r>
+          </w:p>
+          <w:p>
+            <w:pPr>
+              <w:widowControl w:val="0"/>
+              <w:pBdr>
+                <w:top w:val="nil"/>
+                <w:left w:val="nil"/>
+                <w:bottom w:val="nil"/>
+                <w:right w:val="nil"/>
+                <w:between w:val="nil"/>
+              </w:pBdr>
+              <w:spacing w:line="240" w:lineRule="auto"/>
+              <w:rPr>
+                <w:rFonts w:ascii="Calibri" w:eastAsia="Calibri" w:hAnsi="Calibri" w:cs="Calibri"/>
+                <w:color w:val="16191F"/>
+                <w:sz w:val="24"/>
+                <w:szCs w:val="24"/>
+              </w:rPr>
+            </w:pPr>
+            <w:r>
+              <w:rPr>
+                <w:rFonts w:ascii="Calibri" w:eastAsia="Calibri" w:hAnsi="Calibri" w:cs="Calibri"/>
+                <w:color w:val="16191F"/>
+                <w:sz w:val="24"/>
+                <w:szCs w:val="24"/>
+              </w:rPr>
+              <w:t>3|302|8|1935|Salome|2008-04-19 14:30:00</w:t>
+            </w:r>
+          </w:p>
+          <w:p>
+            <w:pPr>
+              <w:widowControl w:val="0"/>
+              <w:pBdr>
+                <w:top w:val="nil"/>
+                <w:left w:val="nil"/>
+                <w:bottom w:val="nil"/>
+                <w:right w:val="nil"/>
+                <w:between w:val="nil"/>
+              </w:pBdr>
+              <w:spacing w:line="240" w:lineRule="auto"/>
+              <w:rPr>
+                <w:rFonts w:ascii="Calibri" w:eastAsia="Calibri" w:hAnsi="Calibri" w:cs="Calibri"/>
+                <w:color w:val="16191F"/>
+                <w:sz w:val="24"/>
+                <w:szCs w:val="24"/>
+              </w:rPr>
+            </w:pPr>
+            <w:r>
+              <w:rPr>
+                <w:rFonts w:ascii="Calibri" w:eastAsia="Calibri" w:hAnsi="Calibri" w:cs="Calibri"/>
+                <w:color w:val="16191F"/>
+                <w:sz w:val="24"/>
+                <w:szCs w:val="24"/>
+              </w:rPr>
+              <w:t>4|309|8|2090|La Cenerentola (Cinderella)|2008-09-21 14:30:00</w:t>
+            </w:r>
+          </w:p>
+          <w:p>
+            <w:pPr>
+              <w:widowControl w:val="0"/>
+              <w:pBdr>
+                <w:top w:val="nil"/>
+                <w:left w:val="nil"/>
+                <w:bottom w:val="nil"/>
+                <w:right w:val="nil"/>
+                <w:between w:val="nil"/>
+              </w:pBdr>
+              <w:spacing w:line="240" w:lineRule="auto"/>
+              <w:rPr>
+                <w:rFonts w:ascii="Calibri" w:eastAsia="Calibri" w:hAnsi="Calibri" w:cs="Calibri"/>
+                <w:color w:val="16191F"/>
+                <w:sz w:val="24"/>
+                <w:szCs w:val="24"/>
+              </w:rPr>
+            </w:pPr>
+            <w:r>
+              <w:rPr>
+                <w:rFonts w:ascii="Calibri" w:eastAsia="Calibri" w:hAnsi="Calibri" w:cs="Calibri"/>
+                <w:color w:val="16191F"/>
+                <w:sz w:val="24"/>
+                <w:szCs w:val="24"/>
+              </w:rPr>
+              <w:t>5|302|8|1982|Il Trovatore|2008-06-05 19:00:00</w:t>
+            </w:r>
+          </w:p>
+          <w:p>
+            <w:pPr>
+              <w:widowControl w:val="0"/>
+              <w:pBdr>
+                <w:top w:val="nil"/>
+                <w:left w:val="nil"/>
+                <w:bottom w:val="nil"/>
+                <w:right w:val="nil"/>
+                <w:between w:val="nil"/>
+              </w:pBdr>
+              <w:spacing w:line="240" w:lineRule="auto"/>
+              <w:rPr>
+                <w:rFonts w:ascii="Calibri" w:eastAsia="Calibri" w:hAnsi="Calibri" w:cs="Calibri"/>
+                <w:color w:val="16191F"/>
+                <w:sz w:val="24"/>
+                <w:szCs w:val="24"/>
+              </w:rPr>
+            </w:pPr>
+            <w:r>
+              <w:rPr>
+                <w:rFonts w:ascii="Calibri" w:eastAsia="Calibri" w:hAnsi="Calibri" w:cs="Calibri"/>
+                <w:color w:val="16191F"/>
+                <w:sz w:val="24"/>
+                <w:szCs w:val="24"/>
+              </w:rPr>
+              <w:lastRenderedPageBreak/>
+              <w:t>6|308|8|2109|L Elisir d Amore|2008-10-10 19:30:00</w:t>
+            </w:r>
+          </w:p>
+          <w:p>
+            <w:pPr>
+              <w:widowControl w:val="0"/>
+              <w:pBdr>
+                <w:top w:val="nil"/>
+                <w:left w:val="nil"/>
+                <w:bottom w:val="nil"/>
+                <w:right w:val="nil"/>
+                <w:between w:val="nil"/>
+              </w:pBdr>
+              <w:spacing w:line="240" w:lineRule="auto"/>
+              <w:rPr>
+                <w:rFonts w:ascii="Calibri" w:eastAsia="Calibri" w:hAnsi="Calibri" w:cs="Calibri"/>
+                <w:color w:val="16191F"/>
+                <w:sz w:val="24"/>
+                <w:szCs w:val="24"/>
+              </w:rPr>
+            </w:pPr>
+            <w:r>
+              <w:rPr>
+                <w:rFonts w:ascii="Calibri" w:eastAsia="Calibri" w:hAnsi="Calibri" w:cs="Calibri"/>
+                <w:color w:val="16191F"/>
+                <w:sz w:val="24"/>
+                <w:szCs w:val="24"/>
+              </w:rPr>
+              <w:t>7|309|8|1891|Doctor Atomic|2008-03-06 14:00:00</w:t>
+            </w:r>
+          </w:p>
+          <w:p>
+            <w:pPr>
+              <w:widowControl w:val="0"/>
+              <w:pBdr>
+                <w:top w:val="nil"/>
+                <w:left w:val="nil"/>
+                <w:bottom w:val="nil"/>
+                <w:right w:val="nil"/>
+                <w:between w:val="nil"/>
+              </w:pBdr>
+              <w:spacing w:line="240" w:lineRule="auto"/>
+              <w:rPr>
+                <w:rFonts w:ascii="Calibri" w:eastAsia="Calibri" w:hAnsi="Calibri" w:cs="Calibri"/>
+                <w:color w:val="16191F"/>
+                <w:sz w:val="24"/>
+                <w:szCs w:val="24"/>
+              </w:rPr>
+            </w:pPr>
+            <w:r>
+              <w:rPr>
+                <w:rFonts w:ascii="Calibri" w:eastAsia="Calibri" w:hAnsi="Calibri" w:cs="Calibri"/>
+                <w:color w:val="16191F"/>
+                <w:sz w:val="24"/>
+                <w:szCs w:val="24"/>
+              </w:rPr>
+              <w:t>8|302|8|1832|The Magic Flute|2008-01-06 20:00:00</w:t>
+            </w:r>
+          </w:p>
+          <w:p>
+            <w:pPr>
+              <w:widowControl w:val="0"/>
+              <w:pBdr>
+                <w:top w:val="nil"/>
+                <w:left w:val="nil"/>
+                <w:bottom w:val="nil"/>
+                <w:right w:val="nil"/>
+                <w:between w:val="nil"/>
+              </w:pBdr>
+              <w:spacing w:line="240" w:lineRule="auto"/>
+              <w:rPr>
+                <w:rFonts w:ascii="Calibri" w:eastAsia="Calibri" w:hAnsi="Calibri" w:cs="Calibri"/>
+                <w:color w:val="16191F"/>
+                <w:sz w:val="24"/>
+                <w:szCs w:val="24"/>
+              </w:rPr>
+            </w:pPr>
+            <w:r>
+              <w:rPr>
+                <w:rFonts w:ascii="Calibri" w:eastAsia="Calibri" w:hAnsi="Calibri" w:cs="Calibri"/>
+                <w:color w:val="16191F"/>
+                <w:sz w:val="24"/>
+                <w:szCs w:val="24"/>
+              </w:rPr>
+              <w:t>9|308|8|2087|The Fly|2008-09-18 19:30:00</w:t>
+            </w:r>
+          </w:p>
+          <w:p>
+            <w:pPr>
+              <w:widowControl w:val="0"/>
+              <w:pBdr>
+                <w:top w:val="nil"/>
+                <w:left w:val="nil"/>
+                <w:bottom w:val="nil"/>
+                <w:right w:val="nil"/>
+                <w:between w:val="nil"/>
+              </w:pBdr>
+              <w:spacing w:line="240" w:lineRule="auto"/>
+              <w:rPr>
+                <w:rFonts w:ascii="Calibri" w:eastAsia="Calibri" w:hAnsi="Calibri" w:cs="Calibri"/>
+                <w:color w:val="16191F"/>
+                <w:sz w:val="24"/>
+                <w:szCs w:val="24"/>
+              </w:rPr>
+            </w:pPr>
+            <w:r>
+              <w:rPr>
+                <w:rFonts w:ascii="Calibri" w:eastAsia="Calibri" w:hAnsi="Calibri" w:cs="Calibri"/>
+                <w:color w:val="16191F"/>
+                <w:sz w:val="24"/>
+                <w:szCs w:val="24"/>
+              </w:rPr>
+              <w:t>10|305|8|2079|Rigoletto|2008-09-10 15:00:00</w:t>
+            </w:r>
+          </w:p>
+          <w:p>
+            <w:pPr>
+              <w:widowControl w:val="0"/>
+              <w:pBdr>
+                <w:top w:val="nil"/>
+                <w:left w:val="nil"/>
+                <w:bottom w:val="nil"/>
+                <w:right w:val="nil"/>
+                <w:between w:val="nil"/>
+              </w:pBdr>
+              <w:spacing w:line="240" w:lineRule="auto"/>
+              <w:rPr>
+                <w:rFonts w:ascii="Calibri" w:eastAsia="Calibri" w:hAnsi="Calibri" w:cs="Calibri"/>
+                <w:color w:val="16191F"/>
+                <w:sz w:val="24"/>
+                <w:szCs w:val="24"/>
+              </w:rPr>
+            </w:pPr>
+          </w:p>
+          <w:p>
+            <w:pPr>
+              <w:widowControl w:val="0"/>
+              <w:pBdr>
+                <w:top w:val="nil"/>
+                <w:left w:val="nil"/>
+                <w:bottom w:val="nil"/>
+                <w:right w:val="nil"/>
+                <w:between w:val="nil"/>
+              </w:pBdr>
+              <w:spacing w:line="240" w:lineRule="auto"/>
+              <w:rPr>
+                <w:rFonts w:ascii="Calibri" w:eastAsia="Calibri" w:hAnsi="Calibri" w:cs="Calibri"/>
+                <w:color w:val="16191F"/>
+                <w:sz w:val="24"/>
+                <w:szCs w:val="24"/>
+              </w:rPr>
+            </w:pPr>
+          </w:p>
+        </w:tc>
+      </w:tr>
+    </w:tbl>
+    <w:p>
+      <w:pPr>
+        <w:jc w:val="both"/>
+        <w:rPr>
+          <w:rFonts w:ascii="Calibri" w:eastAsia="Calibri" w:hAnsi="Calibri" w:cs="Calibri"/>
+          <w:color w:val="16191F"/>
+          <w:sz w:val="24"/>
+          <w:szCs w:val="24"/>
+        </w:rPr>
+      </w:pPr>
+    </w:p>
+    <w:p>
+      <w:pPr>
+        <w:jc w:val="both"/>
+        <w:rPr>
+          <w:rFonts w:ascii="Calibri" w:eastAsia="Calibri" w:hAnsi="Calibri" w:cs="Calibri"/>
+          <w:color w:val="16191F"/>
+          <w:sz w:val="24"/>
+          <w:szCs w:val="24"/>
+        </w:rPr>
+      </w:pPr>
+    </w:p>
+    <w:p>
+      <w:pPr>
+        <w:jc w:val="both"/>
+        <w:rPr>
+          <w:rFonts w:ascii="Calibri" w:eastAsia="Calibri" w:hAnsi="Calibri" w:cs="Calibri"/>
+          <w:color w:val="16191F"/>
+          <w:sz w:val="24"/>
+          <w:szCs w:val="24"/>
+        </w:rPr>
+      </w:pPr>
+      <w:r>
+        <w:rPr>
+          <w:rFonts w:ascii="Calibri" w:eastAsia="Calibri" w:hAnsi="Calibri" w:cs="Calibri"/>
+          <w:color w:val="16191F"/>
+          <w:sz w:val="24"/>
+          <w:szCs w:val="24"/>
+        </w:rPr>
+        <w:t>allevents_pipe.txt</w:t>
+      </w:r>
+    </w:p>
+    <w:tbl>
+      <w:tblPr>
+        <w:tblW w:w="9029" w:type="dxa"/>
+        <w:tblBorders>
+          <w:top w:val="single" w:sz="8" w:space="0" w:color="000000"/>
+          <w:left w:val="single" w:sz="8" w:space="0" w:color="000000"/>
+          <w:bottom w:val="single" w:sz="8" w:space="0" w:color="000000"/>
+          <w:right w:val="single" w:sz="8" w:space="0" w:color="000000"/>
+          <w:insideH w:val="single" w:sz="8" w:space="0" w:color="000000"/>
+          <w:insideV w:val="single" w:sz="8" w:space="0" w:color="000000"/>
+        </w:tblBorders>
+        <w:tblLayout w:type="fixed"/>
+        <w:tblLook w:val="0600" w:firstRow="0" w:lastRow="0" w:firstColumn="0" w:lastColumn="0" w:noHBand="1" w:noVBand="1"/>
+      </w:tblPr>
+      <w:tblGrid>
+        <w:gridCol w:w="9029"/>
+      </w:tblGrid>
+      <w:tr>
+        <w:tc>
+          <w:tcPr>
+            <w:tcW w:w="9029" w:type="dxa"/>
+            <w:tcMar>
+              <w:top w:w="100" w:type="dxa"/>
+              <w:left w:w="100" w:type="dxa"/>
+              <w:bottom w:w="100" w:type="dxa"/>
+              <w:right w:w="100" w:type="dxa"/>
+            </w:tcMar>
+          </w:tcPr>
+          <w:p>
+            <w:pPr>
+              <w:jc w:val="both"/>
+              <w:rPr>
+                <w:rFonts w:ascii="Calibri" w:eastAsia="Calibri" w:hAnsi="Calibri" w:cs="Calibri"/>
+                <w:color w:val="16191F"/>
+                <w:sz w:val="24"/>
+                <w:szCs w:val="24"/>
+              </w:rPr>
+            </w:pPr>
+            <w:r>
+              <w:rPr>
+                <w:rFonts w:ascii="Calibri" w:eastAsia="Calibri" w:hAnsi="Calibri" w:cs="Calibri"/>
+                <w:color w:val="16191F"/>
+                <w:sz w:val="24"/>
+                <w:szCs w:val="24"/>
+              </w:rPr>
+              <w:t xml:space="preserve">create table </w:t>
+            </w:r>
+            <w:proofErr w:type="gramStart"/>
+            <w:r>
+              <w:rPr>
+                <w:rFonts w:ascii="Calibri" w:eastAsia="Calibri" w:hAnsi="Calibri" w:cs="Calibri"/>
+                <w:color w:val="16191F"/>
+                <w:sz w:val="24"/>
+                <w:szCs w:val="24"/>
+              </w:rPr>
+              <w:t>test.event</w:t>
+            </w:r>
+            <w:proofErr w:type="gramEnd"/>
+            <w:r>
+              <w:rPr>
+                <w:rFonts w:ascii="Calibri" w:eastAsia="Calibri" w:hAnsi="Calibri" w:cs="Calibri"/>
+                <w:color w:val="16191F"/>
+                <w:sz w:val="24"/>
+                <w:szCs w:val="24"/>
+              </w:rPr>
+              <w:t>(</w:t>
+            </w:r>
+          </w:p>
+          <w:p>
+            <w:pPr>
+              <w:jc w:val="both"/>
+              <w:rPr>
+                <w:rFonts w:ascii="Calibri" w:eastAsia="Calibri" w:hAnsi="Calibri" w:cs="Calibri"/>
+                <w:color w:val="16191F"/>
+                <w:sz w:val="24"/>
+                <w:szCs w:val="24"/>
+              </w:rPr>
+            </w:pPr>
+            <w:r>
+              <w:rPr>
+                <w:rFonts w:ascii="Calibri" w:eastAsia="Calibri" w:hAnsi="Calibri" w:cs="Calibri"/>
+                <w:color w:val="16191F"/>
+                <w:sz w:val="24"/>
+                <w:szCs w:val="24"/>
+              </w:rPr>
+              <w:tab/>
+              <w:t>eventid integer not null distkey,</w:t>
+            </w:r>
+          </w:p>
+          <w:p>
+            <w:pPr>
+              <w:jc w:val="both"/>
+              <w:rPr>
+                <w:rFonts w:ascii="Calibri" w:eastAsia="Calibri" w:hAnsi="Calibri" w:cs="Calibri"/>
+                <w:color w:val="16191F"/>
+                <w:sz w:val="24"/>
+                <w:szCs w:val="24"/>
+              </w:rPr>
+            </w:pPr>
+            <w:r>
+              <w:rPr>
+                <w:rFonts w:ascii="Calibri" w:eastAsia="Calibri" w:hAnsi="Calibri" w:cs="Calibri"/>
+                <w:color w:val="16191F"/>
+                <w:sz w:val="24"/>
+                <w:szCs w:val="24"/>
+              </w:rPr>
+              <w:tab/>
+              <w:t>venueid smallint not null,</w:t>
+            </w:r>
+          </w:p>
+          <w:p>
+            <w:pPr>
+              <w:jc w:val="both"/>
+              <w:rPr>
+                <w:rFonts w:ascii="Calibri" w:eastAsia="Calibri" w:hAnsi="Calibri" w:cs="Calibri"/>
+                <w:color w:val="16191F"/>
+                <w:sz w:val="24"/>
+                <w:szCs w:val="24"/>
+              </w:rPr>
+            </w:pPr>
+            <w:r>
+              <w:rPr>
+                <w:rFonts w:ascii="Calibri" w:eastAsia="Calibri" w:hAnsi="Calibri" w:cs="Calibri"/>
+                <w:color w:val="16191F"/>
+                <w:sz w:val="24"/>
+                <w:szCs w:val="24"/>
+              </w:rPr>
+              <w:tab/>
+              <w:t>catid smallint not null,</w:t>
+            </w:r>
+          </w:p>
+          <w:p>
+            <w:pPr>
+              <w:jc w:val="both"/>
+              <w:rPr>
+                <w:rFonts w:ascii="Calibri" w:eastAsia="Calibri" w:hAnsi="Calibri" w:cs="Calibri"/>
+                <w:color w:val="16191F"/>
+                <w:sz w:val="24"/>
+                <w:szCs w:val="24"/>
+              </w:rPr>
+            </w:pPr>
+            <w:r>
+              <w:rPr>
+                <w:rFonts w:ascii="Calibri" w:eastAsia="Calibri" w:hAnsi="Calibri" w:cs="Calibri"/>
+                <w:color w:val="16191F"/>
+                <w:sz w:val="24"/>
+                <w:szCs w:val="24"/>
+              </w:rPr>
+              <w:tab/>
+              <w:t>dateid smallint not null sortkey,</w:t>
+            </w:r>
+          </w:p>
+          <w:p>
+            <w:pPr>
+              <w:jc w:val="both"/>
+              <w:rPr>
+                <w:rFonts w:ascii="Calibri" w:eastAsia="Calibri" w:hAnsi="Calibri" w:cs="Calibri"/>
+                <w:color w:val="16191F"/>
+                <w:sz w:val="24"/>
+                <w:szCs w:val="24"/>
+              </w:rPr>
+            </w:pPr>
+            <w:r>
+              <w:rPr>
+                <w:rFonts w:ascii="Calibri" w:eastAsia="Calibri" w:hAnsi="Calibri" w:cs="Calibri"/>
+                <w:color w:val="16191F"/>
+                <w:sz w:val="24"/>
+                <w:szCs w:val="24"/>
+              </w:rPr>
+              <w:tab/>
+              <w:t xml:space="preserve">eventname </w:t>
+            </w:r>
+            <w:proofErr w:type="gramStart"/>
+            <w:r>
+              <w:rPr>
+                <w:rFonts w:ascii="Calibri" w:eastAsia="Calibri" w:hAnsi="Calibri" w:cs="Calibri"/>
+                <w:color w:val="16191F"/>
+                <w:sz w:val="24"/>
+                <w:szCs w:val="24"/>
+              </w:rPr>
+              <w:t>varchar(</w:t>
+            </w:r>
+            <w:proofErr w:type="gramEnd"/>
+            <w:r>
+              <w:rPr>
+                <w:rFonts w:ascii="Calibri" w:eastAsia="Calibri" w:hAnsi="Calibri" w:cs="Calibri"/>
+                <w:color w:val="16191F"/>
+                <w:sz w:val="24"/>
+                <w:szCs w:val="24"/>
+              </w:rPr>
+              <w:t>200),</w:t>
+            </w:r>
+          </w:p>
+          <w:p>
+            <w:pPr>
+              <w:jc w:val="both"/>
+              <w:rPr>
+                <w:rFonts w:ascii="Calibri" w:eastAsia="Calibri" w:hAnsi="Calibri" w:cs="Calibri"/>
+                <w:color w:val="16191F"/>
+                <w:sz w:val="24"/>
+                <w:szCs w:val="24"/>
+              </w:rPr>
+            </w:pPr>
+            <w:r>
+              <w:rPr>
+                <w:rFonts w:ascii="Calibri" w:eastAsia="Calibri" w:hAnsi="Calibri" w:cs="Calibri"/>
+                <w:color w:val="16191F"/>
+                <w:sz w:val="24"/>
+                <w:szCs w:val="24"/>
+              </w:rPr>
+              <w:tab/>
+              <w:t>starttime timestamp);</w:t>
+            </w:r>
+          </w:p>
+          <w:p>
+            <w:pPr>
+              <w:widowControl w:val="0"/>
+              <w:pBdr>
+                <w:top w:val="nil"/>
+                <w:left w:val="nil"/>
+                <w:bottom w:val="nil"/>
+                <w:right w:val="nil"/>
+                <w:between w:val="nil"/>
+              </w:pBdr>
+              <w:spacing w:line="240" w:lineRule="auto"/>
+              <w:jc w:val="both"/>
+              <w:rPr>
+                <w:rFonts w:ascii="Calibri" w:eastAsia="Calibri" w:hAnsi="Calibri" w:cs="Calibri"/>
+                <w:color w:val="16191F"/>
+                <w:sz w:val="24"/>
+                <w:szCs w:val="24"/>
+              </w:rPr>
+            </w:pPr>
+          </w:p>
+        </w:tc>
+      </w:tr>
+    </w:tbl>
+    <w:p>
+      <w:pPr>
+        <w:jc w:val="both"/>
+        <w:rPr>
+          <w:rFonts w:ascii="Calibri" w:eastAsia="Calibri" w:hAnsi="Calibri" w:cs="Calibri"/>
+          <w:color w:val="16191F"/>
+          <w:sz w:val="24"/>
+          <w:szCs w:val="24"/>
+        </w:rPr>
+      </w:pPr>
+    </w:p>
+    <w:p>
+      <w:pPr>
+        <w:jc w:val="both"/>
+        <w:rPr>
+          <w:rFonts w:ascii="Calibri" w:eastAsia="Calibri" w:hAnsi="Calibri" w:cs="Calibri"/>
+          <w:color w:val="16191F"/>
+          <w:sz w:val="24"/>
+          <w:szCs w:val="24"/>
+        </w:rPr>
+      </w:pPr>
+    </w:p>
+    <w:p>
+      <w:pPr>
+        <w:jc w:val="both"/>
+        <w:rPr>
+          <w:rFonts w:ascii="Calibri" w:eastAsia="Calibri" w:hAnsi="Calibri" w:cs="Calibri"/>
+          <w:color w:val="16191F"/>
+          <w:sz w:val="24"/>
+          <w:szCs w:val="24"/>
+        </w:rPr>
+      </w:pPr>
+    </w:p>
+    <w:p>
+      <w:pPr>
+        <w:jc w:val="both"/>
+        <w:rPr>
+          <w:rFonts w:ascii="Calibri" w:eastAsia="Calibri" w:hAnsi="Calibri" w:cs="Calibri"/>
+          <w:color w:val="16191F"/>
+          <w:sz w:val="24"/>
+          <w:szCs w:val="24"/>
+        </w:rPr>
+      </w:pPr>
+    </w:p>
+    <w:tbl>
+      <w:tblPr>
+        <w:tblW w:w="9029" w:type="dxa"/>
+        <w:tblBorders>
+          <w:top w:val="single" w:sz="8" w:space="0" w:color="000000"/>
+          <w:left w:val="single" w:sz="8" w:space="0" w:color="000000"/>
+          <w:bottom w:val="single" w:sz="8" w:space="0" w:color="000000"/>
+          <w:right w:val="single" w:sz="8" w:space="0" w:color="000000"/>
+          <w:insideH w:val="single" w:sz="8" w:space="0" w:color="000000"/>
+          <w:insideV w:val="single" w:sz="8" w:space="0" w:color="000000"/>
+        </w:tblBorders>
+        <w:tblLayout w:type="fixed"/>
+        <w:tblLook w:val="0600" w:firstRow="0" w:lastRow="0" w:firstColumn="0" w:lastColumn="0" w:noHBand="1" w:noVBand="1"/>
+      </w:tblPr>
+      <w:tblGrid>
+        <w:gridCol w:w="9029"/>
+      </w:tblGrid>
+      <w:tr>
+        <w:tc>
+          <w:tcPr>
+            <w:tcW w:w="9029" w:type="dxa"/>
+            <w:tcMar>
+              <w:top w:w="100" w:type="dxa"/>
+              <w:left w:w="100" w:type="dxa"/>
+              <w:bottom w:w="100" w:type="dxa"/>
+              <w:right w:w="100" w:type="dxa"/>
+            </w:tcMar>
+          </w:tcPr>
+          <w:p>
+            <w:pPr>
+              <w:jc w:val="both"/>
+              <w:rPr>
+                <w:rFonts w:ascii="Calibri" w:eastAsia="Calibri" w:hAnsi="Calibri" w:cs="Calibri"/>
+                <w:color w:val="16191F"/>
+                <w:sz w:val="24"/>
+                <w:szCs w:val="24"/>
+              </w:rPr>
+            </w:pPr>
+          </w:p>
+          <w:p>
+            <w:pPr>
+              <w:jc w:val="both"/>
+              <w:rPr>
+                <w:rFonts w:ascii="Calibri" w:eastAsia="Calibri" w:hAnsi="Calibri" w:cs="Calibri"/>
+                <w:color w:val="16191F"/>
+                <w:sz w:val="24"/>
+                <w:szCs w:val="24"/>
+              </w:rPr>
+            </w:pPr>
+          </w:p>
+          <w:p>
+            <w:pPr>
+              <w:jc w:val="both"/>
+              <w:rPr>
+                <w:rFonts w:ascii="Calibri" w:eastAsia="Calibri" w:hAnsi="Calibri" w:cs="Calibri"/>
+                <w:color w:val="16191F"/>
+                <w:sz w:val="24"/>
+                <w:szCs w:val="24"/>
+              </w:rPr>
+            </w:pPr>
+            <w:r>
+              <w:rPr>
+                <w:rFonts w:ascii="Calibri" w:eastAsia="Calibri" w:hAnsi="Calibri" w:cs="Calibri"/>
+                <w:color w:val="16191F"/>
+                <w:sz w:val="24"/>
+                <w:szCs w:val="24"/>
+              </w:rPr>
+              <w:t xml:space="preserve">copy </w:t>
+            </w:r>
+            <w:proofErr w:type="gramStart"/>
+            <w:r>
+              <w:rPr>
+                <w:rFonts w:ascii="Calibri" w:eastAsia="Calibri" w:hAnsi="Calibri" w:cs="Calibri"/>
+                <w:color w:val="16191F"/>
+                <w:sz w:val="24"/>
+                <w:szCs w:val="24"/>
+              </w:rPr>
+              <w:t>test.event</w:t>
+            </w:r>
+            <w:proofErr w:type="gramEnd"/>
+          </w:p>
+          <w:p>
+            <w:pPr>
+              <w:jc w:val="both"/>
+              <w:rPr>
+                <w:rFonts w:ascii="Calibri" w:eastAsia="Calibri" w:hAnsi="Calibri" w:cs="Calibri"/>
+                <w:color w:val="16191F"/>
+                <w:sz w:val="24"/>
+                <w:szCs w:val="24"/>
+              </w:rPr>
+            </w:pPr>
+            <w:r>
+              <w:rPr>
+                <w:rFonts w:ascii="Calibri" w:eastAsia="Calibri" w:hAnsi="Calibri" w:cs="Calibri"/>
+                <w:color w:val="16191F"/>
+                <w:sz w:val="24"/>
+                <w:szCs w:val="24"/>
+              </w:rPr>
+              <w:t xml:space="preserve">from 's3://bootcamp-bucket/data/allevents_pipe.txt' </w:t>
+            </w:r>
+          </w:p>
+          <w:p>
+            <w:pPr>
+              <w:jc w:val="both"/>
+              <w:rPr>
+                <w:rFonts w:ascii="Calibri" w:eastAsia="Calibri" w:hAnsi="Calibri" w:cs="Calibri"/>
+                <w:color w:val="16191F"/>
+                <w:sz w:val="24"/>
+                <w:szCs w:val="24"/>
+              </w:rPr>
+            </w:pPr>
+            <w:r>
+              <w:rPr>
+                <w:rFonts w:ascii="Calibri" w:eastAsia="Calibri" w:hAnsi="Calibri" w:cs="Calibri"/>
+                <w:color w:val="16191F"/>
+                <w:sz w:val="24"/>
+                <w:szCs w:val="24"/>
+              </w:rPr>
+              <w:t>iam_role '</w:t>
+            </w:r>
+            <w:proofErr w:type="gramStart"/>
+            <w:r>
+              <w:rPr>
+                <w:rFonts w:ascii="Calibri" w:eastAsia="Calibri" w:hAnsi="Calibri" w:cs="Calibri"/>
+                <w:color w:val="16191F"/>
+                <w:sz w:val="24"/>
+                <w:szCs w:val="24"/>
+              </w:rPr>
+              <w:t>arn:aws</w:t>
+            </w:r>
+            <w:proofErr w:type="gramEnd"/>
+            <w:r>
+              <w:rPr>
+                <w:rFonts w:ascii="Calibri" w:eastAsia="Calibri" w:hAnsi="Calibri" w:cs="Calibri"/>
+                <w:color w:val="16191F"/>
+                <w:sz w:val="24"/>
+                <w:szCs w:val="24"/>
+              </w:rPr>
+              <w:t>:</w:t>
+            </w:r>
+            <w:proofErr w:type="gramStart"/>
+            <w:r>
+              <w:rPr>
+                <w:rFonts w:ascii="Calibri" w:eastAsia="Calibri" w:hAnsi="Calibri" w:cs="Calibri"/>
+                <w:color w:val="16191F"/>
+                <w:sz w:val="24"/>
+                <w:szCs w:val="24"/>
+              </w:rPr>
+              <w:t>iam::111081800296:role</w:t>
+            </w:r>
+            <w:proofErr w:type="gramEnd"/>
+            <w:r>
+              <w:rPr>
+                <w:rFonts w:ascii="Calibri" w:eastAsia="Calibri" w:hAnsi="Calibri" w:cs="Calibri"/>
+                <w:color w:val="16191F"/>
+                <w:sz w:val="24"/>
+                <w:szCs w:val="24"/>
+              </w:rPr>
+              <w:t>/Redshift_admin'</w:t>
+            </w:r>
+          </w:p>
+          <w:p>
+            <w:pPr>
+              <w:jc w:val="both"/>
+              <w:rPr>
+                <w:rFonts w:ascii="Calibri" w:eastAsia="Calibri" w:hAnsi="Calibri" w:cs="Calibri"/>
+                <w:color w:val="16191F"/>
+                <w:sz w:val="24"/>
+                <w:szCs w:val="24"/>
+              </w:rPr>
+            </w:pPr>
+            <w:r>
+              <w:rPr>
+                <w:rFonts w:ascii="Calibri" w:eastAsia="Calibri" w:hAnsi="Calibri" w:cs="Calibri"/>
+                <w:color w:val="16191F"/>
+                <w:sz w:val="24"/>
+                <w:szCs w:val="24"/>
+              </w:rPr>
+              <w:t>removequotes</w:t>
+            </w:r>
+          </w:p>
+          <w:p>
+            <w:pPr>
+              <w:jc w:val="both"/>
+              <w:rPr>
+                <w:rFonts w:ascii="Calibri" w:eastAsia="Calibri" w:hAnsi="Calibri" w:cs="Calibri"/>
+                <w:color w:val="16191F"/>
+                <w:sz w:val="24"/>
+                <w:szCs w:val="24"/>
+              </w:rPr>
+            </w:pPr>
+            <w:r>
+              <w:rPr>
+                <w:rFonts w:ascii="Calibri" w:eastAsia="Calibri" w:hAnsi="Calibri" w:cs="Calibri"/>
+                <w:color w:val="16191F"/>
+                <w:sz w:val="24"/>
+                <w:szCs w:val="24"/>
+              </w:rPr>
+              <w:t>emptyasnull</w:t>
+            </w:r>
+          </w:p>
+          <w:p>
+            <w:pPr>
+              <w:jc w:val="both"/>
+              <w:rPr>
+                <w:rFonts w:ascii="Calibri" w:eastAsia="Calibri" w:hAnsi="Calibri" w:cs="Calibri"/>
+                <w:color w:val="16191F"/>
+                <w:sz w:val="24"/>
+                <w:szCs w:val="24"/>
+              </w:rPr>
+            </w:pPr>
+            <w:r>
+              <w:rPr>
+                <w:rFonts w:ascii="Calibri" w:eastAsia="Calibri" w:hAnsi="Calibri" w:cs="Calibri"/>
+                <w:color w:val="16191F"/>
+                <w:sz w:val="24"/>
+                <w:szCs w:val="24"/>
+              </w:rPr>
+              <w:t>blanksasnull</w:t>
+            </w:r>
+          </w:p>
+          <w:p>
+            <w:pPr>
+              <w:jc w:val="both"/>
+              <w:rPr>
+                <w:rFonts w:ascii="Calibri" w:eastAsia="Calibri" w:hAnsi="Calibri" w:cs="Calibri"/>
+                <w:color w:val="16191F"/>
+                <w:sz w:val="24"/>
+                <w:szCs w:val="24"/>
+              </w:rPr>
+            </w:pPr>
+            <w:r>
+              <w:rPr>
+                <w:rFonts w:ascii="Calibri" w:eastAsia="Calibri" w:hAnsi="Calibri" w:cs="Calibri"/>
+                <w:color w:val="16191F"/>
+                <w:sz w:val="24"/>
+                <w:szCs w:val="24"/>
+              </w:rPr>
+              <w:t>maxerror 5</w:t>
+            </w:r>
+          </w:p>
+          <w:p>
+            <w:pPr>
+              <w:jc w:val="both"/>
+              <w:rPr>
+                <w:rFonts w:ascii="Calibri" w:eastAsia="Calibri" w:hAnsi="Calibri" w:cs="Calibri"/>
+                <w:color w:val="16191F"/>
+                <w:sz w:val="24"/>
+                <w:szCs w:val="24"/>
+              </w:rPr>
+            </w:pPr>
+            <w:r>
+              <w:rPr>
+                <w:rFonts w:ascii="Calibri" w:eastAsia="Calibri" w:hAnsi="Calibri" w:cs="Calibri"/>
+                <w:color w:val="16191F"/>
+                <w:sz w:val="24"/>
+                <w:szCs w:val="24"/>
+              </w:rPr>
+              <w:t>delimiter '|'</w:t>
+            </w:r>
+          </w:p>
+          <w:p>
+            <w:pPr>
+              <w:jc w:val="both"/>
+              <w:rPr>
+                <w:rFonts w:ascii="Calibri" w:eastAsia="Calibri" w:hAnsi="Calibri" w:cs="Calibri"/>
+                <w:color w:val="16191F"/>
+                <w:sz w:val="24"/>
+                <w:szCs w:val="24"/>
+              </w:rPr>
+            </w:pPr>
+            <w:r>
+              <w:rPr>
+                <w:rFonts w:ascii="Calibri" w:eastAsia="Calibri" w:hAnsi="Calibri" w:cs="Calibri"/>
+                <w:color w:val="16191F"/>
+                <w:sz w:val="24"/>
+                <w:szCs w:val="24"/>
+              </w:rPr>
+              <w:t>timeformat 'YYYY-MM-DD HH:</w:t>
+            </w:r>
+            <w:proofErr w:type="gramStart"/>
+            <w:r>
+              <w:rPr>
+                <w:rFonts w:ascii="Calibri" w:eastAsia="Calibri" w:hAnsi="Calibri" w:cs="Calibri"/>
+                <w:color w:val="16191F"/>
+                <w:sz w:val="24"/>
+                <w:szCs w:val="24"/>
+              </w:rPr>
+              <w:t>MI:SS</w:t>
+            </w:r>
+            <w:proofErr w:type="gramEnd"/>
+            <w:r>
+              <w:rPr>
+                <w:rFonts w:ascii="Calibri" w:eastAsia="Calibri" w:hAnsi="Calibri" w:cs="Calibri"/>
+                <w:color w:val="16191F"/>
+                <w:sz w:val="24"/>
+                <w:szCs w:val="24"/>
+              </w:rPr>
+              <w:t>';</w:t>
+            </w:r>
+          </w:p>
+          <w:p>
+            <w:pPr>
+              <w:widowControl w:val="0"/>
+              <w:pBdr>
+                <w:top w:val="nil"/>
+                <w:left w:val="nil"/>
+                <w:bottom w:val="nil"/>
+                <w:right w:val="nil"/>
+                <w:between w:val="nil"/>
+              </w:pBdr>
+              <w:spacing w:line="240" w:lineRule="auto"/>
+              <w:jc w:val="both"/>
+              <w:rPr>
+                <w:rFonts w:ascii="Calibri" w:eastAsia="Calibri" w:hAnsi="Calibri" w:cs="Calibri"/>
+                <w:color w:val="16191F"/>
+                <w:sz w:val="24"/>
+                <w:szCs w:val="24"/>
+              </w:rPr>
+            </w:pPr>
+          </w:p>
+        </w:tc>
+      </w:tr>
+    </w:tbl>
+    <w:p>
+      <w:pPr>
+        <w:jc w:val="both"/>
+        <w:rPr>
+          <w:rFonts w:ascii="Calibri" w:eastAsia="Calibri" w:hAnsi="Calibri" w:cs="Calibri"/>
+          <w:color w:val="16191F"/>
+          <w:sz w:val="24"/>
+          <w:szCs w:val="24"/>
+        </w:rPr>
+      </w:pPr>
+    </w:p>
+    <w:p>
+      <w:pPr>
+        <w:jc w:val="both"/>
+        <w:rPr>
+          <w:rFonts w:ascii="Calibri" w:eastAsia="Calibri" w:hAnsi="Calibri" w:cs="Calibri"/>
+          <w:color w:val="16191F"/>
+          <w:sz w:val="24"/>
+          <w:szCs w:val="24"/>
+        </w:rPr>
+      </w:pPr>
+    </w:p>
+    <w:p>
+      <w:pPr>
+        <w:pStyle w:val="Heading2"/>
+        <w:keepNext w:val="0"/>
+        <w:keepLines w:val="0"/>
+        <w:pBdr>
+          <w:top w:val="none" w:sz="0" w:space="17" w:color="auto"/>
+        </w:pBdr>
+        <w:shd w:val="clear" w:color="auto" w:fill="FFFFFF"/>
+        <w:spacing w:before="560" w:after="420" w:line="294" w:lineRule="auto"/>
+        <w:jc w:val="both"/>
+        <w:rPr>
+          <w:rFonts w:ascii="Calibri" w:eastAsia="Calibri" w:hAnsi="Calibri" w:cs="Calibri"/>
+          <w:b/>
+          <w:color w:val="16191F"/>
+          <w:sz w:val="24"/>
+          <w:szCs w:val="24"/>
+        </w:rPr>
+      </w:pPr>
+      <w:bookmarkStart w:id="2" w:name="_gazjxssrs60w" w:colFirst="0" w:colLast="0"/>
+      <w:bookmarkEnd w:id="2"/>
+      <w:r>
+        <w:rPr>
+          <w:rFonts w:ascii="Calibri" w:eastAsia="Calibri" w:hAnsi="Calibri" w:cs="Calibri"/>
+          <w:b/>
+          <w:color w:val="16191F"/>
+          <w:sz w:val="24"/>
+          <w:szCs w:val="24"/>
+        </w:rPr>
+        <w:t>Load data from a file with default values</w:t>
+      </w:r>
+    </w:p>
+    <w:p>
+      <w:pPr>
+        <w:jc w:val="both"/>
+        <w:rPr>
+          <w:b/>
+          <w:color w:val="16191F"/>
+          <w:sz w:val="24"/>
+          <w:szCs w:val="24"/>
+        </w:rPr>
+      </w:pPr>
+      <w:r>
+        <w:rPr>
+          <w:rFonts w:ascii="Calibri" w:eastAsia="Calibri" w:hAnsi="Calibri" w:cs="Calibri"/>
+          <w:b/>
+          <w:color w:val="16191F"/>
+          <w:sz w:val="24"/>
+          <w:szCs w:val="24"/>
+        </w:rPr>
+        <w:lastRenderedPageBreak/>
+        <w:t>venue_noseats.txt</w:t>
+      </w:r>
+    </w:p>
+    <w:p>
+      <w:pPr>
+        <w:rPr>
+          <w:color w:val="16191F"/>
+          <w:sz w:val="24"/>
+          <w:szCs w:val="24"/>
+        </w:rPr>
+      </w:pPr>
+    </w:p>
+    <w:tbl>
+      <w:tblPr>
+        <w:tblW w:w="9029" w:type="dxa"/>
+        <w:tblBorders>
+          <w:top w:val="single" w:sz="8" w:space="0" w:color="000000"/>
+          <w:left w:val="single" w:sz="8" w:space="0" w:color="000000"/>
+          <w:bottom w:val="single" w:sz="8" w:space="0" w:color="000000"/>
+          <w:right w:val="single" w:sz="8" w:space="0" w:color="000000"/>
+          <w:insideH w:val="single" w:sz="8" w:space="0" w:color="000000"/>
+          <w:insideV w:val="single" w:sz="8" w:space="0" w:color="000000"/>
+        </w:tblBorders>
+        <w:tblLayout w:type="fixed"/>
+        <w:tblLook w:val="0600" w:firstRow="0" w:lastRow="0" w:firstColumn="0" w:lastColumn="0" w:noHBand="1" w:noVBand="1"/>
+      </w:tblPr>
+      <w:tblGrid>
+        <w:gridCol w:w="9029"/>
+      </w:tblGrid>
+      <w:tr>
+        <w:tc>
+          <w:tcPr>
+            <w:tcW w:w="9029" w:type="dxa"/>
+            <w:tcMar>
+              <w:top w:w="100" w:type="dxa"/>
+              <w:left w:w="100" w:type="dxa"/>
+              <w:bottom w:w="100" w:type="dxa"/>
+              <w:right w:w="100" w:type="dxa"/>
+            </w:tcMar>
+          </w:tcPr>
+          <w:p>
+            <w:pPr>
+              <w:widowControl w:val="0"/>
+              <w:pBdr>
+                <w:top w:val="nil"/>
+                <w:left w:val="nil"/>
+                <w:bottom w:val="nil"/>
+                <w:right w:val="nil"/>
+                <w:between w:val="nil"/>
+              </w:pBdr>
+              <w:spacing w:line="240" w:lineRule="auto"/>
+              <w:rPr>
+                <w:color w:val="16191F"/>
+                <w:sz w:val="24"/>
+                <w:szCs w:val="24"/>
+              </w:rPr>
+            </w:pPr>
+            <w:r>
+              <w:rPr>
+                <w:color w:val="16191F"/>
+                <w:sz w:val="24"/>
+                <w:szCs w:val="24"/>
+              </w:rPr>
+              <w:t>1|Toyota Park|Bridgeview|IL|</w:t>
+            </w:r>
+          </w:p>
+          <w:p>
+            <w:pPr>
+              <w:widowControl w:val="0"/>
+              <w:pBdr>
+                <w:top w:val="nil"/>
+                <w:left w:val="nil"/>
+                <w:bottom w:val="nil"/>
+                <w:right w:val="nil"/>
+                <w:between w:val="nil"/>
+              </w:pBdr>
+              <w:spacing w:line="240" w:lineRule="auto"/>
+              <w:rPr>
+                <w:color w:val="16191F"/>
+                <w:sz w:val="24"/>
+                <w:szCs w:val="24"/>
+              </w:rPr>
+            </w:pPr>
+            <w:r>
+              <w:rPr>
+                <w:color w:val="16191F"/>
+                <w:sz w:val="24"/>
+                <w:szCs w:val="24"/>
+              </w:rPr>
+              <w:t>2|Columbus Crew Stadium|Columbus|OH|</w:t>
+            </w:r>
+          </w:p>
+          <w:p>
+            <w:pPr>
+              <w:widowControl w:val="0"/>
+              <w:pBdr>
+                <w:top w:val="nil"/>
+                <w:left w:val="nil"/>
+                <w:bottom w:val="nil"/>
+                <w:right w:val="nil"/>
+                <w:between w:val="nil"/>
+              </w:pBdr>
+              <w:spacing w:line="240" w:lineRule="auto"/>
+              <w:rPr>
+                <w:color w:val="16191F"/>
+                <w:sz w:val="24"/>
+                <w:szCs w:val="24"/>
+              </w:rPr>
+            </w:pPr>
+            <w:r>
+              <w:rPr>
+                <w:color w:val="16191F"/>
+                <w:sz w:val="24"/>
+                <w:szCs w:val="24"/>
+              </w:rPr>
+              <w:t>3|RFK Stadium|Washington|DC|</w:t>
+            </w:r>
+          </w:p>
+          <w:p>
+            <w:pPr>
+              <w:widowControl w:val="0"/>
+              <w:pBdr>
+                <w:top w:val="nil"/>
+                <w:left w:val="nil"/>
+                <w:bottom w:val="nil"/>
+                <w:right w:val="nil"/>
+                <w:between w:val="nil"/>
+              </w:pBdr>
+              <w:spacing w:line="240" w:lineRule="auto"/>
+              <w:rPr>
+                <w:color w:val="16191F"/>
+                <w:sz w:val="24"/>
+                <w:szCs w:val="24"/>
+              </w:rPr>
+            </w:pPr>
+            <w:r>
+              <w:rPr>
+                <w:color w:val="16191F"/>
+                <w:sz w:val="24"/>
+                <w:szCs w:val="24"/>
+              </w:rPr>
+              <w:t>4|CommunityAmerica Ballpark|Kansas City|KS|</w:t>
+            </w:r>
+          </w:p>
+          <w:p>
+            <w:pPr>
+              <w:widowControl w:val="0"/>
+              <w:pBdr>
+                <w:top w:val="nil"/>
+                <w:left w:val="nil"/>
+                <w:bottom w:val="nil"/>
+                <w:right w:val="nil"/>
+                <w:between w:val="nil"/>
+              </w:pBdr>
+              <w:spacing w:line="240" w:lineRule="auto"/>
+              <w:rPr>
+                <w:color w:val="16191F"/>
+                <w:sz w:val="24"/>
+                <w:szCs w:val="24"/>
+              </w:rPr>
+            </w:pPr>
+            <w:r>
+              <w:rPr>
+                <w:color w:val="16191F"/>
+                <w:sz w:val="24"/>
+                <w:szCs w:val="24"/>
+              </w:rPr>
+              <w:t>5|Gillette Stadium|Foxborough|MA|</w:t>
+            </w:r>
+          </w:p>
+          <w:p>
+            <w:pPr>
+              <w:widowControl w:val="0"/>
+              <w:pBdr>
+                <w:top w:val="nil"/>
+                <w:left w:val="nil"/>
+                <w:bottom w:val="nil"/>
+                <w:right w:val="nil"/>
+                <w:between w:val="nil"/>
+              </w:pBdr>
+              <w:spacing w:line="240" w:lineRule="auto"/>
+              <w:rPr>
+                <w:color w:val="16191F"/>
+                <w:sz w:val="24"/>
+                <w:szCs w:val="24"/>
+              </w:rPr>
+            </w:pPr>
+            <w:r>
+              <w:rPr>
+                <w:color w:val="16191F"/>
+                <w:sz w:val="24"/>
+                <w:szCs w:val="24"/>
+              </w:rPr>
+              <w:t>6|New York Giants Stadium|East Rutherford|NJ|</w:t>
+            </w:r>
+          </w:p>
+          <w:p>
+            <w:pPr>
+              <w:widowControl w:val="0"/>
+              <w:pBdr>
+                <w:top w:val="nil"/>
+                <w:left w:val="nil"/>
+                <w:bottom w:val="nil"/>
+                <w:right w:val="nil"/>
+                <w:between w:val="nil"/>
+              </w:pBdr>
+              <w:spacing w:line="240" w:lineRule="auto"/>
+              <w:rPr>
+                <w:color w:val="16191F"/>
+                <w:sz w:val="24"/>
+                <w:szCs w:val="24"/>
+              </w:rPr>
+            </w:pPr>
+            <w:r>
+              <w:rPr>
+                <w:color w:val="16191F"/>
+                <w:sz w:val="24"/>
+                <w:szCs w:val="24"/>
+              </w:rPr>
+              <w:t>7|BMO Field|Toronto|ON|</w:t>
+            </w:r>
+          </w:p>
+          <w:p>
+            <w:pPr>
+              <w:widowControl w:val="0"/>
+              <w:pBdr>
+                <w:top w:val="nil"/>
+                <w:left w:val="nil"/>
+                <w:bottom w:val="nil"/>
+                <w:right w:val="nil"/>
+                <w:between w:val="nil"/>
+              </w:pBdr>
+              <w:spacing w:line="240" w:lineRule="auto"/>
+              <w:rPr>
+                <w:color w:val="16191F"/>
+                <w:sz w:val="24"/>
+                <w:szCs w:val="24"/>
+              </w:rPr>
+            </w:pPr>
+            <w:r>
+              <w:rPr>
+                <w:color w:val="16191F"/>
+                <w:sz w:val="24"/>
+                <w:szCs w:val="24"/>
+              </w:rPr>
+              <w:t>8|The Home Depot Center|Carson|CA|</w:t>
+            </w:r>
+          </w:p>
+          <w:p>
+            <w:pPr>
+              <w:widowControl w:val="0"/>
+              <w:pBdr>
+                <w:top w:val="nil"/>
+                <w:left w:val="nil"/>
+                <w:bottom w:val="nil"/>
+                <w:right w:val="nil"/>
+                <w:between w:val="nil"/>
+              </w:pBdr>
+              <w:spacing w:line="240" w:lineRule="auto"/>
+              <w:rPr>
+                <w:color w:val="16191F"/>
+                <w:sz w:val="24"/>
+                <w:szCs w:val="24"/>
+              </w:rPr>
+            </w:pPr>
+            <w:r>
+              <w:rPr>
+                <w:color w:val="16191F"/>
+                <w:sz w:val="24"/>
+                <w:szCs w:val="24"/>
+              </w:rPr>
+              <w:t>9|Dick's Sporting Goods Park|Commerce City|CO|</w:t>
+            </w:r>
+          </w:p>
+          <w:p>
+            <w:pPr>
+              <w:widowControl w:val="0"/>
+              <w:pBdr>
+                <w:top w:val="nil"/>
+                <w:left w:val="nil"/>
+                <w:bottom w:val="nil"/>
+                <w:right w:val="nil"/>
+                <w:between w:val="nil"/>
+              </w:pBdr>
+              <w:spacing w:line="240" w:lineRule="auto"/>
+              <w:rPr>
+                <w:color w:val="16191F"/>
+                <w:sz w:val="24"/>
+                <w:szCs w:val="24"/>
+              </w:rPr>
+            </w:pPr>
+            <w:r>
+              <w:rPr>
+                <w:color w:val="16191F"/>
+                <w:sz w:val="24"/>
+                <w:szCs w:val="24"/>
+              </w:rPr>
+              <w:t>10|Pizza Hut Park|Frisco|TX|</w:t>
+            </w:r>
+          </w:p>
+          <w:p>
+            <w:pPr>
+              <w:widowControl w:val="0"/>
+              <w:pBdr>
+                <w:top w:val="nil"/>
+                <w:left w:val="nil"/>
+                <w:bottom w:val="nil"/>
+                <w:right w:val="nil"/>
+                <w:between w:val="nil"/>
+              </w:pBdr>
+              <w:spacing w:line="240" w:lineRule="auto"/>
+              <w:rPr>
+                <w:color w:val="16191F"/>
+                <w:sz w:val="24"/>
+                <w:szCs w:val="24"/>
+              </w:rPr>
+            </w:pPr>
+          </w:p>
+        </w:tc>
+      </w:tr>
+    </w:tbl>
+    <w:p>
+      <w:pPr>
+        <w:rPr>
+          <w:color w:val="16191F"/>
+          <w:sz w:val="24"/>
+          <w:szCs w:val="24"/>
+        </w:rPr>
+      </w:pPr>
+    </w:p>
+    <w:p>
+      <w:pPr>
+        <w:jc w:val="both"/>
+        <w:rPr>
+          <w:rFonts w:ascii="Calibri" w:eastAsia="Calibri" w:hAnsi="Calibri" w:cs="Calibri"/>
+          <w:color w:val="16191F"/>
+          <w:sz w:val="24"/>
+          <w:szCs w:val="24"/>
+        </w:rPr>
+      </w:pPr>
+    </w:p>
+    <w:p>
+      <w:pPr>
+        <w:jc w:val="both"/>
+        <w:rPr>
+          <w:rFonts w:ascii="Calibri" w:eastAsia="Calibri" w:hAnsi="Calibri" w:cs="Calibri"/>
+          <w:color w:val="16191F"/>
+          <w:sz w:val="24"/>
+          <w:szCs w:val="24"/>
+        </w:rPr>
+      </w:pPr>
+    </w:p>
+    <w:p>
+      <w:pPr>
+        <w:jc w:val="both"/>
+        <w:rPr>
+          <w:rFonts w:ascii="Calibri" w:eastAsia="Calibri" w:hAnsi="Calibri" w:cs="Calibri"/>
+          <w:color w:val="16191F"/>
+          <w:sz w:val="24"/>
+          <w:szCs w:val="24"/>
+        </w:rPr>
+      </w:pPr>
+    </w:p>
+    <w:p>
+      <w:pPr>
+        <w:jc w:val="both"/>
+        <w:rPr>
+          <w:rFonts w:ascii="Calibri" w:eastAsia="Calibri" w:hAnsi="Calibri" w:cs="Calibri"/>
+          <w:color w:val="16191F"/>
+          <w:sz w:val="24"/>
+          <w:szCs w:val="24"/>
+        </w:rPr>
+      </w:pPr>
+    </w:p>
+    <w:p>
+      <w:pPr>
+        <w:jc w:val="both"/>
+        <w:rPr>
+          <w:rFonts w:ascii="Calibri" w:eastAsia="Calibri" w:hAnsi="Calibri" w:cs="Calibri"/>
+          <w:color w:val="16191F"/>
+          <w:sz w:val="24"/>
+          <w:szCs w:val="24"/>
+        </w:rPr>
+      </w:pPr>
+    </w:p>
+    <w:p>
+      <w:pPr>
+        <w:jc w:val="both"/>
+        <w:rPr>
+          <w:rFonts w:ascii="Calibri" w:eastAsia="Calibri" w:hAnsi="Calibri" w:cs="Calibri"/>
+          <w:color w:val="16191F"/>
+          <w:sz w:val="24"/>
+          <w:szCs w:val="24"/>
+        </w:rPr>
+      </w:pPr>
+    </w:p>
+    <w:tbl>
+      <w:tblPr>
+        <w:tblW w:w="9029" w:type="dxa"/>
+        <w:tblBorders>
+          <w:top w:val="single" w:sz="8" w:space="0" w:color="000000"/>
+          <w:left w:val="single" w:sz="8" w:space="0" w:color="000000"/>
+          <w:bottom w:val="single" w:sz="8" w:space="0" w:color="000000"/>
+          <w:right w:val="single" w:sz="8" w:space="0" w:color="000000"/>
+          <w:insideH w:val="single" w:sz="8" w:space="0" w:color="000000"/>
+          <w:insideV w:val="single" w:sz="8" w:space="0" w:color="000000"/>
+        </w:tblBorders>
+        <w:tblLayout w:type="fixed"/>
+        <w:tblLook w:val="0600" w:firstRow="0" w:lastRow="0" w:firstColumn="0" w:lastColumn="0" w:noHBand="1" w:noVBand="1"/>
+      </w:tblPr>
+      <w:tblGrid>
+        <w:gridCol w:w="9029"/>
+      </w:tblGrid>
+      <w:tr>
+        <w:tc>
+          <w:tcPr>
+            <w:tcW w:w="9029" w:type="dxa"/>
+            <w:tcMar>
+              <w:top w:w="100" w:type="dxa"/>
+              <w:left w:w="100" w:type="dxa"/>
+              <w:bottom w:w="100" w:type="dxa"/>
+              <w:right w:w="100" w:type="dxa"/>
+            </w:tcMar>
+          </w:tcPr>
+          <w:p>
+            <w:pPr>
+              <w:jc w:val="both"/>
+              <w:rPr>
+                <w:rFonts w:ascii="Calibri" w:eastAsia="Calibri" w:hAnsi="Calibri" w:cs="Calibri"/>
+                <w:color w:val="16191F"/>
+                <w:sz w:val="24"/>
+                <w:szCs w:val="24"/>
+              </w:rPr>
+            </w:pPr>
+            <w:r>
+              <w:rPr>
+                <w:rFonts w:ascii="Calibri" w:eastAsia="Calibri" w:hAnsi="Calibri" w:cs="Calibri"/>
+                <w:color w:val="16191F"/>
+                <w:sz w:val="24"/>
+                <w:szCs w:val="24"/>
+              </w:rPr>
+              <w:t xml:space="preserve">create table </w:t>
+            </w:r>
+            <w:proofErr w:type="gramStart"/>
+            <w:r>
+              <w:rPr>
+                <w:rFonts w:ascii="Calibri" w:eastAsia="Calibri" w:hAnsi="Calibri" w:cs="Calibri"/>
+                <w:color w:val="16191F"/>
+                <w:sz w:val="24"/>
+                <w:szCs w:val="24"/>
+              </w:rPr>
+              <w:t>test.venue</w:t>
+            </w:r>
+            <w:proofErr w:type="gramEnd"/>
+            <w:r>
+              <w:rPr>
+                <w:rFonts w:ascii="Calibri" w:eastAsia="Calibri" w:hAnsi="Calibri" w:cs="Calibri"/>
+                <w:color w:val="16191F"/>
+                <w:sz w:val="24"/>
+                <w:szCs w:val="24"/>
+              </w:rPr>
+              <w:t>_</w:t>
+            </w:r>
+            <w:proofErr w:type="gramStart"/>
+            <w:r>
+              <w:rPr>
+                <w:rFonts w:ascii="Calibri" w:eastAsia="Calibri" w:hAnsi="Calibri" w:cs="Calibri"/>
+                <w:color w:val="16191F"/>
+                <w:sz w:val="24"/>
+                <w:szCs w:val="24"/>
+              </w:rPr>
+              <w:t>new(</w:t>
+            </w:r>
+            <w:proofErr w:type="gramEnd"/>
+          </w:p>
+          <w:p>
+            <w:pPr>
+              <w:jc w:val="both"/>
+              <w:rPr>
+                <w:rFonts w:ascii="Calibri" w:eastAsia="Calibri" w:hAnsi="Calibri" w:cs="Calibri"/>
+                <w:color w:val="16191F"/>
+                <w:sz w:val="24"/>
+                <w:szCs w:val="24"/>
+              </w:rPr>
+            </w:pPr>
+            <w:r>
+              <w:rPr>
+                <w:rFonts w:ascii="Calibri" w:eastAsia="Calibri" w:hAnsi="Calibri" w:cs="Calibri"/>
+                <w:color w:val="16191F"/>
+                <w:sz w:val="24"/>
+                <w:szCs w:val="24"/>
+              </w:rPr>
+              <w:t>venueid smallint not null,</w:t>
+            </w:r>
+          </w:p>
+          <w:p>
+            <w:pPr>
+              <w:jc w:val="both"/>
+              <w:rPr>
+                <w:rFonts w:ascii="Calibri" w:eastAsia="Calibri" w:hAnsi="Calibri" w:cs="Calibri"/>
+                <w:color w:val="16191F"/>
+                <w:sz w:val="24"/>
+                <w:szCs w:val="24"/>
+              </w:rPr>
+            </w:pPr>
+            <w:r>
+              <w:rPr>
+                <w:rFonts w:ascii="Calibri" w:eastAsia="Calibri" w:hAnsi="Calibri" w:cs="Calibri"/>
+                <w:color w:val="16191F"/>
+                <w:sz w:val="24"/>
+                <w:szCs w:val="24"/>
+              </w:rPr>
+              <w:t xml:space="preserve">venuename </w:t>
+            </w:r>
+            <w:proofErr w:type="gramStart"/>
+            <w:r>
+              <w:rPr>
+                <w:rFonts w:ascii="Calibri" w:eastAsia="Calibri" w:hAnsi="Calibri" w:cs="Calibri"/>
+                <w:color w:val="16191F"/>
+                <w:sz w:val="24"/>
+                <w:szCs w:val="24"/>
+              </w:rPr>
+              <w:t>varchar(</w:t>
+            </w:r>
+            <w:proofErr w:type="gramEnd"/>
+            <w:r>
+              <w:rPr>
+                <w:rFonts w:ascii="Calibri" w:eastAsia="Calibri" w:hAnsi="Calibri" w:cs="Calibri"/>
+                <w:color w:val="16191F"/>
+                <w:sz w:val="24"/>
+                <w:szCs w:val="24"/>
+              </w:rPr>
+              <w:t>100) not null,</w:t>
+            </w:r>
+          </w:p>
+          <w:p>
+            <w:pPr>
+              <w:jc w:val="both"/>
+              <w:rPr>
+                <w:rFonts w:ascii="Calibri" w:eastAsia="Calibri" w:hAnsi="Calibri" w:cs="Calibri"/>
+                <w:color w:val="16191F"/>
+                <w:sz w:val="24"/>
+                <w:szCs w:val="24"/>
+              </w:rPr>
+            </w:pPr>
+            <w:r>
+              <w:rPr>
+                <w:rFonts w:ascii="Calibri" w:eastAsia="Calibri" w:hAnsi="Calibri" w:cs="Calibri"/>
+                <w:color w:val="16191F"/>
+                <w:sz w:val="24"/>
+                <w:szCs w:val="24"/>
+              </w:rPr>
+              <w:t xml:space="preserve">venuecity </w:t>
+            </w:r>
+            <w:proofErr w:type="gramStart"/>
+            <w:r>
+              <w:rPr>
+                <w:rFonts w:ascii="Calibri" w:eastAsia="Calibri" w:hAnsi="Calibri" w:cs="Calibri"/>
+                <w:color w:val="16191F"/>
+                <w:sz w:val="24"/>
+                <w:szCs w:val="24"/>
+              </w:rPr>
+              <w:t>varchar(</w:t>
+            </w:r>
+            <w:proofErr w:type="gramEnd"/>
+            <w:r>
+              <w:rPr>
+                <w:rFonts w:ascii="Calibri" w:eastAsia="Calibri" w:hAnsi="Calibri" w:cs="Calibri"/>
+                <w:color w:val="16191F"/>
+                <w:sz w:val="24"/>
+                <w:szCs w:val="24"/>
+              </w:rPr>
+              <w:t>30),</w:t>
+            </w:r>
+          </w:p>
+          <w:p>
+            <w:pPr>
+              <w:jc w:val="both"/>
+              <w:rPr>
+                <w:rFonts w:ascii="Calibri" w:eastAsia="Calibri" w:hAnsi="Calibri" w:cs="Calibri"/>
+                <w:color w:val="16191F"/>
+                <w:sz w:val="24"/>
+                <w:szCs w:val="24"/>
+              </w:rPr>
+            </w:pPr>
+            <w:r>
+              <w:rPr>
+                <w:rFonts w:ascii="Calibri" w:eastAsia="Calibri" w:hAnsi="Calibri" w:cs="Calibri"/>
+                <w:color w:val="16191F"/>
+                <w:sz w:val="24"/>
+                <w:szCs w:val="24"/>
+              </w:rPr>
+              <w:t xml:space="preserve">venuestate </w:t>
+            </w:r>
+            <w:proofErr w:type="gramStart"/>
+            <w:r>
+              <w:rPr>
+                <w:rFonts w:ascii="Calibri" w:eastAsia="Calibri" w:hAnsi="Calibri" w:cs="Calibri"/>
+                <w:color w:val="16191F"/>
+                <w:sz w:val="24"/>
+                <w:szCs w:val="24"/>
+              </w:rPr>
+              <w:t>char(</w:t>
+            </w:r>
+            <w:proofErr w:type="gramEnd"/>
+            <w:r>
+              <w:rPr>
+                <w:rFonts w:ascii="Calibri" w:eastAsia="Calibri" w:hAnsi="Calibri" w:cs="Calibri"/>
+                <w:color w:val="16191F"/>
+                <w:sz w:val="24"/>
+                <w:szCs w:val="24"/>
+              </w:rPr>
+              <w:t>2),</w:t>
+            </w:r>
+          </w:p>
+          <w:p>
+            <w:pPr>
+              <w:jc w:val="both"/>
+              <w:rPr>
+                <w:rFonts w:ascii="Calibri" w:eastAsia="Calibri" w:hAnsi="Calibri" w:cs="Calibri"/>
+                <w:color w:val="16191F"/>
+                <w:sz w:val="24"/>
+                <w:szCs w:val="24"/>
+              </w:rPr>
+            </w:pPr>
+            <w:r>
+              <w:rPr>
+                <w:rFonts w:ascii="Calibri" w:eastAsia="Calibri" w:hAnsi="Calibri" w:cs="Calibri"/>
+                <w:color w:val="16191F"/>
+                <w:sz w:val="24"/>
+                <w:szCs w:val="24"/>
+              </w:rPr>
+              <w:t>venueseats integer not null default '1000');</w:t>
+            </w:r>
+          </w:p>
+        </w:tc>
+      </w:tr>
+    </w:tbl>
+    <w:p>
+      <w:pPr>
+        <w:jc w:val="both"/>
+        <w:rPr>
+          <w:rFonts w:ascii="Calibri" w:eastAsia="Calibri" w:hAnsi="Calibri" w:cs="Calibri"/>
+          <w:color w:val="16191F"/>
+          <w:sz w:val="24"/>
+          <w:szCs w:val="24"/>
+        </w:rPr>
+      </w:pPr>
+    </w:p>
+    <w:p>
+      <w:pPr>
+        <w:jc w:val="both"/>
+        <w:rPr>
+          <w:rFonts w:ascii="Calibri" w:eastAsia="Calibri" w:hAnsi="Calibri" w:cs="Calibri"/>
+          <w:color w:val="16191F"/>
+          <w:sz w:val="24"/>
+          <w:szCs w:val="24"/>
+        </w:rPr>
+      </w:pPr>
+    </w:p>
+    <w:tbl>
+      <w:tblPr>
+        <w:tblW w:w="9029" w:type="dxa"/>
+        <w:tblBorders>
+          <w:top w:val="single" w:sz="8" w:space="0" w:color="000000"/>
+          <w:left w:val="single" w:sz="8" w:space="0" w:color="000000"/>
+          <w:bottom w:val="single" w:sz="8" w:space="0" w:color="000000"/>
+          <w:right w:val="single" w:sz="8" w:space="0" w:color="000000"/>
+          <w:insideH w:val="single" w:sz="8" w:space="0" w:color="000000"/>
+          <w:insideV w:val="single" w:sz="8" w:space="0" w:color="000000"/>
+        </w:tblBorders>
+        <w:tblLayout w:type="fixed"/>
+        <w:tblLook w:val="0600" w:firstRow="0" w:lastRow="0" w:firstColumn="0" w:lastColumn="0" w:noHBand="1" w:noVBand="1"/>
+      </w:tblPr>
+      <w:tblGrid>
+        <w:gridCol w:w="9029"/>
+      </w:tblGrid>
+      <w:tr>
+        <w:tc>
+          <w:tcPr>
+            <w:tcW w:w="9029" w:type="dxa"/>
+            <w:tcMar>
+              <w:top w:w="100" w:type="dxa"/>
+              <w:left w:w="100" w:type="dxa"/>
+              <w:bottom w:w="100" w:type="dxa"/>
+              <w:right w:w="100" w:type="dxa"/>
+            </w:tcMar>
+          </w:tcPr>
+          <w:p>
+            <w:pPr>
+              <w:jc w:val="both"/>
+              <w:rPr>
+                <w:rFonts w:ascii="Calibri" w:eastAsia="Calibri" w:hAnsi="Calibri" w:cs="Calibri"/>
+                <w:color w:val="16191F"/>
+                <w:sz w:val="24"/>
+                <w:szCs w:val="24"/>
+              </w:rPr>
+            </w:pPr>
+          </w:p>
+          <w:p>
+            <w:pPr>
+              <w:jc w:val="both"/>
+              <w:rPr>
+                <w:rFonts w:ascii="Calibri" w:eastAsia="Calibri" w:hAnsi="Calibri" w:cs="Calibri"/>
+                <w:color w:val="16191F"/>
+                <w:sz w:val="24"/>
+                <w:szCs w:val="24"/>
+              </w:rPr>
+            </w:pPr>
+            <w:r>
+              <w:rPr>
+                <w:rFonts w:ascii="Calibri" w:eastAsia="Calibri" w:hAnsi="Calibri" w:cs="Calibri"/>
+                <w:color w:val="16191F"/>
+                <w:sz w:val="24"/>
+                <w:szCs w:val="24"/>
+              </w:rPr>
+              <w:t xml:space="preserve">copy </w:t>
+            </w:r>
+            <w:proofErr w:type="gramStart"/>
+            <w:r>
+              <w:rPr>
+                <w:rFonts w:ascii="Calibri" w:eastAsia="Calibri" w:hAnsi="Calibri" w:cs="Calibri"/>
+                <w:color w:val="16191F"/>
+                <w:sz w:val="24"/>
+                <w:szCs w:val="24"/>
+              </w:rPr>
+              <w:t>test.venue</w:t>
+            </w:r>
+            <w:proofErr w:type="gramEnd"/>
+            <w:r>
+              <w:rPr>
+                <w:rFonts w:ascii="Calibri" w:eastAsia="Calibri" w:hAnsi="Calibri" w:cs="Calibri"/>
+                <w:color w:val="16191F"/>
+                <w:sz w:val="24"/>
+                <w:szCs w:val="24"/>
+              </w:rPr>
+              <w:t>_</w:t>
+            </w:r>
+            <w:proofErr w:type="gramStart"/>
+            <w:r>
+              <w:rPr>
+                <w:rFonts w:ascii="Calibri" w:eastAsia="Calibri" w:hAnsi="Calibri" w:cs="Calibri"/>
+                <w:color w:val="16191F"/>
+                <w:sz w:val="24"/>
+                <w:szCs w:val="24"/>
+              </w:rPr>
+              <w:t>new(</w:t>
+            </w:r>
+            <w:proofErr w:type="gramEnd"/>
+            <w:r>
+              <w:rPr>
+                <w:rFonts w:ascii="Calibri" w:eastAsia="Calibri" w:hAnsi="Calibri" w:cs="Calibri"/>
+                <w:color w:val="16191F"/>
+                <w:sz w:val="24"/>
+                <w:szCs w:val="24"/>
+              </w:rPr>
+              <w:t xml:space="preserve">venueid, venuename, venuecity, venuestate) </w:t>
+            </w:r>
+          </w:p>
+          <w:p>
+            <w:pPr>
+              <w:jc w:val="both"/>
+              <w:rPr>
+                <w:rFonts w:ascii="Calibri" w:eastAsia="Calibri" w:hAnsi="Calibri" w:cs="Calibri"/>
+                <w:color w:val="16191F"/>
+                <w:sz w:val="24"/>
+                <w:szCs w:val="24"/>
+              </w:rPr>
+            </w:pPr>
+            <w:r>
+              <w:rPr>
+                <w:rFonts w:ascii="Calibri" w:eastAsia="Calibri" w:hAnsi="Calibri" w:cs="Calibri"/>
+                <w:color w:val="16191F"/>
+                <w:sz w:val="24"/>
+                <w:szCs w:val="24"/>
+              </w:rPr>
+              <w:t xml:space="preserve">from 's3://bootcamp-bucket/data/venue_new/venue_noseats.txt' </w:t>
+            </w:r>
+          </w:p>
+          <w:p>
+            <w:pPr>
+              <w:jc w:val="both"/>
+              <w:rPr>
+                <w:rFonts w:ascii="Calibri" w:eastAsia="Calibri" w:hAnsi="Calibri" w:cs="Calibri"/>
+                <w:color w:val="16191F"/>
+                <w:sz w:val="24"/>
+                <w:szCs w:val="24"/>
+              </w:rPr>
+            </w:pPr>
+            <w:r>
+              <w:rPr>
+                <w:rFonts w:ascii="Calibri" w:eastAsia="Calibri" w:hAnsi="Calibri" w:cs="Calibri"/>
+                <w:color w:val="16191F"/>
+                <w:sz w:val="24"/>
+                <w:szCs w:val="24"/>
+              </w:rPr>
+              <w:t>iam_role '</w:t>
+            </w:r>
+            <w:proofErr w:type="gramStart"/>
+            <w:r>
+              <w:rPr>
+                <w:rFonts w:ascii="Calibri" w:eastAsia="Calibri" w:hAnsi="Calibri" w:cs="Calibri"/>
+                <w:color w:val="16191F"/>
+                <w:sz w:val="24"/>
+                <w:szCs w:val="24"/>
+              </w:rPr>
+              <w:t>arn:aws</w:t>
+            </w:r>
+            <w:proofErr w:type="gramEnd"/>
+            <w:r>
+              <w:rPr>
+                <w:rFonts w:ascii="Calibri" w:eastAsia="Calibri" w:hAnsi="Calibri" w:cs="Calibri"/>
+                <w:color w:val="16191F"/>
+                <w:sz w:val="24"/>
+                <w:szCs w:val="24"/>
+              </w:rPr>
+              <w:t>:</w:t>
+            </w:r>
+            <w:proofErr w:type="gramStart"/>
+            <w:r>
+              <w:rPr>
+                <w:rFonts w:ascii="Calibri" w:eastAsia="Calibri" w:hAnsi="Calibri" w:cs="Calibri"/>
+                <w:color w:val="16191F"/>
+                <w:sz w:val="24"/>
+                <w:szCs w:val="24"/>
+              </w:rPr>
+              <w:t>iam::111081800296:role</w:t>
+            </w:r>
+            <w:proofErr w:type="gramEnd"/>
+            <w:r>
+              <w:rPr>
+                <w:rFonts w:ascii="Calibri" w:eastAsia="Calibri" w:hAnsi="Calibri" w:cs="Calibri"/>
+                <w:color w:val="16191F"/>
+                <w:sz w:val="24"/>
+                <w:szCs w:val="24"/>
+              </w:rPr>
+              <w:t>/Redshift_admin'</w:t>
+            </w:r>
+          </w:p>
+          <w:p>
+            <w:pPr>
+              <w:jc w:val="both"/>
+              <w:rPr>
+                <w:rFonts w:ascii="Calibri" w:eastAsia="Calibri" w:hAnsi="Calibri" w:cs="Calibri"/>
+                <w:color w:val="16191F"/>
+                <w:sz w:val="24"/>
+                <w:szCs w:val="24"/>
+              </w:rPr>
+            </w:pPr>
+            <w:r>
+              <w:rPr>
+                <w:rFonts w:ascii="Calibri" w:eastAsia="Calibri" w:hAnsi="Calibri" w:cs="Calibri"/>
+                <w:color w:val="16191F"/>
+                <w:sz w:val="24"/>
+                <w:szCs w:val="24"/>
+              </w:rPr>
+              <w:t>delimiter '|';</w:t>
+            </w:r>
+          </w:p>
+          <w:p>
+            <w:pPr>
+              <w:widowControl w:val="0"/>
+              <w:pBdr>
+                <w:top w:val="nil"/>
+                <w:left w:val="nil"/>
+                <w:bottom w:val="nil"/>
+                <w:right w:val="nil"/>
+                <w:between w:val="nil"/>
+              </w:pBdr>
+              <w:spacing w:line="240" w:lineRule="auto"/>
+              <w:rPr>
+                <w:rFonts w:ascii="Calibri" w:eastAsia="Calibri" w:hAnsi="Calibri" w:cs="Calibri"/>
+                <w:color w:val="16191F"/>
+                <w:sz w:val="24"/>
+                <w:szCs w:val="24"/>
+              </w:rPr>
+            </w:pPr>
+          </w:p>
+        </w:tc>
+      </w:tr>
+    </w:tbl>
+    <w:p>
+      <w:pPr>
+        <w:jc w:val="both"/>
+        <w:rPr>
+          <w:rFonts w:ascii="Calibri" w:eastAsia="Calibri" w:hAnsi="Calibri" w:cs="Calibri"/>
+          <w:color w:val="16191F"/>
+          <w:sz w:val="24"/>
+          <w:szCs w:val="24"/>
+        </w:rPr>
+      </w:pPr>
+    </w:p>
+    <w:p>
+      <w:pPr>
+        <w:jc w:val="both"/>
+        <w:rPr>
+          <w:rFonts w:ascii="Calibri" w:eastAsia="Calibri" w:hAnsi="Calibri" w:cs="Calibri"/>
+          <w:color w:val="16191F"/>
+          <w:sz w:val="24"/>
+          <w:szCs w:val="24"/>
+          <w:highlight w:val="white"/>
         </w:rPr>
       </w:pPr>
     </w:p>
@@ -2650,6 +5035,7 @@
     <w:name w:val="heading 2"/>
     <w:basedOn w:val="Normal"/>
     <w:next w:val="Normal"/>
+    <w:link w:val="Heading2Char"/>
     <w:uiPriority w:val="9"/>
     <w:unhideWhenUsed/>
     <w:qFormat/>
@@ -2983,6 +5369,17 @@
       </w:tblCellMar>
     </w:tblPr>
   </w:style>
+  <w:style w:type="character" w:customStyle="1" w:styleId="Heading2Char">
+    <w:name w:val="Heading 2 Char"/>
+    <w:basedOn w:val="DefaultParagraphFont"/>
+    <w:link w:val="Heading2"/>
+    <w:uiPriority w:val="9"/>
+    <w:rsid w:val="009D472F"/>
+    <w:rPr>
+      <w:sz w:val="32"/>
+      <w:szCs w:val="32"/>
+    </w:rPr>
+  </w:style>
 </w:styles>
 </file>
 

</xml_diff>

<commit_message>
Redshift finishing with conclusion and summary of what we did in overall project
</commit_message>
<xml_diff>
--- a/New folder/Redshift load data- Doc 4-DE.docx
+++ b/New folder/Redshift load data- Doc 4-DE.docx
@@ -651,6 +651,7 @@
               </w:rPr>
               <w:t xml:space="preserve">create table </w:t>
             </w:r>
+            <w:proofErr w:type="spellStart"/>
             <w:proofErr w:type="gramStart"/>
             <w:r>
               <w:rPr>
@@ -661,6 +662,7 @@
               </w:rPr>
               <w:t>test.listing</w:t>
             </w:r>
+            <w:proofErr w:type="spellEnd"/>
             <w:proofErr w:type="gramEnd"/>
             <w:r>
               <w:rPr>
@@ -690,7 +692,46 @@
                 <w:szCs w:val="24"/>
               </w:rPr>
               <w:tab/>
-              <w:t>listid integer not null distkey,</w:t>
+            </w:r>
+            <w:proofErr w:type="spellStart"/>
+            <w:r>
+              <w:rPr>
+                <w:rFonts w:ascii="Calibri" w:eastAsia="Calibri" w:hAnsi="Calibri" w:cs="Calibri"/>
+                <w:color w:val="16191F"/>
+                <w:sz w:val="24"/>
+                <w:szCs w:val="24"/>
+              </w:rPr>
+              <w:t>listid</w:t>
+            </w:r>
+            <w:proofErr w:type="spellEnd"/>
+            <w:r>
+              <w:rPr>
+                <w:rFonts w:ascii="Calibri" w:eastAsia="Calibri" w:hAnsi="Calibri" w:cs="Calibri"/>
+                <w:color w:val="16191F"/>
+                <w:sz w:val="24"/>
+                <w:szCs w:val="24"/>
+              </w:rPr>
+              <w:t xml:space="preserve"> integer not null </w:t>
+            </w:r>
+            <w:proofErr w:type="spellStart"/>
+            <w:r>
+              <w:rPr>
+                <w:rFonts w:ascii="Calibri" w:eastAsia="Calibri" w:hAnsi="Calibri" w:cs="Calibri"/>
+                <w:color w:val="16191F"/>
+                <w:sz w:val="24"/>
+                <w:szCs w:val="24"/>
+              </w:rPr>
+              <w:t>distkey</w:t>
+            </w:r>
+            <w:proofErr w:type="spellEnd"/>
+            <w:r>
+              <w:rPr>
+                <w:rFonts w:ascii="Calibri" w:eastAsia="Calibri" w:hAnsi="Calibri" w:cs="Calibri"/>
+                <w:color w:val="16191F"/>
+                <w:sz w:val="24"/>
+                <w:szCs w:val="24"/>
+              </w:rPr>
+              <w:t>,</w:t>
             </w:r>
           </w:p>
           <w:p>
@@ -711,7 +752,26 @@
                 <w:szCs w:val="24"/>
               </w:rPr>
               <w:tab/>
-              <w:t>sellerid integer not null,</w:t>
+            </w:r>
+            <w:proofErr w:type="spellStart"/>
+            <w:r>
+              <w:rPr>
+                <w:rFonts w:ascii="Calibri" w:eastAsia="Calibri" w:hAnsi="Calibri" w:cs="Calibri"/>
+                <w:color w:val="16191F"/>
+                <w:sz w:val="24"/>
+                <w:szCs w:val="24"/>
+              </w:rPr>
+              <w:t>sellerid</w:t>
+            </w:r>
+            <w:proofErr w:type="spellEnd"/>
+            <w:r>
+              <w:rPr>
+                <w:rFonts w:ascii="Calibri" w:eastAsia="Calibri" w:hAnsi="Calibri" w:cs="Calibri"/>
+                <w:color w:val="16191F"/>
+                <w:sz w:val="24"/>
+                <w:szCs w:val="24"/>
+              </w:rPr>
+              <w:t xml:space="preserve"> integer not null,</w:t>
             </w:r>
           </w:p>
           <w:p>
@@ -732,7 +792,26 @@
                 <w:szCs w:val="24"/>
               </w:rPr>
               <w:tab/>
-              <w:t>eventid integer not null,</w:t>
+            </w:r>
+            <w:proofErr w:type="spellStart"/>
+            <w:r>
+              <w:rPr>
+                <w:rFonts w:ascii="Calibri" w:eastAsia="Calibri" w:hAnsi="Calibri" w:cs="Calibri"/>
+                <w:color w:val="16191F"/>
+                <w:sz w:val="24"/>
+                <w:szCs w:val="24"/>
+              </w:rPr>
+              <w:t>eventid</w:t>
+            </w:r>
+            <w:proofErr w:type="spellEnd"/>
+            <w:r>
+              <w:rPr>
+                <w:rFonts w:ascii="Calibri" w:eastAsia="Calibri" w:hAnsi="Calibri" w:cs="Calibri"/>
+                <w:color w:val="16191F"/>
+                <w:sz w:val="24"/>
+                <w:szCs w:val="24"/>
+              </w:rPr>
+              <w:t xml:space="preserve"> integer not null,</w:t>
             </w:r>
           </w:p>
           <w:p>
@@ -754,14 +833,45 @@
               </w:rPr>
               <w:tab/>
             </w:r>
-            <w:r>
-              <w:rPr>
-                <w:rFonts w:ascii="Calibri" w:eastAsia="Calibri" w:hAnsi="Calibri" w:cs="Calibri"/>
-                <w:color w:val="16191F"/>
-                <w:sz w:val="24"/>
-                <w:szCs w:val="24"/>
-              </w:rPr>
-              <w:t xml:space="preserve">dateid smallint not </w:t>
+            <w:proofErr w:type="spellStart"/>
+            <w:r>
+              <w:rPr>
+                <w:rFonts w:ascii="Calibri" w:eastAsia="Calibri" w:hAnsi="Calibri" w:cs="Calibri"/>
+                <w:color w:val="16191F"/>
+                <w:sz w:val="24"/>
+                <w:szCs w:val="24"/>
+              </w:rPr>
+              <w:t>dateid</w:t>
+            </w:r>
+            <w:proofErr w:type="spellEnd"/>
+            <w:r>
+              <w:rPr>
+                <w:rFonts w:ascii="Calibri" w:eastAsia="Calibri" w:hAnsi="Calibri" w:cs="Calibri"/>
+                <w:color w:val="16191F"/>
+                <w:sz w:val="24"/>
+                <w:szCs w:val="24"/>
+              </w:rPr>
+              <w:t xml:space="preserve"> </w:t>
+            </w:r>
+            <w:proofErr w:type="spellStart"/>
+            <w:r>
+              <w:rPr>
+                <w:rFonts w:ascii="Calibri" w:eastAsia="Calibri" w:hAnsi="Calibri" w:cs="Calibri"/>
+                <w:color w:val="16191F"/>
+                <w:sz w:val="24"/>
+                <w:szCs w:val="24"/>
+              </w:rPr>
+              <w:t>smallint</w:t>
+            </w:r>
+            <w:proofErr w:type="spellEnd"/>
+            <w:r>
+              <w:rPr>
+                <w:rFonts w:ascii="Calibri" w:eastAsia="Calibri" w:hAnsi="Calibri" w:cs="Calibri"/>
+                <w:color w:val="16191F"/>
+                <w:sz w:val="24"/>
+                <w:szCs w:val="24"/>
+              </w:rPr>
+              <w:t xml:space="preserve"> not </w:t>
             </w:r>
             <w:proofErr w:type="gramStart"/>
             <w:r>
@@ -771,8 +881,19 @@
                 <w:sz w:val="24"/>
                 <w:szCs w:val="24"/>
               </w:rPr>
-              <w:t>null  sortkey</w:t>
-            </w:r>
+              <w:t xml:space="preserve">null  </w:t>
+            </w:r>
+            <w:proofErr w:type="spellStart"/>
+            <w:r>
+              <w:rPr>
+                <w:rFonts w:ascii="Calibri" w:eastAsia="Calibri" w:hAnsi="Calibri" w:cs="Calibri"/>
+                <w:color w:val="16191F"/>
+                <w:sz w:val="24"/>
+                <w:szCs w:val="24"/>
+              </w:rPr>
+              <w:t>sortkey</w:t>
+            </w:r>
+            <w:proofErr w:type="spellEnd"/>
             <w:proofErr w:type="gramEnd"/>
             <w:r>
               <w:rPr>
@@ -802,7 +923,46 @@
                 <w:szCs w:val="24"/>
               </w:rPr>
               <w:tab/>
-              <w:t>numtickets smallint not null,</w:t>
+            </w:r>
+            <w:proofErr w:type="spellStart"/>
+            <w:r>
+              <w:rPr>
+                <w:rFonts w:ascii="Calibri" w:eastAsia="Calibri" w:hAnsi="Calibri" w:cs="Calibri"/>
+                <w:color w:val="16191F"/>
+                <w:sz w:val="24"/>
+                <w:szCs w:val="24"/>
+              </w:rPr>
+              <w:t>numtickets</w:t>
+            </w:r>
+            <w:proofErr w:type="spellEnd"/>
+            <w:r>
+              <w:rPr>
+                <w:rFonts w:ascii="Calibri" w:eastAsia="Calibri" w:hAnsi="Calibri" w:cs="Calibri"/>
+                <w:color w:val="16191F"/>
+                <w:sz w:val="24"/>
+                <w:szCs w:val="24"/>
+              </w:rPr>
+              <w:t xml:space="preserve"> </w:t>
+            </w:r>
+            <w:proofErr w:type="spellStart"/>
+            <w:r>
+              <w:rPr>
+                <w:rFonts w:ascii="Calibri" w:eastAsia="Calibri" w:hAnsi="Calibri" w:cs="Calibri"/>
+                <w:color w:val="16191F"/>
+                <w:sz w:val="24"/>
+                <w:szCs w:val="24"/>
+              </w:rPr>
+              <w:t>smallint</w:t>
+            </w:r>
+            <w:proofErr w:type="spellEnd"/>
+            <w:r>
+              <w:rPr>
+                <w:rFonts w:ascii="Calibri" w:eastAsia="Calibri" w:hAnsi="Calibri" w:cs="Calibri"/>
+                <w:color w:val="16191F"/>
+                <w:sz w:val="24"/>
+                <w:szCs w:val="24"/>
+              </w:rPr>
+              <w:t xml:space="preserve"> not null,</w:t>
             </w:r>
           </w:p>
           <w:p>
@@ -823,7 +983,26 @@
                 <w:szCs w:val="24"/>
               </w:rPr>
               <w:tab/>
-              <w:t xml:space="preserve">priceperticket </w:t>
+            </w:r>
+            <w:proofErr w:type="spellStart"/>
+            <w:r>
+              <w:rPr>
+                <w:rFonts w:ascii="Calibri" w:eastAsia="Calibri" w:hAnsi="Calibri" w:cs="Calibri"/>
+                <w:color w:val="16191F"/>
+                <w:sz w:val="24"/>
+                <w:szCs w:val="24"/>
+              </w:rPr>
+              <w:t>priceperticket</w:t>
+            </w:r>
+            <w:proofErr w:type="spellEnd"/>
+            <w:r>
+              <w:rPr>
+                <w:rFonts w:ascii="Calibri" w:eastAsia="Calibri" w:hAnsi="Calibri" w:cs="Calibri"/>
+                <w:color w:val="16191F"/>
+                <w:sz w:val="24"/>
+                <w:szCs w:val="24"/>
+              </w:rPr>
+              <w:t xml:space="preserve"> </w:t>
             </w:r>
             <w:proofErr w:type="gramStart"/>
             <w:r>
@@ -864,7 +1043,26 @@
                 <w:szCs w:val="24"/>
               </w:rPr>
               <w:tab/>
-              <w:t xml:space="preserve">totalprice </w:t>
+            </w:r>
+            <w:proofErr w:type="spellStart"/>
+            <w:r>
+              <w:rPr>
+                <w:rFonts w:ascii="Calibri" w:eastAsia="Calibri" w:hAnsi="Calibri" w:cs="Calibri"/>
+                <w:color w:val="16191F"/>
+                <w:sz w:val="24"/>
+                <w:szCs w:val="24"/>
+              </w:rPr>
+              <w:t>totalprice</w:t>
+            </w:r>
+            <w:proofErr w:type="spellEnd"/>
+            <w:r>
+              <w:rPr>
+                <w:rFonts w:ascii="Calibri" w:eastAsia="Calibri" w:hAnsi="Calibri" w:cs="Calibri"/>
+                <w:color w:val="16191F"/>
+                <w:sz w:val="24"/>
+                <w:szCs w:val="24"/>
+              </w:rPr>
+              <w:t xml:space="preserve"> </w:t>
             </w:r>
             <w:proofErr w:type="gramStart"/>
             <w:r>
@@ -905,7 +1103,26 @@
                 <w:szCs w:val="24"/>
               </w:rPr>
               <w:tab/>
-              <w:t>listtime timestamp);</w:t>
+            </w:r>
+            <w:proofErr w:type="spellStart"/>
+            <w:r>
+              <w:rPr>
+                <w:rFonts w:ascii="Calibri" w:eastAsia="Calibri" w:hAnsi="Calibri" w:cs="Calibri"/>
+                <w:color w:val="16191F"/>
+                <w:sz w:val="24"/>
+                <w:szCs w:val="24"/>
+              </w:rPr>
+              <w:t>listtime</w:t>
+            </w:r>
+            <w:proofErr w:type="spellEnd"/>
+            <w:r>
+              <w:rPr>
+                <w:rFonts w:ascii="Calibri" w:eastAsia="Calibri" w:hAnsi="Calibri" w:cs="Calibri"/>
+                <w:color w:val="16191F"/>
+                <w:sz w:val="24"/>
+                <w:szCs w:val="24"/>
+              </w:rPr>
+              <w:t xml:space="preserve"> timestamp);</w:t>
             </w:r>
           </w:p>
           <w:p>
@@ -1043,6 +1260,7 @@
               </w:rPr>
               <w:t xml:space="preserve">copy </w:t>
             </w:r>
+            <w:proofErr w:type="spellStart"/>
             <w:proofErr w:type="gramStart"/>
             <w:r>
               <w:rPr>
@@ -1053,6 +1271,7 @@
               </w:rPr>
               <w:t>test.listing</w:t>
             </w:r>
+            <w:proofErr w:type="spellEnd"/>
             <w:proofErr w:type="gramEnd"/>
             <w:r>
               <w:rPr>
@@ -1081,7 +1300,27 @@
                 <w:sz w:val="24"/>
                 <w:szCs w:val="24"/>
               </w:rPr>
-              <w:t xml:space="preserve">from 's3://mybucket/data/listings_pipe.txt' </w:t>
+              <w:t>from 's3://</w:t>
+            </w:r>
+            <w:proofErr w:type="spellStart"/>
+            <w:r>
+              <w:rPr>
+                <w:rFonts w:ascii="Calibri" w:eastAsia="Calibri" w:hAnsi="Calibri" w:cs="Calibri"/>
+                <w:color w:val="16191F"/>
+                <w:sz w:val="24"/>
+                <w:szCs w:val="24"/>
+              </w:rPr>
+              <w:t>mybucket</w:t>
+            </w:r>
+            <w:proofErr w:type="spellEnd"/>
+            <w:r>
+              <w:rPr>
+                <w:rFonts w:ascii="Calibri" w:eastAsia="Calibri" w:hAnsi="Calibri" w:cs="Calibri"/>
+                <w:color w:val="16191F"/>
+                <w:sz w:val="24"/>
+                <w:szCs w:val="24"/>
+              </w:rPr>
+              <w:t xml:space="preserve">/data/listings_pipe.txt' </w:t>
             </w:r>
           </w:p>
           <w:p>
@@ -1094,15 +1333,27 @@
                 <w:szCs w:val="24"/>
               </w:rPr>
             </w:pPr>
-            <w:r>
-              <w:rPr>
-                <w:rFonts w:ascii="Calibri" w:eastAsia="Calibri" w:hAnsi="Calibri" w:cs="Calibri"/>
-                <w:color w:val="16191F"/>
-                <w:sz w:val="24"/>
-                <w:szCs w:val="24"/>
-              </w:rPr>
-              <w:t>iam_role '</w:t>
-            </w:r>
+            <w:proofErr w:type="spellStart"/>
+            <w:r>
+              <w:rPr>
+                <w:rFonts w:ascii="Calibri" w:eastAsia="Calibri" w:hAnsi="Calibri" w:cs="Calibri"/>
+                <w:color w:val="16191F"/>
+                <w:sz w:val="24"/>
+                <w:szCs w:val="24"/>
+              </w:rPr>
+              <w:t>iam_role</w:t>
+            </w:r>
+            <w:proofErr w:type="spellEnd"/>
+            <w:r>
+              <w:rPr>
+                <w:rFonts w:ascii="Calibri" w:eastAsia="Calibri" w:hAnsi="Calibri" w:cs="Calibri"/>
+                <w:color w:val="16191F"/>
+                <w:sz w:val="24"/>
+                <w:szCs w:val="24"/>
+              </w:rPr>
+              <w:t xml:space="preserve"> '</w:t>
+            </w:r>
+            <w:proofErr w:type="spellStart"/>
             <w:proofErr w:type="gramStart"/>
             <w:r>
               <w:rPr>
@@ -1131,7 +1382,17 @@
                 <w:sz w:val="24"/>
                 <w:szCs w:val="24"/>
               </w:rPr>
-              <w:t>iam::0123456789012:role</w:t>
+              <w:t>iam</w:t>
+            </w:r>
+            <w:proofErr w:type="spellEnd"/>
+            <w:r>
+              <w:rPr>
+                <w:rFonts w:ascii="Calibri" w:eastAsia="Calibri" w:hAnsi="Calibri" w:cs="Calibri"/>
+                <w:color w:val="16191F"/>
+                <w:sz w:val="24"/>
+                <w:szCs w:val="24"/>
+              </w:rPr>
+              <w:t>::0123456789012:role</w:t>
             </w:r>
             <w:proofErr w:type="gramEnd"/>
             <w:r>
@@ -1141,7 +1402,27 @@
                 <w:sz w:val="24"/>
                 <w:szCs w:val="24"/>
               </w:rPr>
-              <w:t>/MyRedshiftRole';</w:t>
+              <w:t>/</w:t>
+            </w:r>
+            <w:proofErr w:type="spellStart"/>
+            <w:r>
+              <w:rPr>
+                <w:rFonts w:ascii="Calibri" w:eastAsia="Calibri" w:hAnsi="Calibri" w:cs="Calibri"/>
+                <w:color w:val="16191F"/>
+                <w:sz w:val="24"/>
+                <w:szCs w:val="24"/>
+              </w:rPr>
+              <w:t>MyRedshiftRole</w:t>
+            </w:r>
+            <w:proofErr w:type="spellEnd"/>
+            <w:r>
+              <w:rPr>
+                <w:rFonts w:ascii="Calibri" w:eastAsia="Calibri" w:hAnsi="Calibri" w:cs="Calibri"/>
+                <w:color w:val="16191F"/>
+                <w:sz w:val="24"/>
+                <w:szCs w:val="24"/>
+              </w:rPr>
+              <w:t>';</w:t>
             </w:r>
           </w:p>
         </w:tc>
@@ -1270,6 +1551,7 @@
               </w:rPr>
               <w:t xml:space="preserve">unload ('select * from </w:t>
             </w:r>
+            <w:proofErr w:type="spellStart"/>
             <w:proofErr w:type="gramStart"/>
             <w:r>
               <w:rPr>
@@ -1280,6 +1562,7 @@
               </w:rPr>
               <w:t>test.listing</w:t>
             </w:r>
+            <w:proofErr w:type="spellEnd"/>
             <w:proofErr w:type="gramEnd"/>
             <w:r>
               <w:rPr>
@@ -1308,7 +1591,27 @@
                 <w:sz w:val="24"/>
                 <w:szCs w:val="24"/>
               </w:rPr>
-              <w:t>to 's3://bootcamp-buct/data/listing/parquet/file'</w:t>
+              <w:t>to 's3://bootcamp-</w:t>
+            </w:r>
+            <w:proofErr w:type="spellStart"/>
+            <w:r>
+              <w:rPr>
+                <w:rFonts w:ascii="Calibri" w:eastAsia="Calibri" w:hAnsi="Calibri" w:cs="Calibri"/>
+                <w:color w:val="16191F"/>
+                <w:sz w:val="24"/>
+                <w:szCs w:val="24"/>
+              </w:rPr>
+              <w:t>buct</w:t>
+            </w:r>
+            <w:proofErr w:type="spellEnd"/>
+            <w:r>
+              <w:rPr>
+                <w:rFonts w:ascii="Calibri" w:eastAsia="Calibri" w:hAnsi="Calibri" w:cs="Calibri"/>
+                <w:color w:val="16191F"/>
+                <w:sz w:val="24"/>
+                <w:szCs w:val="24"/>
+              </w:rPr>
+              <w:t>/data/listing/parquet/file'</w:t>
             </w:r>
           </w:p>
           <w:p>
@@ -1321,15 +1624,27 @@
                 <w:szCs w:val="24"/>
               </w:rPr>
             </w:pPr>
-            <w:r>
-              <w:rPr>
-                <w:rFonts w:ascii="Calibri" w:eastAsia="Calibri" w:hAnsi="Calibri" w:cs="Calibri"/>
-                <w:color w:val="16191F"/>
-                <w:sz w:val="24"/>
-                <w:szCs w:val="24"/>
-              </w:rPr>
-              <w:t>iam_role '</w:t>
-            </w:r>
+            <w:proofErr w:type="spellStart"/>
+            <w:r>
+              <w:rPr>
+                <w:rFonts w:ascii="Calibri" w:eastAsia="Calibri" w:hAnsi="Calibri" w:cs="Calibri"/>
+                <w:color w:val="16191F"/>
+                <w:sz w:val="24"/>
+                <w:szCs w:val="24"/>
+              </w:rPr>
+              <w:t>iam_role</w:t>
+            </w:r>
+            <w:proofErr w:type="spellEnd"/>
+            <w:r>
+              <w:rPr>
+                <w:rFonts w:ascii="Calibri" w:eastAsia="Calibri" w:hAnsi="Calibri" w:cs="Calibri"/>
+                <w:color w:val="16191F"/>
+                <w:sz w:val="24"/>
+                <w:szCs w:val="24"/>
+              </w:rPr>
+              <w:t xml:space="preserve"> '</w:t>
+            </w:r>
+            <w:proofErr w:type="spellStart"/>
             <w:proofErr w:type="gramStart"/>
             <w:r>
               <w:rPr>
@@ -1358,7 +1673,17 @@
                 <w:sz w:val="24"/>
                 <w:szCs w:val="24"/>
               </w:rPr>
-              <w:t>iam::111081800296:role</w:t>
+              <w:t>iam</w:t>
+            </w:r>
+            <w:proofErr w:type="spellEnd"/>
+            <w:r>
+              <w:rPr>
+                <w:rFonts w:ascii="Calibri" w:eastAsia="Calibri" w:hAnsi="Calibri" w:cs="Calibri"/>
+                <w:color w:val="16191F"/>
+                <w:sz w:val="24"/>
+                <w:szCs w:val="24"/>
+              </w:rPr>
+              <w:t>::111081800296:role</w:t>
             </w:r>
             <w:proofErr w:type="gramEnd"/>
             <w:r>
@@ -1368,7 +1693,27 @@
                 <w:sz w:val="24"/>
                 <w:szCs w:val="24"/>
               </w:rPr>
-              <w:t>/Redshift_admin'</w:t>
+              <w:t>/</w:t>
+            </w:r>
+            <w:proofErr w:type="spellStart"/>
+            <w:r>
+              <w:rPr>
+                <w:rFonts w:ascii="Calibri" w:eastAsia="Calibri" w:hAnsi="Calibri" w:cs="Calibri"/>
+                <w:color w:val="16191F"/>
+                <w:sz w:val="24"/>
+                <w:szCs w:val="24"/>
+              </w:rPr>
+              <w:t>Redshift_admin</w:t>
+            </w:r>
+            <w:proofErr w:type="spellEnd"/>
+            <w:r>
+              <w:rPr>
+                <w:rFonts w:ascii="Calibri" w:eastAsia="Calibri" w:hAnsi="Calibri" w:cs="Calibri"/>
+                <w:color w:val="16191F"/>
+                <w:sz w:val="24"/>
+                <w:szCs w:val="24"/>
+              </w:rPr>
+              <w:t>'</w:t>
             </w:r>
           </w:p>
           <w:p>
@@ -1515,6 +1860,7 @@
               </w:rPr>
               <w:t xml:space="preserve">unload ('select * from </w:t>
             </w:r>
+            <w:proofErr w:type="spellStart"/>
             <w:proofErr w:type="gramStart"/>
             <w:r>
               <w:rPr>
@@ -1525,6 +1871,7 @@
               </w:rPr>
               <w:t>test.listing</w:t>
             </w:r>
+            <w:proofErr w:type="spellEnd"/>
             <w:proofErr w:type="gramEnd"/>
             <w:r>
               <w:rPr>
@@ -1566,15 +1913,27 @@
                 <w:szCs w:val="24"/>
               </w:rPr>
             </w:pPr>
-            <w:r>
-              <w:rPr>
-                <w:rFonts w:ascii="Calibri" w:eastAsia="Calibri" w:hAnsi="Calibri" w:cs="Calibri"/>
-                <w:color w:val="16191F"/>
-                <w:sz w:val="24"/>
-                <w:szCs w:val="24"/>
-              </w:rPr>
-              <w:t>iam_role '</w:t>
-            </w:r>
+            <w:proofErr w:type="spellStart"/>
+            <w:r>
+              <w:rPr>
+                <w:rFonts w:ascii="Calibri" w:eastAsia="Calibri" w:hAnsi="Calibri" w:cs="Calibri"/>
+                <w:color w:val="16191F"/>
+                <w:sz w:val="24"/>
+                <w:szCs w:val="24"/>
+              </w:rPr>
+              <w:t>iam_role</w:t>
+            </w:r>
+            <w:proofErr w:type="spellEnd"/>
+            <w:r>
+              <w:rPr>
+                <w:rFonts w:ascii="Calibri" w:eastAsia="Calibri" w:hAnsi="Calibri" w:cs="Calibri"/>
+                <w:color w:val="16191F"/>
+                <w:sz w:val="24"/>
+                <w:szCs w:val="24"/>
+              </w:rPr>
+              <w:t xml:space="preserve"> '</w:t>
+            </w:r>
+            <w:proofErr w:type="spellStart"/>
             <w:proofErr w:type="gramStart"/>
             <w:r>
               <w:rPr>
@@ -1603,7 +1962,17 @@
                 <w:sz w:val="24"/>
                 <w:szCs w:val="24"/>
               </w:rPr>
-              <w:t>iam::111081800296:role</w:t>
+              <w:t>iam</w:t>
+            </w:r>
+            <w:proofErr w:type="spellEnd"/>
+            <w:r>
+              <w:rPr>
+                <w:rFonts w:ascii="Calibri" w:eastAsia="Calibri" w:hAnsi="Calibri" w:cs="Calibri"/>
+                <w:color w:val="16191F"/>
+                <w:sz w:val="24"/>
+                <w:szCs w:val="24"/>
+              </w:rPr>
+              <w:t>::111081800296:role</w:t>
             </w:r>
             <w:proofErr w:type="gramEnd"/>
             <w:r>
@@ -1613,7 +1982,27 @@
                 <w:sz w:val="24"/>
                 <w:szCs w:val="24"/>
               </w:rPr>
-              <w:t>/Redshift_admin'</w:t>
+              <w:t>/</w:t>
+            </w:r>
+            <w:proofErr w:type="spellStart"/>
+            <w:r>
+              <w:rPr>
+                <w:rFonts w:ascii="Calibri" w:eastAsia="Calibri" w:hAnsi="Calibri" w:cs="Calibri"/>
+                <w:color w:val="16191F"/>
+                <w:sz w:val="24"/>
+                <w:szCs w:val="24"/>
+              </w:rPr>
+              <w:t>Redshift_admin</w:t>
+            </w:r>
+            <w:proofErr w:type="spellEnd"/>
+            <w:r>
+              <w:rPr>
+                <w:rFonts w:ascii="Calibri" w:eastAsia="Calibri" w:hAnsi="Calibri" w:cs="Calibri"/>
+                <w:color w:val="16191F"/>
+                <w:sz w:val="24"/>
+                <w:szCs w:val="24"/>
+              </w:rPr>
+              <w:t>'</w:t>
             </w:r>
           </w:p>
           <w:p>
@@ -1785,6 +2174,7 @@
               </w:rPr>
               <w:t xml:space="preserve">create table </w:t>
             </w:r>
+            <w:proofErr w:type="spellStart"/>
             <w:proofErr w:type="gramStart"/>
             <w:r>
               <w:rPr>
@@ -1813,7 +2203,17 @@
                 <w:sz w:val="24"/>
                 <w:szCs w:val="24"/>
               </w:rPr>
-              <w:t>parquet(</w:t>
+              <w:t>parquet</w:t>
+            </w:r>
+            <w:proofErr w:type="spellEnd"/>
+            <w:r>
+              <w:rPr>
+                <w:rFonts w:ascii="Calibri" w:eastAsia="Calibri" w:hAnsi="Calibri" w:cs="Calibri"/>
+                <w:color w:val="16191F"/>
+                <w:sz w:val="24"/>
+                <w:szCs w:val="24"/>
+              </w:rPr>
+              <w:t>(</w:t>
             </w:r>
             <w:proofErr w:type="gramEnd"/>
           </w:p>
@@ -1835,7 +2235,46 @@
                 <w:szCs w:val="24"/>
               </w:rPr>
               <w:tab/>
-              <w:t>listid integer not null distkey,</w:t>
+            </w:r>
+            <w:proofErr w:type="spellStart"/>
+            <w:r>
+              <w:rPr>
+                <w:rFonts w:ascii="Calibri" w:eastAsia="Calibri" w:hAnsi="Calibri" w:cs="Calibri"/>
+                <w:color w:val="16191F"/>
+                <w:sz w:val="24"/>
+                <w:szCs w:val="24"/>
+              </w:rPr>
+              <w:t>listid</w:t>
+            </w:r>
+            <w:proofErr w:type="spellEnd"/>
+            <w:r>
+              <w:rPr>
+                <w:rFonts w:ascii="Calibri" w:eastAsia="Calibri" w:hAnsi="Calibri" w:cs="Calibri"/>
+                <w:color w:val="16191F"/>
+                <w:sz w:val="24"/>
+                <w:szCs w:val="24"/>
+              </w:rPr>
+              <w:t xml:space="preserve"> integer not null </w:t>
+            </w:r>
+            <w:proofErr w:type="spellStart"/>
+            <w:r>
+              <w:rPr>
+                <w:rFonts w:ascii="Calibri" w:eastAsia="Calibri" w:hAnsi="Calibri" w:cs="Calibri"/>
+                <w:color w:val="16191F"/>
+                <w:sz w:val="24"/>
+                <w:szCs w:val="24"/>
+              </w:rPr>
+              <w:t>distkey</w:t>
+            </w:r>
+            <w:proofErr w:type="spellEnd"/>
+            <w:r>
+              <w:rPr>
+                <w:rFonts w:ascii="Calibri" w:eastAsia="Calibri" w:hAnsi="Calibri" w:cs="Calibri"/>
+                <w:color w:val="16191F"/>
+                <w:sz w:val="24"/>
+                <w:szCs w:val="24"/>
+              </w:rPr>
+              <w:t>,</w:t>
             </w:r>
           </w:p>
           <w:p>
@@ -1856,7 +2295,26 @@
                 <w:szCs w:val="24"/>
               </w:rPr>
               <w:tab/>
-              <w:t>sellerid integer not null,</w:t>
+            </w:r>
+            <w:proofErr w:type="spellStart"/>
+            <w:r>
+              <w:rPr>
+                <w:rFonts w:ascii="Calibri" w:eastAsia="Calibri" w:hAnsi="Calibri" w:cs="Calibri"/>
+                <w:color w:val="16191F"/>
+                <w:sz w:val="24"/>
+                <w:szCs w:val="24"/>
+              </w:rPr>
+              <w:t>sellerid</w:t>
+            </w:r>
+            <w:proofErr w:type="spellEnd"/>
+            <w:r>
+              <w:rPr>
+                <w:rFonts w:ascii="Calibri" w:eastAsia="Calibri" w:hAnsi="Calibri" w:cs="Calibri"/>
+                <w:color w:val="16191F"/>
+                <w:sz w:val="24"/>
+                <w:szCs w:val="24"/>
+              </w:rPr>
+              <w:t xml:space="preserve"> integer not null,</w:t>
             </w:r>
           </w:p>
           <w:p>
@@ -1877,7 +2335,26 @@
                 <w:szCs w:val="24"/>
               </w:rPr>
               <w:tab/>
-              <w:t>eventid integer not null,</w:t>
+            </w:r>
+            <w:proofErr w:type="spellStart"/>
+            <w:r>
+              <w:rPr>
+                <w:rFonts w:ascii="Calibri" w:eastAsia="Calibri" w:hAnsi="Calibri" w:cs="Calibri"/>
+                <w:color w:val="16191F"/>
+                <w:sz w:val="24"/>
+                <w:szCs w:val="24"/>
+              </w:rPr>
+              <w:t>eventid</w:t>
+            </w:r>
+            <w:proofErr w:type="spellEnd"/>
+            <w:r>
+              <w:rPr>
+                <w:rFonts w:ascii="Calibri" w:eastAsia="Calibri" w:hAnsi="Calibri" w:cs="Calibri"/>
+                <w:color w:val="16191F"/>
+                <w:sz w:val="24"/>
+                <w:szCs w:val="24"/>
+              </w:rPr>
+              <w:t xml:space="preserve"> integer not null,</w:t>
             </w:r>
           </w:p>
           <w:p>
@@ -1898,7 +2375,46 @@
                 <w:szCs w:val="24"/>
               </w:rPr>
               <w:tab/>
-              <w:t xml:space="preserve">dateid smallint not </w:t>
+            </w:r>
+            <w:proofErr w:type="spellStart"/>
+            <w:r>
+              <w:rPr>
+                <w:rFonts w:ascii="Calibri" w:eastAsia="Calibri" w:hAnsi="Calibri" w:cs="Calibri"/>
+                <w:color w:val="16191F"/>
+                <w:sz w:val="24"/>
+                <w:szCs w:val="24"/>
+              </w:rPr>
+              <w:t>dateid</w:t>
+            </w:r>
+            <w:proofErr w:type="spellEnd"/>
+            <w:r>
+              <w:rPr>
+                <w:rFonts w:ascii="Calibri" w:eastAsia="Calibri" w:hAnsi="Calibri" w:cs="Calibri"/>
+                <w:color w:val="16191F"/>
+                <w:sz w:val="24"/>
+                <w:szCs w:val="24"/>
+              </w:rPr>
+              <w:t xml:space="preserve"> </w:t>
+            </w:r>
+            <w:proofErr w:type="spellStart"/>
+            <w:r>
+              <w:rPr>
+                <w:rFonts w:ascii="Calibri" w:eastAsia="Calibri" w:hAnsi="Calibri" w:cs="Calibri"/>
+                <w:color w:val="16191F"/>
+                <w:sz w:val="24"/>
+                <w:szCs w:val="24"/>
+              </w:rPr>
+              <w:t>smallint</w:t>
+            </w:r>
+            <w:proofErr w:type="spellEnd"/>
+            <w:r>
+              <w:rPr>
+                <w:rFonts w:ascii="Calibri" w:eastAsia="Calibri" w:hAnsi="Calibri" w:cs="Calibri"/>
+                <w:color w:val="16191F"/>
+                <w:sz w:val="24"/>
+                <w:szCs w:val="24"/>
+              </w:rPr>
+              <w:t xml:space="preserve"> not </w:t>
             </w:r>
             <w:proofErr w:type="gramStart"/>
             <w:r>
@@ -1908,8 +2424,19 @@
                 <w:sz w:val="24"/>
                 <w:szCs w:val="24"/>
               </w:rPr>
-              <w:t>null  sortkey</w:t>
-            </w:r>
+              <w:t xml:space="preserve">null  </w:t>
+            </w:r>
+            <w:proofErr w:type="spellStart"/>
+            <w:r>
+              <w:rPr>
+                <w:rFonts w:ascii="Calibri" w:eastAsia="Calibri" w:hAnsi="Calibri" w:cs="Calibri"/>
+                <w:color w:val="16191F"/>
+                <w:sz w:val="24"/>
+                <w:szCs w:val="24"/>
+              </w:rPr>
+              <w:t>sortkey</w:t>
+            </w:r>
+            <w:proofErr w:type="spellEnd"/>
             <w:proofErr w:type="gramEnd"/>
             <w:r>
               <w:rPr>
@@ -1940,7 +2467,46 @@
               </w:rPr>
               <w:lastRenderedPageBreak/>
               <w:tab/>
-              <w:t>numtickets smallint not null,</w:t>
+            </w:r>
+            <w:proofErr w:type="spellStart"/>
+            <w:r>
+              <w:rPr>
+                <w:rFonts w:ascii="Calibri" w:eastAsia="Calibri" w:hAnsi="Calibri" w:cs="Calibri"/>
+                <w:color w:val="16191F"/>
+                <w:sz w:val="24"/>
+                <w:szCs w:val="24"/>
+              </w:rPr>
+              <w:t>numtickets</w:t>
+            </w:r>
+            <w:proofErr w:type="spellEnd"/>
+            <w:r>
+              <w:rPr>
+                <w:rFonts w:ascii="Calibri" w:eastAsia="Calibri" w:hAnsi="Calibri" w:cs="Calibri"/>
+                <w:color w:val="16191F"/>
+                <w:sz w:val="24"/>
+                <w:szCs w:val="24"/>
+              </w:rPr>
+              <w:t xml:space="preserve"> </w:t>
+            </w:r>
+            <w:proofErr w:type="spellStart"/>
+            <w:r>
+              <w:rPr>
+                <w:rFonts w:ascii="Calibri" w:eastAsia="Calibri" w:hAnsi="Calibri" w:cs="Calibri"/>
+                <w:color w:val="16191F"/>
+                <w:sz w:val="24"/>
+                <w:szCs w:val="24"/>
+              </w:rPr>
+              <w:t>smallint</w:t>
+            </w:r>
+            <w:proofErr w:type="spellEnd"/>
+            <w:r>
+              <w:rPr>
+                <w:rFonts w:ascii="Calibri" w:eastAsia="Calibri" w:hAnsi="Calibri" w:cs="Calibri"/>
+                <w:color w:val="16191F"/>
+                <w:sz w:val="24"/>
+                <w:szCs w:val="24"/>
+              </w:rPr>
+              <w:t xml:space="preserve"> not null,</w:t>
             </w:r>
           </w:p>
           <w:p>
@@ -1961,7 +2527,26 @@
                 <w:szCs w:val="24"/>
               </w:rPr>
               <w:tab/>
-              <w:t xml:space="preserve">priceperticket </w:t>
+            </w:r>
+            <w:proofErr w:type="spellStart"/>
+            <w:r>
+              <w:rPr>
+                <w:rFonts w:ascii="Calibri" w:eastAsia="Calibri" w:hAnsi="Calibri" w:cs="Calibri"/>
+                <w:color w:val="16191F"/>
+                <w:sz w:val="24"/>
+                <w:szCs w:val="24"/>
+              </w:rPr>
+              <w:t>priceperticket</w:t>
+            </w:r>
+            <w:proofErr w:type="spellEnd"/>
+            <w:r>
+              <w:rPr>
+                <w:rFonts w:ascii="Calibri" w:eastAsia="Calibri" w:hAnsi="Calibri" w:cs="Calibri"/>
+                <w:color w:val="16191F"/>
+                <w:sz w:val="24"/>
+                <w:szCs w:val="24"/>
+              </w:rPr>
+              <w:t xml:space="preserve"> </w:t>
             </w:r>
             <w:proofErr w:type="gramStart"/>
             <w:r>
@@ -2002,7 +2587,26 @@
                 <w:szCs w:val="24"/>
               </w:rPr>
               <w:tab/>
-              <w:t xml:space="preserve">totalprice </w:t>
+            </w:r>
+            <w:proofErr w:type="spellStart"/>
+            <w:r>
+              <w:rPr>
+                <w:rFonts w:ascii="Calibri" w:eastAsia="Calibri" w:hAnsi="Calibri" w:cs="Calibri"/>
+                <w:color w:val="16191F"/>
+                <w:sz w:val="24"/>
+                <w:szCs w:val="24"/>
+              </w:rPr>
+              <w:t>totalprice</w:t>
+            </w:r>
+            <w:proofErr w:type="spellEnd"/>
+            <w:r>
+              <w:rPr>
+                <w:rFonts w:ascii="Calibri" w:eastAsia="Calibri" w:hAnsi="Calibri" w:cs="Calibri"/>
+                <w:color w:val="16191F"/>
+                <w:sz w:val="24"/>
+                <w:szCs w:val="24"/>
+              </w:rPr>
+              <w:t xml:space="preserve"> </w:t>
             </w:r>
             <w:proofErr w:type="gramStart"/>
             <w:r>
@@ -2043,7 +2647,26 @@
                 <w:szCs w:val="24"/>
               </w:rPr>
               <w:tab/>
-              <w:t>listtime timestamp);</w:t>
+            </w:r>
+            <w:proofErr w:type="spellStart"/>
+            <w:r>
+              <w:rPr>
+                <w:rFonts w:ascii="Calibri" w:eastAsia="Calibri" w:hAnsi="Calibri" w:cs="Calibri"/>
+                <w:color w:val="16191F"/>
+                <w:sz w:val="24"/>
+                <w:szCs w:val="24"/>
+              </w:rPr>
+              <w:t>listtime</w:t>
+            </w:r>
+            <w:proofErr w:type="spellEnd"/>
+            <w:r>
+              <w:rPr>
+                <w:rFonts w:ascii="Calibri" w:eastAsia="Calibri" w:hAnsi="Calibri" w:cs="Calibri"/>
+                <w:color w:val="16191F"/>
+                <w:sz w:val="24"/>
+                <w:szCs w:val="24"/>
+              </w:rPr>
+              <w:t xml:space="preserve"> timestamp);</w:t>
             </w:r>
           </w:p>
           <w:p>
@@ -2160,6 +2783,7 @@
               </w:rPr>
               <w:t xml:space="preserve">copy </w:t>
             </w:r>
+            <w:proofErr w:type="spellStart"/>
             <w:proofErr w:type="gramStart"/>
             <w:r>
               <w:rPr>
@@ -2178,7 +2802,17 @@
                 <w:sz w:val="24"/>
                 <w:szCs w:val="24"/>
               </w:rPr>
-              <w:t xml:space="preserve">_parquet </w:t>
+              <w:t>_parquet</w:t>
+            </w:r>
+            <w:proofErr w:type="spellEnd"/>
+            <w:r>
+              <w:rPr>
+                <w:rFonts w:ascii="Calibri" w:eastAsia="Calibri" w:hAnsi="Calibri" w:cs="Calibri"/>
+                <w:color w:val="16191F"/>
+                <w:sz w:val="24"/>
+                <w:szCs w:val="24"/>
+              </w:rPr>
+              <w:t xml:space="preserve"> </w:t>
             </w:r>
           </w:p>
           <w:p>
@@ -2211,15 +2845,27 @@
                 <w:szCs w:val="24"/>
               </w:rPr>
             </w:pPr>
-            <w:r>
-              <w:rPr>
-                <w:rFonts w:ascii="Calibri" w:eastAsia="Calibri" w:hAnsi="Calibri" w:cs="Calibri"/>
-                <w:color w:val="16191F"/>
-                <w:sz w:val="24"/>
-                <w:szCs w:val="24"/>
-              </w:rPr>
-              <w:t>iam_role '</w:t>
-            </w:r>
+            <w:proofErr w:type="spellStart"/>
+            <w:r>
+              <w:rPr>
+                <w:rFonts w:ascii="Calibri" w:eastAsia="Calibri" w:hAnsi="Calibri" w:cs="Calibri"/>
+                <w:color w:val="16191F"/>
+                <w:sz w:val="24"/>
+                <w:szCs w:val="24"/>
+              </w:rPr>
+              <w:t>iam_role</w:t>
+            </w:r>
+            <w:proofErr w:type="spellEnd"/>
+            <w:r>
+              <w:rPr>
+                <w:rFonts w:ascii="Calibri" w:eastAsia="Calibri" w:hAnsi="Calibri" w:cs="Calibri"/>
+                <w:color w:val="16191F"/>
+                <w:sz w:val="24"/>
+                <w:szCs w:val="24"/>
+              </w:rPr>
+              <w:t xml:space="preserve"> '</w:t>
+            </w:r>
+            <w:proofErr w:type="spellStart"/>
             <w:proofErr w:type="gramStart"/>
             <w:r>
               <w:rPr>
@@ -2248,7 +2894,17 @@
                 <w:sz w:val="24"/>
                 <w:szCs w:val="24"/>
               </w:rPr>
-              <w:t>iam::111081800296:role</w:t>
+              <w:t>iam</w:t>
+            </w:r>
+            <w:proofErr w:type="spellEnd"/>
+            <w:r>
+              <w:rPr>
+                <w:rFonts w:ascii="Calibri" w:eastAsia="Calibri" w:hAnsi="Calibri" w:cs="Calibri"/>
+                <w:color w:val="16191F"/>
+                <w:sz w:val="24"/>
+                <w:szCs w:val="24"/>
+              </w:rPr>
+              <w:t>::111081800296:role</w:t>
             </w:r>
             <w:proofErr w:type="gramEnd"/>
             <w:r>
@@ -2258,7 +2914,27 @@
                 <w:sz w:val="24"/>
                 <w:szCs w:val="24"/>
               </w:rPr>
-              <w:t>/Redshift_admin'</w:t>
+              <w:t>/</w:t>
+            </w:r>
+            <w:proofErr w:type="spellStart"/>
+            <w:r>
+              <w:rPr>
+                <w:rFonts w:ascii="Calibri" w:eastAsia="Calibri" w:hAnsi="Calibri" w:cs="Calibri"/>
+                <w:color w:val="16191F"/>
+                <w:sz w:val="24"/>
+                <w:szCs w:val="24"/>
+              </w:rPr>
+              <w:t>Redshift_admin</w:t>
+            </w:r>
+            <w:proofErr w:type="spellEnd"/>
+            <w:r>
+              <w:rPr>
+                <w:rFonts w:ascii="Calibri" w:eastAsia="Calibri" w:hAnsi="Calibri" w:cs="Calibri"/>
+                <w:color w:val="16191F"/>
+                <w:sz w:val="24"/>
+                <w:szCs w:val="24"/>
+              </w:rPr>
+              <w:t>'</w:t>
             </w:r>
           </w:p>
           <w:p>
@@ -2690,7 +3366,27 @@
                 <w:szCs w:val="24"/>
               </w:rPr>
               <w:lastRenderedPageBreak/>
-              <w:t>6|308|8|2109|L Elisir d Amore|2008-10-10 19:30:00</w:t>
+              <w:t xml:space="preserve">6|308|8|2109|L </w:t>
+            </w:r>
+            <w:proofErr w:type="spellStart"/>
+            <w:r>
+              <w:rPr>
+                <w:rFonts w:ascii="Calibri" w:eastAsia="Calibri" w:hAnsi="Calibri" w:cs="Calibri"/>
+                <w:color w:val="16191F"/>
+                <w:sz w:val="24"/>
+                <w:szCs w:val="24"/>
+              </w:rPr>
+              <w:t>Elisir</w:t>
+            </w:r>
+            <w:proofErr w:type="spellEnd"/>
+            <w:r>
+              <w:rPr>
+                <w:rFonts w:ascii="Calibri" w:eastAsia="Calibri" w:hAnsi="Calibri" w:cs="Calibri"/>
+                <w:color w:val="16191F"/>
+                <w:sz w:val="24"/>
+                <w:szCs w:val="24"/>
+              </w:rPr>
+              <w:t xml:space="preserve"> d Amore|2008-10-10 19:30:00</w:t>
             </w:r>
           </w:p>
           <w:p>
@@ -2935,6 +3631,7 @@
               </w:rPr>
               <w:t xml:space="preserve">create table </w:t>
             </w:r>
+            <w:proofErr w:type="spellStart"/>
             <w:proofErr w:type="gramStart"/>
             <w:r>
               <w:rPr>
@@ -2945,6 +3642,7 @@
               </w:rPr>
               <w:t>test.event</w:t>
             </w:r>
+            <w:proofErr w:type="spellEnd"/>
             <w:proofErr w:type="gramEnd"/>
             <w:r>
               <w:rPr>
@@ -2974,7 +3672,46 @@
                 <w:szCs w:val="24"/>
               </w:rPr>
               <w:tab/>
-              <w:t>eventid integer not null distkey,</w:t>
+            </w:r>
+            <w:proofErr w:type="spellStart"/>
+            <w:r>
+              <w:rPr>
+                <w:rFonts w:ascii="Calibri" w:eastAsia="Calibri" w:hAnsi="Calibri" w:cs="Calibri"/>
+                <w:color w:val="16191F"/>
+                <w:sz w:val="24"/>
+                <w:szCs w:val="24"/>
+              </w:rPr>
+              <w:t>eventid</w:t>
+            </w:r>
+            <w:proofErr w:type="spellEnd"/>
+            <w:r>
+              <w:rPr>
+                <w:rFonts w:ascii="Calibri" w:eastAsia="Calibri" w:hAnsi="Calibri" w:cs="Calibri"/>
+                <w:color w:val="16191F"/>
+                <w:sz w:val="24"/>
+                <w:szCs w:val="24"/>
+              </w:rPr>
+              <w:t xml:space="preserve"> integer not null </w:t>
+            </w:r>
+            <w:proofErr w:type="spellStart"/>
+            <w:r>
+              <w:rPr>
+                <w:rFonts w:ascii="Calibri" w:eastAsia="Calibri" w:hAnsi="Calibri" w:cs="Calibri"/>
+                <w:color w:val="16191F"/>
+                <w:sz w:val="24"/>
+                <w:szCs w:val="24"/>
+              </w:rPr>
+              <w:t>distkey</w:t>
+            </w:r>
+            <w:proofErr w:type="spellEnd"/>
+            <w:r>
+              <w:rPr>
+                <w:rFonts w:ascii="Calibri" w:eastAsia="Calibri" w:hAnsi="Calibri" w:cs="Calibri"/>
+                <w:color w:val="16191F"/>
+                <w:sz w:val="24"/>
+                <w:szCs w:val="24"/>
+              </w:rPr>
+              <w:t>,</w:t>
             </w:r>
           </w:p>
           <w:p>
@@ -2995,7 +3732,46 @@
                 <w:szCs w:val="24"/>
               </w:rPr>
               <w:tab/>
-              <w:t>venueid smallint not null,</w:t>
+            </w:r>
+            <w:proofErr w:type="spellStart"/>
+            <w:r>
+              <w:rPr>
+                <w:rFonts w:ascii="Calibri" w:eastAsia="Calibri" w:hAnsi="Calibri" w:cs="Calibri"/>
+                <w:color w:val="16191F"/>
+                <w:sz w:val="24"/>
+                <w:szCs w:val="24"/>
+              </w:rPr>
+              <w:t>venueid</w:t>
+            </w:r>
+            <w:proofErr w:type="spellEnd"/>
+            <w:r>
+              <w:rPr>
+                <w:rFonts w:ascii="Calibri" w:eastAsia="Calibri" w:hAnsi="Calibri" w:cs="Calibri"/>
+                <w:color w:val="16191F"/>
+                <w:sz w:val="24"/>
+                <w:szCs w:val="24"/>
+              </w:rPr>
+              <w:t xml:space="preserve"> </w:t>
+            </w:r>
+            <w:proofErr w:type="spellStart"/>
+            <w:r>
+              <w:rPr>
+                <w:rFonts w:ascii="Calibri" w:eastAsia="Calibri" w:hAnsi="Calibri" w:cs="Calibri"/>
+                <w:color w:val="16191F"/>
+                <w:sz w:val="24"/>
+                <w:szCs w:val="24"/>
+              </w:rPr>
+              <w:t>smallint</w:t>
+            </w:r>
+            <w:proofErr w:type="spellEnd"/>
+            <w:r>
+              <w:rPr>
+                <w:rFonts w:ascii="Calibri" w:eastAsia="Calibri" w:hAnsi="Calibri" w:cs="Calibri"/>
+                <w:color w:val="16191F"/>
+                <w:sz w:val="24"/>
+                <w:szCs w:val="24"/>
+              </w:rPr>
+              <w:t xml:space="preserve"> not null,</w:t>
             </w:r>
           </w:p>
           <w:p>
@@ -3016,7 +3792,46 @@
                 <w:szCs w:val="24"/>
               </w:rPr>
               <w:tab/>
-              <w:t>catid smallint not null,</w:t>
+            </w:r>
+            <w:proofErr w:type="spellStart"/>
+            <w:r>
+              <w:rPr>
+                <w:rFonts w:ascii="Calibri" w:eastAsia="Calibri" w:hAnsi="Calibri" w:cs="Calibri"/>
+                <w:color w:val="16191F"/>
+                <w:sz w:val="24"/>
+                <w:szCs w:val="24"/>
+              </w:rPr>
+              <w:t>catid</w:t>
+            </w:r>
+            <w:proofErr w:type="spellEnd"/>
+            <w:r>
+              <w:rPr>
+                <w:rFonts w:ascii="Calibri" w:eastAsia="Calibri" w:hAnsi="Calibri" w:cs="Calibri"/>
+                <w:color w:val="16191F"/>
+                <w:sz w:val="24"/>
+                <w:szCs w:val="24"/>
+              </w:rPr>
+              <w:t xml:space="preserve"> </w:t>
+            </w:r>
+            <w:proofErr w:type="spellStart"/>
+            <w:r>
+              <w:rPr>
+                <w:rFonts w:ascii="Calibri" w:eastAsia="Calibri" w:hAnsi="Calibri" w:cs="Calibri"/>
+                <w:color w:val="16191F"/>
+                <w:sz w:val="24"/>
+                <w:szCs w:val="24"/>
+              </w:rPr>
+              <w:t>smallint</w:t>
+            </w:r>
+            <w:proofErr w:type="spellEnd"/>
+            <w:r>
+              <w:rPr>
+                <w:rFonts w:ascii="Calibri" w:eastAsia="Calibri" w:hAnsi="Calibri" w:cs="Calibri"/>
+                <w:color w:val="16191F"/>
+                <w:sz w:val="24"/>
+                <w:szCs w:val="24"/>
+              </w:rPr>
+              <w:t xml:space="preserve"> not null,</w:t>
             </w:r>
           </w:p>
           <w:p>
@@ -3037,7 +3852,66 @@
                 <w:szCs w:val="24"/>
               </w:rPr>
               <w:tab/>
-              <w:t>dateid smallint not null sortkey,</w:t>
+            </w:r>
+            <w:proofErr w:type="spellStart"/>
+            <w:r>
+              <w:rPr>
+                <w:rFonts w:ascii="Calibri" w:eastAsia="Calibri" w:hAnsi="Calibri" w:cs="Calibri"/>
+                <w:color w:val="16191F"/>
+                <w:sz w:val="24"/>
+                <w:szCs w:val="24"/>
+              </w:rPr>
+              <w:t>dateid</w:t>
+            </w:r>
+            <w:proofErr w:type="spellEnd"/>
+            <w:r>
+              <w:rPr>
+                <w:rFonts w:ascii="Calibri" w:eastAsia="Calibri" w:hAnsi="Calibri" w:cs="Calibri"/>
+                <w:color w:val="16191F"/>
+                <w:sz w:val="24"/>
+                <w:szCs w:val="24"/>
+              </w:rPr>
+              <w:t xml:space="preserve"> </w:t>
+            </w:r>
+            <w:proofErr w:type="spellStart"/>
+            <w:r>
+              <w:rPr>
+                <w:rFonts w:ascii="Calibri" w:eastAsia="Calibri" w:hAnsi="Calibri" w:cs="Calibri"/>
+                <w:color w:val="16191F"/>
+                <w:sz w:val="24"/>
+                <w:szCs w:val="24"/>
+              </w:rPr>
+              <w:t>smallint</w:t>
+            </w:r>
+            <w:proofErr w:type="spellEnd"/>
+            <w:r>
+              <w:rPr>
+                <w:rFonts w:ascii="Calibri" w:eastAsia="Calibri" w:hAnsi="Calibri" w:cs="Calibri"/>
+                <w:color w:val="16191F"/>
+                <w:sz w:val="24"/>
+                <w:szCs w:val="24"/>
+              </w:rPr>
+              <w:t xml:space="preserve"> not null </w:t>
+            </w:r>
+            <w:proofErr w:type="spellStart"/>
+            <w:r>
+              <w:rPr>
+                <w:rFonts w:ascii="Calibri" w:eastAsia="Calibri" w:hAnsi="Calibri" w:cs="Calibri"/>
+                <w:color w:val="16191F"/>
+                <w:sz w:val="24"/>
+                <w:szCs w:val="24"/>
+              </w:rPr>
+              <w:t>sortkey</w:t>
+            </w:r>
+            <w:proofErr w:type="spellEnd"/>
+            <w:r>
+              <w:rPr>
+                <w:rFonts w:ascii="Calibri" w:eastAsia="Calibri" w:hAnsi="Calibri" w:cs="Calibri"/>
+                <w:color w:val="16191F"/>
+                <w:sz w:val="24"/>
+                <w:szCs w:val="24"/>
+              </w:rPr>
+              <w:t>,</w:t>
             </w:r>
           </w:p>
           <w:p>
@@ -3058,7 +3932,26 @@
                 <w:szCs w:val="24"/>
               </w:rPr>
               <w:tab/>
-              <w:t xml:space="preserve">eventname </w:t>
+            </w:r>
+            <w:proofErr w:type="spellStart"/>
+            <w:r>
+              <w:rPr>
+                <w:rFonts w:ascii="Calibri" w:eastAsia="Calibri" w:hAnsi="Calibri" w:cs="Calibri"/>
+                <w:color w:val="16191F"/>
+                <w:sz w:val="24"/>
+                <w:szCs w:val="24"/>
+              </w:rPr>
+              <w:t>eventname</w:t>
+            </w:r>
+            <w:proofErr w:type="spellEnd"/>
+            <w:r>
+              <w:rPr>
+                <w:rFonts w:ascii="Calibri" w:eastAsia="Calibri" w:hAnsi="Calibri" w:cs="Calibri"/>
+                <w:color w:val="16191F"/>
+                <w:sz w:val="24"/>
+                <w:szCs w:val="24"/>
+              </w:rPr>
+              <w:t xml:space="preserve"> </w:t>
             </w:r>
             <w:proofErr w:type="gramStart"/>
             <w:r>
@@ -3099,7 +3992,26 @@
                 <w:szCs w:val="24"/>
               </w:rPr>
               <w:tab/>
-              <w:t>starttime timestamp);</w:t>
+            </w:r>
+            <w:proofErr w:type="spellStart"/>
+            <w:r>
+              <w:rPr>
+                <w:rFonts w:ascii="Calibri" w:eastAsia="Calibri" w:hAnsi="Calibri" w:cs="Calibri"/>
+                <w:color w:val="16191F"/>
+                <w:sz w:val="24"/>
+                <w:szCs w:val="24"/>
+              </w:rPr>
+              <w:t>starttime</w:t>
+            </w:r>
+            <w:proofErr w:type="spellEnd"/>
+            <w:r>
+              <w:rPr>
+                <w:rFonts w:ascii="Calibri" w:eastAsia="Calibri" w:hAnsi="Calibri" w:cs="Calibri"/>
+                <w:color w:val="16191F"/>
+                <w:sz w:val="24"/>
+                <w:szCs w:val="24"/>
+              </w:rPr>
+              <w:t xml:space="preserve"> timestamp);</w:t>
             </w:r>
           </w:p>
           <w:p>
@@ -3238,6 +4150,7 @@
               </w:rPr>
               <w:t xml:space="preserve">copy </w:t>
             </w:r>
+            <w:proofErr w:type="spellStart"/>
             <w:proofErr w:type="gramStart"/>
             <w:r>
               <w:rPr>
@@ -3248,6 +4161,7 @@
               </w:rPr>
               <w:t>test.event</w:t>
             </w:r>
+            <w:proofErr w:type="spellEnd"/>
             <w:proofErr w:type="gramEnd"/>
           </w:p>
           <w:p>
@@ -3280,15 +4194,27 @@
                 <w:szCs w:val="24"/>
               </w:rPr>
             </w:pPr>
-            <w:r>
-              <w:rPr>
-                <w:rFonts w:ascii="Calibri" w:eastAsia="Calibri" w:hAnsi="Calibri" w:cs="Calibri"/>
-                <w:color w:val="16191F"/>
-                <w:sz w:val="24"/>
-                <w:szCs w:val="24"/>
-              </w:rPr>
-              <w:t>iam_role '</w:t>
-            </w:r>
+            <w:proofErr w:type="spellStart"/>
+            <w:r>
+              <w:rPr>
+                <w:rFonts w:ascii="Calibri" w:eastAsia="Calibri" w:hAnsi="Calibri" w:cs="Calibri"/>
+                <w:color w:val="16191F"/>
+                <w:sz w:val="24"/>
+                <w:szCs w:val="24"/>
+              </w:rPr>
+              <w:t>iam_role</w:t>
+            </w:r>
+            <w:proofErr w:type="spellEnd"/>
+            <w:r>
+              <w:rPr>
+                <w:rFonts w:ascii="Calibri" w:eastAsia="Calibri" w:hAnsi="Calibri" w:cs="Calibri"/>
+                <w:color w:val="16191F"/>
+                <w:sz w:val="24"/>
+                <w:szCs w:val="24"/>
+              </w:rPr>
+              <w:t xml:space="preserve"> '</w:t>
+            </w:r>
+            <w:proofErr w:type="spellStart"/>
             <w:proofErr w:type="gramStart"/>
             <w:r>
               <w:rPr>
@@ -3317,7 +4243,17 @@
                 <w:sz w:val="24"/>
                 <w:szCs w:val="24"/>
               </w:rPr>
-              <w:t>iam::111081800296:role</w:t>
+              <w:t>iam</w:t>
+            </w:r>
+            <w:proofErr w:type="spellEnd"/>
+            <w:r>
+              <w:rPr>
+                <w:rFonts w:ascii="Calibri" w:eastAsia="Calibri" w:hAnsi="Calibri" w:cs="Calibri"/>
+                <w:color w:val="16191F"/>
+                <w:sz w:val="24"/>
+                <w:szCs w:val="24"/>
+              </w:rPr>
+              <w:t>::111081800296:role</w:t>
             </w:r>
             <w:proofErr w:type="gramEnd"/>
             <w:r>
@@ -3327,7 +4263,27 @@
                 <w:sz w:val="24"/>
                 <w:szCs w:val="24"/>
               </w:rPr>
-              <w:t>/Redshift_admin'</w:t>
+              <w:t>/</w:t>
+            </w:r>
+            <w:proofErr w:type="spellStart"/>
+            <w:r>
+              <w:rPr>
+                <w:rFonts w:ascii="Calibri" w:eastAsia="Calibri" w:hAnsi="Calibri" w:cs="Calibri"/>
+                <w:color w:val="16191F"/>
+                <w:sz w:val="24"/>
+                <w:szCs w:val="24"/>
+              </w:rPr>
+              <w:t>Redshift_admin</w:t>
+            </w:r>
+            <w:proofErr w:type="spellEnd"/>
+            <w:r>
+              <w:rPr>
+                <w:rFonts w:ascii="Calibri" w:eastAsia="Calibri" w:hAnsi="Calibri" w:cs="Calibri"/>
+                <w:color w:val="16191F"/>
+                <w:sz w:val="24"/>
+                <w:szCs w:val="24"/>
+              </w:rPr>
+              <w:t>'</w:t>
             </w:r>
           </w:p>
           <w:p>
@@ -3340,6 +4296,7 @@
                 <w:szCs w:val="24"/>
               </w:rPr>
             </w:pPr>
+            <w:proofErr w:type="spellStart"/>
             <w:r>
               <w:rPr>
                 <w:rFonts w:ascii="Calibri" w:eastAsia="Calibri" w:hAnsi="Calibri" w:cs="Calibri"/>
@@ -3349,6 +4306,7 @@
               </w:rPr>
               <w:t>removequotes</w:t>
             </w:r>
+            <w:proofErr w:type="spellEnd"/>
           </w:p>
           <w:p>
             <w:pPr>
@@ -3360,6 +4318,7 @@
                 <w:szCs w:val="24"/>
               </w:rPr>
             </w:pPr>
+            <w:proofErr w:type="spellStart"/>
             <w:r>
               <w:rPr>
                 <w:rFonts w:ascii="Calibri" w:eastAsia="Calibri" w:hAnsi="Calibri" w:cs="Calibri"/>
@@ -3369,6 +4328,7 @@
               </w:rPr>
               <w:t>emptyasnull</w:t>
             </w:r>
+            <w:proofErr w:type="spellEnd"/>
           </w:p>
           <w:p>
             <w:pPr>
@@ -3380,6 +4340,7 @@
                 <w:szCs w:val="24"/>
               </w:rPr>
             </w:pPr>
+            <w:proofErr w:type="spellStart"/>
             <w:r>
               <w:rPr>
                 <w:rFonts w:ascii="Calibri" w:eastAsia="Calibri" w:hAnsi="Calibri" w:cs="Calibri"/>
@@ -3389,6 +4350,7 @@
               </w:rPr>
               <w:t>blanksasnull</w:t>
             </w:r>
+            <w:proofErr w:type="spellEnd"/>
           </w:p>
           <w:p>
             <w:pPr>
@@ -3400,14 +4362,25 @@
                 <w:szCs w:val="24"/>
               </w:rPr>
             </w:pPr>
-            <w:r>
-              <w:rPr>
-                <w:rFonts w:ascii="Calibri" w:eastAsia="Calibri" w:hAnsi="Calibri" w:cs="Calibri"/>
-                <w:color w:val="16191F"/>
-                <w:sz w:val="24"/>
-                <w:szCs w:val="24"/>
-              </w:rPr>
-              <w:t>maxerror 5</w:t>
+            <w:proofErr w:type="spellStart"/>
+            <w:r>
+              <w:rPr>
+                <w:rFonts w:ascii="Calibri" w:eastAsia="Calibri" w:hAnsi="Calibri" w:cs="Calibri"/>
+                <w:color w:val="16191F"/>
+                <w:sz w:val="24"/>
+                <w:szCs w:val="24"/>
+              </w:rPr>
+              <w:t>maxerror</w:t>
+            </w:r>
+            <w:proofErr w:type="spellEnd"/>
+            <w:r>
+              <w:rPr>
+                <w:rFonts w:ascii="Calibri" w:eastAsia="Calibri" w:hAnsi="Calibri" w:cs="Calibri"/>
+                <w:color w:val="16191F"/>
+                <w:sz w:val="24"/>
+                <w:szCs w:val="24"/>
+              </w:rPr>
+              <w:t xml:space="preserve"> 5</w:t>
             </w:r>
           </w:p>
           <w:p>
@@ -3440,14 +4413,25 @@
                 <w:szCs w:val="24"/>
               </w:rPr>
             </w:pPr>
-            <w:r>
-              <w:rPr>
-                <w:rFonts w:ascii="Calibri" w:eastAsia="Calibri" w:hAnsi="Calibri" w:cs="Calibri"/>
-                <w:color w:val="16191F"/>
-                <w:sz w:val="24"/>
-                <w:szCs w:val="24"/>
-              </w:rPr>
-              <w:t>timeformat 'YYYY-MM-DD HH:</w:t>
+            <w:proofErr w:type="spellStart"/>
+            <w:r>
+              <w:rPr>
+                <w:rFonts w:ascii="Calibri" w:eastAsia="Calibri" w:hAnsi="Calibri" w:cs="Calibri"/>
+                <w:color w:val="16191F"/>
+                <w:sz w:val="24"/>
+                <w:szCs w:val="24"/>
+              </w:rPr>
+              <w:t>timeformat</w:t>
+            </w:r>
+            <w:proofErr w:type="spellEnd"/>
+            <w:r>
+              <w:rPr>
+                <w:rFonts w:ascii="Calibri" w:eastAsia="Calibri" w:hAnsi="Calibri" w:cs="Calibri"/>
+                <w:color w:val="16191F"/>
+                <w:sz w:val="24"/>
+                <w:szCs w:val="24"/>
+              </w:rPr>
+              <w:t xml:space="preserve"> 'YYYY-MM-DD HH:</w:t>
             </w:r>
             <w:proofErr w:type="gramStart"/>
             <w:r>
@@ -3629,7 +4613,25 @@
                 <w:sz w:val="24"/>
                 <w:szCs w:val="24"/>
               </w:rPr>
-              <w:t>1|Toyota Park|Bridgeview|IL|</w:t>
+              <w:t xml:space="preserve">1|Toyota </w:t>
+            </w:r>
+            <w:proofErr w:type="spellStart"/>
+            <w:r>
+              <w:rPr>
+                <w:color w:val="16191F"/>
+                <w:sz w:val="24"/>
+                <w:szCs w:val="24"/>
+              </w:rPr>
+              <w:t>Park|Bridgeview|IL</w:t>
+            </w:r>
+            <w:proofErr w:type="spellEnd"/>
+            <w:r>
+              <w:rPr>
+                <w:color w:val="16191F"/>
+                <w:sz w:val="24"/>
+                <w:szCs w:val="24"/>
+              </w:rPr>
+              <w:t>|</w:t>
             </w:r>
           </w:p>
           <w:p>
@@ -3655,7 +4657,25 @@
                 <w:sz w:val="24"/>
                 <w:szCs w:val="24"/>
               </w:rPr>
-              <w:t>2|Columbus Crew Stadium|Columbus|OH|</w:t>
+              <w:t xml:space="preserve">2|Columbus Crew </w:t>
+            </w:r>
+            <w:proofErr w:type="spellStart"/>
+            <w:r>
+              <w:rPr>
+                <w:color w:val="16191F"/>
+                <w:sz w:val="24"/>
+                <w:szCs w:val="24"/>
+              </w:rPr>
+              <w:t>Stadium|Columbus|OH</w:t>
+            </w:r>
+            <w:proofErr w:type="spellEnd"/>
+            <w:r>
+              <w:rPr>
+                <w:color w:val="16191F"/>
+                <w:sz w:val="24"/>
+                <w:szCs w:val="24"/>
+              </w:rPr>
+              <w:t>|</w:t>
             </w:r>
           </w:p>
           <w:p>
@@ -3681,7 +4701,25 @@
                 <w:sz w:val="24"/>
                 <w:szCs w:val="24"/>
               </w:rPr>
-              <w:t>3|RFK Stadium|Washington|DC|</w:t>
+              <w:t xml:space="preserve">3|RFK </w:t>
+            </w:r>
+            <w:proofErr w:type="spellStart"/>
+            <w:r>
+              <w:rPr>
+                <w:color w:val="16191F"/>
+                <w:sz w:val="24"/>
+                <w:szCs w:val="24"/>
+              </w:rPr>
+              <w:t>Stadium|Washington|DC</w:t>
+            </w:r>
+            <w:proofErr w:type="spellEnd"/>
+            <w:r>
+              <w:rPr>
+                <w:color w:val="16191F"/>
+                <w:sz w:val="24"/>
+                <w:szCs w:val="24"/>
+              </w:rPr>
+              <w:t>|</w:t>
             </w:r>
           </w:p>
           <w:p>
@@ -3707,7 +4745,43 @@
                 <w:sz w:val="24"/>
                 <w:szCs w:val="24"/>
               </w:rPr>
-              <w:t>4|CommunityAmerica Ballpark|Kansas City|KS|</w:t>
+              <w:t xml:space="preserve">4|CommunityAmerica </w:t>
+            </w:r>
+            <w:proofErr w:type="spellStart"/>
+            <w:r>
+              <w:rPr>
+                <w:color w:val="16191F"/>
+                <w:sz w:val="24"/>
+                <w:szCs w:val="24"/>
+              </w:rPr>
+              <w:t>Ballpark|Kansas</w:t>
+            </w:r>
+            <w:proofErr w:type="spellEnd"/>
+            <w:r>
+              <w:rPr>
+                <w:color w:val="16191F"/>
+                <w:sz w:val="24"/>
+                <w:szCs w:val="24"/>
+              </w:rPr>
+              <w:t xml:space="preserve"> </w:t>
+            </w:r>
+            <w:proofErr w:type="spellStart"/>
+            <w:r>
+              <w:rPr>
+                <w:color w:val="16191F"/>
+                <w:sz w:val="24"/>
+                <w:szCs w:val="24"/>
+              </w:rPr>
+              <w:t>City|KS</w:t>
+            </w:r>
+            <w:proofErr w:type="spellEnd"/>
+            <w:r>
+              <w:rPr>
+                <w:color w:val="16191F"/>
+                <w:sz w:val="24"/>
+                <w:szCs w:val="24"/>
+              </w:rPr>
+              <w:t>|</w:t>
             </w:r>
           </w:p>
           <w:p>
@@ -3733,7 +4807,25 @@
                 <w:sz w:val="24"/>
                 <w:szCs w:val="24"/>
               </w:rPr>
-              <w:t>5|Gillette Stadium|Foxborough|MA|</w:t>
+              <w:t xml:space="preserve">5|Gillette </w:t>
+            </w:r>
+            <w:proofErr w:type="spellStart"/>
+            <w:r>
+              <w:rPr>
+                <w:color w:val="16191F"/>
+                <w:sz w:val="24"/>
+                <w:szCs w:val="24"/>
+              </w:rPr>
+              <w:t>Stadium|Foxborough|MA</w:t>
+            </w:r>
+            <w:proofErr w:type="spellEnd"/>
+            <w:r>
+              <w:rPr>
+                <w:color w:val="16191F"/>
+                <w:sz w:val="24"/>
+                <w:szCs w:val="24"/>
+              </w:rPr>
+              <w:t>|</w:t>
             </w:r>
           </w:p>
           <w:p>
@@ -3759,7 +4851,25 @@
                 <w:sz w:val="24"/>
                 <w:szCs w:val="24"/>
               </w:rPr>
-              <w:t>6|New York Giants Stadium|East Rutherford|NJ|</w:t>
+              <w:t xml:space="preserve">6|New York Giants Stadium|East </w:t>
+            </w:r>
+            <w:proofErr w:type="spellStart"/>
+            <w:r>
+              <w:rPr>
+                <w:color w:val="16191F"/>
+                <w:sz w:val="24"/>
+                <w:szCs w:val="24"/>
+              </w:rPr>
+              <w:t>Rutherford|NJ</w:t>
+            </w:r>
+            <w:proofErr w:type="spellEnd"/>
+            <w:r>
+              <w:rPr>
+                <w:color w:val="16191F"/>
+                <w:sz w:val="24"/>
+                <w:szCs w:val="24"/>
+              </w:rPr>
+              <w:t>|</w:t>
             </w:r>
           </w:p>
           <w:p>
@@ -3837,7 +4947,43 @@
                 <w:sz w:val="24"/>
                 <w:szCs w:val="24"/>
               </w:rPr>
-              <w:t>9|Dick's Sporting Goods Park|Commerce City|CO|</w:t>
+              <w:t xml:space="preserve">9|Dick's Sporting Goods </w:t>
+            </w:r>
+            <w:proofErr w:type="spellStart"/>
+            <w:r>
+              <w:rPr>
+                <w:color w:val="16191F"/>
+                <w:sz w:val="24"/>
+                <w:szCs w:val="24"/>
+              </w:rPr>
+              <w:t>Park|Commerce</w:t>
+            </w:r>
+            <w:proofErr w:type="spellEnd"/>
+            <w:r>
+              <w:rPr>
+                <w:color w:val="16191F"/>
+                <w:sz w:val="24"/>
+                <w:szCs w:val="24"/>
+              </w:rPr>
+              <w:t xml:space="preserve"> </w:t>
+            </w:r>
+            <w:proofErr w:type="spellStart"/>
+            <w:r>
+              <w:rPr>
+                <w:color w:val="16191F"/>
+                <w:sz w:val="24"/>
+                <w:szCs w:val="24"/>
+              </w:rPr>
+              <w:t>City|CO</w:t>
+            </w:r>
+            <w:proofErr w:type="spellEnd"/>
+            <w:r>
+              <w:rPr>
+                <w:color w:val="16191F"/>
+                <w:sz w:val="24"/>
+                <w:szCs w:val="24"/>
+              </w:rPr>
+              <w:t>|</w:t>
             </w:r>
           </w:p>
           <w:p>
@@ -3863,7 +5009,25 @@
                 <w:sz w:val="24"/>
                 <w:szCs w:val="24"/>
               </w:rPr>
-              <w:t>10|Pizza Hut Park|Frisco|TX|</w:t>
+              <w:t xml:space="preserve">10|Pizza Hut </w:t>
+            </w:r>
+            <w:proofErr w:type="spellStart"/>
+            <w:r>
+              <w:rPr>
+                <w:color w:val="16191F"/>
+                <w:sz w:val="24"/>
+                <w:szCs w:val="24"/>
+              </w:rPr>
+              <w:t>Park|Frisco|TX</w:t>
+            </w:r>
+            <w:proofErr w:type="spellEnd"/>
+            <w:r>
+              <w:rPr>
+                <w:color w:val="16191F"/>
+                <w:sz w:val="24"/>
+                <w:szCs w:val="24"/>
+              </w:rPr>
+              <w:t>|</w:t>
             </w:r>
           </w:p>
           <w:p>
@@ -4009,6 +5173,7 @@
               </w:rPr>
               <w:t xml:space="preserve">create table </w:t>
             </w:r>
+            <w:proofErr w:type="spellStart"/>
             <w:proofErr w:type="gramStart"/>
             <w:r>
               <w:rPr>
@@ -4037,7 +5202,17 @@
                 <w:sz w:val="24"/>
                 <w:szCs w:val="24"/>
               </w:rPr>
-              <w:t>new(</w:t>
+              <w:t>new</w:t>
+            </w:r>
+            <w:proofErr w:type="spellEnd"/>
+            <w:r>
+              <w:rPr>
+                <w:rFonts w:ascii="Calibri" w:eastAsia="Calibri" w:hAnsi="Calibri" w:cs="Calibri"/>
+                <w:color w:val="16191F"/>
+                <w:sz w:val="24"/>
+                <w:szCs w:val="24"/>
+              </w:rPr>
+              <w:t>(</w:t>
             </w:r>
             <w:proofErr w:type="gramEnd"/>
           </w:p>
@@ -4051,14 +5226,45 @@
                 <w:szCs w:val="24"/>
               </w:rPr>
             </w:pPr>
-            <w:r>
-              <w:rPr>
-                <w:rFonts w:ascii="Calibri" w:eastAsia="Calibri" w:hAnsi="Calibri" w:cs="Calibri"/>
-                <w:color w:val="16191F"/>
-                <w:sz w:val="24"/>
-                <w:szCs w:val="24"/>
-              </w:rPr>
-              <w:t>venueid smallint not null,</w:t>
+            <w:proofErr w:type="spellStart"/>
+            <w:r>
+              <w:rPr>
+                <w:rFonts w:ascii="Calibri" w:eastAsia="Calibri" w:hAnsi="Calibri" w:cs="Calibri"/>
+                <w:color w:val="16191F"/>
+                <w:sz w:val="24"/>
+                <w:szCs w:val="24"/>
+              </w:rPr>
+              <w:t>venueid</w:t>
+            </w:r>
+            <w:proofErr w:type="spellEnd"/>
+            <w:r>
+              <w:rPr>
+                <w:rFonts w:ascii="Calibri" w:eastAsia="Calibri" w:hAnsi="Calibri" w:cs="Calibri"/>
+                <w:color w:val="16191F"/>
+                <w:sz w:val="24"/>
+                <w:szCs w:val="24"/>
+              </w:rPr>
+              <w:t xml:space="preserve"> </w:t>
+            </w:r>
+            <w:proofErr w:type="spellStart"/>
+            <w:r>
+              <w:rPr>
+                <w:rFonts w:ascii="Calibri" w:eastAsia="Calibri" w:hAnsi="Calibri" w:cs="Calibri"/>
+                <w:color w:val="16191F"/>
+                <w:sz w:val="24"/>
+                <w:szCs w:val="24"/>
+              </w:rPr>
+              <w:t>smallint</w:t>
+            </w:r>
+            <w:proofErr w:type="spellEnd"/>
+            <w:r>
+              <w:rPr>
+                <w:rFonts w:ascii="Calibri" w:eastAsia="Calibri" w:hAnsi="Calibri" w:cs="Calibri"/>
+                <w:color w:val="16191F"/>
+                <w:sz w:val="24"/>
+                <w:szCs w:val="24"/>
+              </w:rPr>
+              <w:t xml:space="preserve"> not null,</w:t>
             </w:r>
           </w:p>
           <w:p>
@@ -4071,14 +5277,25 @@
                 <w:szCs w:val="24"/>
               </w:rPr>
             </w:pPr>
-            <w:r>
-              <w:rPr>
-                <w:rFonts w:ascii="Calibri" w:eastAsia="Calibri" w:hAnsi="Calibri" w:cs="Calibri"/>
-                <w:color w:val="16191F"/>
-                <w:sz w:val="24"/>
-                <w:szCs w:val="24"/>
-              </w:rPr>
-              <w:t xml:space="preserve">venuename </w:t>
+            <w:proofErr w:type="spellStart"/>
+            <w:r>
+              <w:rPr>
+                <w:rFonts w:ascii="Calibri" w:eastAsia="Calibri" w:hAnsi="Calibri" w:cs="Calibri"/>
+                <w:color w:val="16191F"/>
+                <w:sz w:val="24"/>
+                <w:szCs w:val="24"/>
+              </w:rPr>
+              <w:t>venuename</w:t>
+            </w:r>
+            <w:proofErr w:type="spellEnd"/>
+            <w:r>
+              <w:rPr>
+                <w:rFonts w:ascii="Calibri" w:eastAsia="Calibri" w:hAnsi="Calibri" w:cs="Calibri"/>
+                <w:color w:val="16191F"/>
+                <w:sz w:val="24"/>
+                <w:szCs w:val="24"/>
+              </w:rPr>
+              <w:t xml:space="preserve"> </w:t>
             </w:r>
             <w:proofErr w:type="gramStart"/>
             <w:r>
@@ -4111,14 +5328,25 @@
                 <w:szCs w:val="24"/>
               </w:rPr>
             </w:pPr>
-            <w:r>
-              <w:rPr>
-                <w:rFonts w:ascii="Calibri" w:eastAsia="Calibri" w:hAnsi="Calibri" w:cs="Calibri"/>
-                <w:color w:val="16191F"/>
-                <w:sz w:val="24"/>
-                <w:szCs w:val="24"/>
-              </w:rPr>
-              <w:t xml:space="preserve">venuecity </w:t>
+            <w:proofErr w:type="spellStart"/>
+            <w:r>
+              <w:rPr>
+                <w:rFonts w:ascii="Calibri" w:eastAsia="Calibri" w:hAnsi="Calibri" w:cs="Calibri"/>
+                <w:color w:val="16191F"/>
+                <w:sz w:val="24"/>
+                <w:szCs w:val="24"/>
+              </w:rPr>
+              <w:t>venuecity</w:t>
+            </w:r>
+            <w:proofErr w:type="spellEnd"/>
+            <w:r>
+              <w:rPr>
+                <w:rFonts w:ascii="Calibri" w:eastAsia="Calibri" w:hAnsi="Calibri" w:cs="Calibri"/>
+                <w:color w:val="16191F"/>
+                <w:sz w:val="24"/>
+                <w:szCs w:val="24"/>
+              </w:rPr>
+              <w:t xml:space="preserve"> </w:t>
             </w:r>
             <w:proofErr w:type="gramStart"/>
             <w:r>
@@ -4151,14 +5379,25 @@
                 <w:szCs w:val="24"/>
               </w:rPr>
             </w:pPr>
-            <w:r>
-              <w:rPr>
-                <w:rFonts w:ascii="Calibri" w:eastAsia="Calibri" w:hAnsi="Calibri" w:cs="Calibri"/>
-                <w:color w:val="16191F"/>
-                <w:sz w:val="24"/>
-                <w:szCs w:val="24"/>
-              </w:rPr>
-              <w:t xml:space="preserve">venuestate </w:t>
+            <w:proofErr w:type="spellStart"/>
+            <w:r>
+              <w:rPr>
+                <w:rFonts w:ascii="Calibri" w:eastAsia="Calibri" w:hAnsi="Calibri" w:cs="Calibri"/>
+                <w:color w:val="16191F"/>
+                <w:sz w:val="24"/>
+                <w:szCs w:val="24"/>
+              </w:rPr>
+              <w:t>venuestate</w:t>
+            </w:r>
+            <w:proofErr w:type="spellEnd"/>
+            <w:r>
+              <w:rPr>
+                <w:rFonts w:ascii="Calibri" w:eastAsia="Calibri" w:hAnsi="Calibri" w:cs="Calibri"/>
+                <w:color w:val="16191F"/>
+                <w:sz w:val="24"/>
+                <w:szCs w:val="24"/>
+              </w:rPr>
+              <w:t xml:space="preserve"> </w:t>
             </w:r>
             <w:proofErr w:type="gramStart"/>
             <w:r>
@@ -4191,14 +5430,25 @@
                 <w:szCs w:val="24"/>
               </w:rPr>
             </w:pPr>
-            <w:r>
-              <w:rPr>
-                <w:rFonts w:ascii="Calibri" w:eastAsia="Calibri" w:hAnsi="Calibri" w:cs="Calibri"/>
-                <w:color w:val="16191F"/>
-                <w:sz w:val="24"/>
-                <w:szCs w:val="24"/>
-              </w:rPr>
-              <w:t>venueseats integer not null default '1000');</w:t>
+            <w:proofErr w:type="spellStart"/>
+            <w:r>
+              <w:rPr>
+                <w:rFonts w:ascii="Calibri" w:eastAsia="Calibri" w:hAnsi="Calibri" w:cs="Calibri"/>
+                <w:color w:val="16191F"/>
+                <w:sz w:val="24"/>
+                <w:szCs w:val="24"/>
+              </w:rPr>
+              <w:t>venueseats</w:t>
+            </w:r>
+            <w:proofErr w:type="spellEnd"/>
+            <w:r>
+              <w:rPr>
+                <w:rFonts w:ascii="Calibri" w:eastAsia="Calibri" w:hAnsi="Calibri" w:cs="Calibri"/>
+                <w:color w:val="16191F"/>
+                <w:sz w:val="24"/>
+                <w:szCs w:val="24"/>
+              </w:rPr>
+              <w:t xml:space="preserve"> integer not null default '1000');</w:t>
             </w:r>
           </w:p>
         </w:tc>
@@ -4284,6 +5534,7 @@
               </w:rPr>
               <w:t xml:space="preserve">copy </w:t>
             </w:r>
+            <w:proofErr w:type="spellStart"/>
             <w:proofErr w:type="gramStart"/>
             <w:r>
               <w:rPr>
@@ -4312,8 +5563,19 @@
                 <w:sz w:val="24"/>
                 <w:szCs w:val="24"/>
               </w:rPr>
-              <w:t>new(</w:t>
-            </w:r>
+              <w:t>new</w:t>
+            </w:r>
+            <w:proofErr w:type="spellEnd"/>
+            <w:r>
+              <w:rPr>
+                <w:rFonts w:ascii="Calibri" w:eastAsia="Calibri" w:hAnsi="Calibri" w:cs="Calibri"/>
+                <w:color w:val="16191F"/>
+                <w:sz w:val="24"/>
+                <w:szCs w:val="24"/>
+              </w:rPr>
+              <w:t>(</w:t>
+            </w:r>
+            <w:proofErr w:type="spellStart"/>
             <w:proofErr w:type="gramEnd"/>
             <w:r>
               <w:rPr>
@@ -4322,7 +5584,77 @@
                 <w:sz w:val="24"/>
                 <w:szCs w:val="24"/>
               </w:rPr>
-              <w:t xml:space="preserve">venueid, venuename, venuecity, venuestate) </w:t>
+              <w:t>venueid</w:t>
+            </w:r>
+            <w:proofErr w:type="spellEnd"/>
+            <w:r>
+              <w:rPr>
+                <w:rFonts w:ascii="Calibri" w:eastAsia="Calibri" w:hAnsi="Calibri" w:cs="Calibri"/>
+                <w:color w:val="16191F"/>
+                <w:sz w:val="24"/>
+                <w:szCs w:val="24"/>
+              </w:rPr>
+              <w:t xml:space="preserve">, </w:t>
+            </w:r>
+            <w:proofErr w:type="spellStart"/>
+            <w:r>
+              <w:rPr>
+                <w:rFonts w:ascii="Calibri" w:eastAsia="Calibri" w:hAnsi="Calibri" w:cs="Calibri"/>
+                <w:color w:val="16191F"/>
+                <w:sz w:val="24"/>
+                <w:szCs w:val="24"/>
+              </w:rPr>
+              <w:t>venuename</w:t>
+            </w:r>
+            <w:proofErr w:type="spellEnd"/>
+            <w:r>
+              <w:rPr>
+                <w:rFonts w:ascii="Calibri" w:eastAsia="Calibri" w:hAnsi="Calibri" w:cs="Calibri"/>
+                <w:color w:val="16191F"/>
+                <w:sz w:val="24"/>
+                <w:szCs w:val="24"/>
+              </w:rPr>
+              <w:t xml:space="preserve">, </w:t>
+            </w:r>
+            <w:proofErr w:type="spellStart"/>
+            <w:r>
+              <w:rPr>
+                <w:rFonts w:ascii="Calibri" w:eastAsia="Calibri" w:hAnsi="Calibri" w:cs="Calibri"/>
+                <w:color w:val="16191F"/>
+                <w:sz w:val="24"/>
+                <w:szCs w:val="24"/>
+              </w:rPr>
+              <w:t>venuecity</w:t>
+            </w:r>
+            <w:proofErr w:type="spellEnd"/>
+            <w:r>
+              <w:rPr>
+                <w:rFonts w:ascii="Calibri" w:eastAsia="Calibri" w:hAnsi="Calibri" w:cs="Calibri"/>
+                <w:color w:val="16191F"/>
+                <w:sz w:val="24"/>
+                <w:szCs w:val="24"/>
+              </w:rPr>
+              <w:t xml:space="preserve">, </w:t>
+            </w:r>
+            <w:proofErr w:type="spellStart"/>
+            <w:r>
+              <w:rPr>
+                <w:rFonts w:ascii="Calibri" w:eastAsia="Calibri" w:hAnsi="Calibri" w:cs="Calibri"/>
+                <w:color w:val="16191F"/>
+                <w:sz w:val="24"/>
+                <w:szCs w:val="24"/>
+              </w:rPr>
+              <w:t>venuestate</w:t>
+            </w:r>
+            <w:proofErr w:type="spellEnd"/>
+            <w:r>
+              <w:rPr>
+                <w:rFonts w:ascii="Calibri" w:eastAsia="Calibri" w:hAnsi="Calibri" w:cs="Calibri"/>
+                <w:color w:val="16191F"/>
+                <w:sz w:val="24"/>
+                <w:szCs w:val="24"/>
+              </w:rPr>
+              <w:t xml:space="preserve">) </w:t>
             </w:r>
           </w:p>
           <w:p>
@@ -4342,7 +5674,27 @@
                 <w:sz w:val="24"/>
                 <w:szCs w:val="24"/>
               </w:rPr>
-              <w:t xml:space="preserve">from 's3://bootcamp-bucket/data/venue_new/venue_noseats.txt' </w:t>
+              <w:t>from 's3://bootcamp-bucket/data/</w:t>
+            </w:r>
+            <w:proofErr w:type="spellStart"/>
+            <w:r>
+              <w:rPr>
+                <w:rFonts w:ascii="Calibri" w:eastAsia="Calibri" w:hAnsi="Calibri" w:cs="Calibri"/>
+                <w:color w:val="16191F"/>
+                <w:sz w:val="24"/>
+                <w:szCs w:val="24"/>
+              </w:rPr>
+              <w:t>venue_new</w:t>
+            </w:r>
+            <w:proofErr w:type="spellEnd"/>
+            <w:r>
+              <w:rPr>
+                <w:rFonts w:ascii="Calibri" w:eastAsia="Calibri" w:hAnsi="Calibri" w:cs="Calibri"/>
+                <w:color w:val="16191F"/>
+                <w:sz w:val="24"/>
+                <w:szCs w:val="24"/>
+              </w:rPr>
+              <w:t xml:space="preserve">/venue_noseats.txt' </w:t>
             </w:r>
           </w:p>
           <w:p>
@@ -4355,15 +5707,27 @@
                 <w:szCs w:val="24"/>
               </w:rPr>
             </w:pPr>
-            <w:r>
-              <w:rPr>
-                <w:rFonts w:ascii="Calibri" w:eastAsia="Calibri" w:hAnsi="Calibri" w:cs="Calibri"/>
-                <w:color w:val="16191F"/>
-                <w:sz w:val="24"/>
-                <w:szCs w:val="24"/>
-              </w:rPr>
-              <w:t>iam_role '</w:t>
-            </w:r>
+            <w:proofErr w:type="spellStart"/>
+            <w:r>
+              <w:rPr>
+                <w:rFonts w:ascii="Calibri" w:eastAsia="Calibri" w:hAnsi="Calibri" w:cs="Calibri"/>
+                <w:color w:val="16191F"/>
+                <w:sz w:val="24"/>
+                <w:szCs w:val="24"/>
+              </w:rPr>
+              <w:t>iam_role</w:t>
+            </w:r>
+            <w:proofErr w:type="spellEnd"/>
+            <w:r>
+              <w:rPr>
+                <w:rFonts w:ascii="Calibri" w:eastAsia="Calibri" w:hAnsi="Calibri" w:cs="Calibri"/>
+                <w:color w:val="16191F"/>
+                <w:sz w:val="24"/>
+                <w:szCs w:val="24"/>
+              </w:rPr>
+              <w:t xml:space="preserve"> '</w:t>
+            </w:r>
+            <w:proofErr w:type="spellStart"/>
             <w:proofErr w:type="gramStart"/>
             <w:r>
               <w:rPr>
@@ -4392,7 +5756,17 @@
                 <w:sz w:val="24"/>
                 <w:szCs w:val="24"/>
               </w:rPr>
-              <w:t>iam::111081800296:role</w:t>
+              <w:t>iam</w:t>
+            </w:r>
+            <w:proofErr w:type="spellEnd"/>
+            <w:r>
+              <w:rPr>
+                <w:rFonts w:ascii="Calibri" w:eastAsia="Calibri" w:hAnsi="Calibri" w:cs="Calibri"/>
+                <w:color w:val="16191F"/>
+                <w:sz w:val="24"/>
+                <w:szCs w:val="24"/>
+              </w:rPr>
+              <w:t>::111081800296:role</w:t>
             </w:r>
             <w:proofErr w:type="gramEnd"/>
             <w:r>
@@ -4402,7 +5776,27 @@
                 <w:sz w:val="24"/>
                 <w:szCs w:val="24"/>
               </w:rPr>
-              <w:t>/Redshift_admin'</w:t>
+              <w:t>/</w:t>
+            </w:r>
+            <w:proofErr w:type="spellStart"/>
+            <w:r>
+              <w:rPr>
+                <w:rFonts w:ascii="Calibri" w:eastAsia="Calibri" w:hAnsi="Calibri" w:cs="Calibri"/>
+                <w:color w:val="16191F"/>
+                <w:sz w:val="24"/>
+                <w:szCs w:val="24"/>
+              </w:rPr>
+              <w:t>Redshift_admin</w:t>
+            </w:r>
+            <w:proofErr w:type="spellEnd"/>
+            <w:r>
+              <w:rPr>
+                <w:rFonts w:ascii="Calibri" w:eastAsia="Calibri" w:hAnsi="Calibri" w:cs="Calibri"/>
+                <w:color w:val="16191F"/>
+                <w:sz w:val="24"/>
+                <w:szCs w:val="24"/>
+              </w:rPr>
+              <w:t>'</w:t>
             </w:r>
           </w:p>
           <w:p>
@@ -4447,6 +5841,197 @@
         </w:tc>
       </w:tr>
     </w:tbl>
+    <w:p>
+      <w:pPr>
+        <w:jc w:val="both"/>
+        <w:rPr>
+          <w:rFonts w:ascii="Calibri" w:eastAsia="Calibri" w:hAnsi="Calibri" w:cs="Calibri"/>
+          <w:color w:val="16191F"/>
+          <w:sz w:val="24"/>
+          <w:szCs w:val="24"/>
+        </w:rPr>
+      </w:pPr>
+    </w:p>
+    <w:p>
+      <w:pPr>
+        <w:jc w:val="both"/>
+        <w:rPr>
+          <w:rFonts w:ascii="Calibri" w:eastAsia="Calibri" w:hAnsi="Calibri" w:cs="Calibri"/>
+          <w:color w:val="16191F"/>
+          <w:sz w:val="24"/>
+          <w:szCs w:val="24"/>
+        </w:rPr>
+      </w:pPr>
+    </w:p>
+    <w:p>
+      <w:pPr>
+        <w:jc w:val="both"/>
+        <w:rPr>
+          <w:rFonts w:ascii="Calibri" w:eastAsia="Calibri" w:hAnsi="Calibri" w:cs="Calibri"/>
+          <w:b/>
+          <w:bCs/>
+          <w:color w:val="16191F"/>
+          <w:sz w:val="24"/>
+          <w:szCs w:val="24"/>
+          <w:lang w:val="en-US"/>
+        </w:rPr>
+      </w:pPr>
+      <w:r>
+        <w:rPr>
+          <w:rFonts w:ascii="Calibri" w:eastAsia="Calibri" w:hAnsi="Calibri" w:cs="Calibri"/>
+          <w:b/>
+          <w:bCs/>
+          <w:color w:val="16191F"/>
+          <w:sz w:val="24"/>
+          <w:szCs w:val="24"/>
+          <w:lang w:val="en-US"/>
+        </w:rPr>
+        <w:t>Conclusion</w:t>
+      </w:r>
+    </w:p>
+    <w:p>
+      <w:pPr>
+        <w:jc w:val="both"/>
+        <w:rPr>
+          <w:rFonts w:ascii="Calibri" w:eastAsia="Calibri" w:hAnsi="Calibri" w:cs="Calibri"/>
+          <w:color w:val="16191F"/>
+          <w:sz w:val="24"/>
+          <w:szCs w:val="24"/>
+          <w:lang w:val="en-US"/>
+        </w:rPr>
+      </w:pPr>
+      <w:r>
+        <w:rPr>
+          <w:rFonts w:ascii="Calibri" w:eastAsia="Calibri" w:hAnsi="Calibri" w:cs="Calibri"/>
+          <w:color w:val="16191F"/>
+          <w:sz w:val="24"/>
+          <w:szCs w:val="24"/>
+          <w:lang w:val="en-US"/>
+        </w:rPr>
+        <w:t xml:space="preserve">In this project, I learned how to load, transform, and export data using </w:t>
+      </w:r>
+      <w:r>
+        <w:rPr>
+          <w:rFonts w:ascii="Calibri" w:eastAsia="Calibri" w:hAnsi="Calibri" w:cs="Calibri"/>
+          <w:b/>
+          <w:bCs/>
+          <w:color w:val="16191F"/>
+          <w:sz w:val="24"/>
+          <w:szCs w:val="24"/>
+          <w:lang w:val="en-US"/>
+        </w:rPr>
+        <w:t>Amazon Redshift and Amazon S3</w:t>
+      </w:r>
+      <w:r>
+        <w:rPr>
+          <w:rFonts w:ascii="Calibri" w:eastAsia="Calibri" w:hAnsi="Calibri" w:cs="Calibri"/>
+          <w:color w:val="16191F"/>
+          <w:sz w:val="24"/>
+          <w:szCs w:val="24"/>
+          <w:lang w:val="en-US"/>
+        </w:rPr>
+        <w:t xml:space="preserve">. I created tables with appropriate data types, distribution keys, and sort keys, and used the COPY command to load pipe-delimited data from S3 into Redshift. I also practiced </w:t>
+      </w:r>
+      <w:r>
+        <w:rPr>
+          <w:rFonts w:ascii="Calibri" w:eastAsia="Calibri" w:hAnsi="Calibri" w:cs="Calibri"/>
+          <w:color w:val="16191F"/>
+          <w:sz w:val="24"/>
+          <w:szCs w:val="24"/>
+          <w:lang w:val="en-US"/>
+        </w:rPr>
+        <w:lastRenderedPageBreak/>
+        <w:t>handling data-loading options such as removing quotation marks, converting empty strings and blank values to NULL, setting error limits, and specifying timestamp formats.</w:t>
+      </w:r>
+    </w:p>
+    <w:p>
+      <w:pPr>
+        <w:jc w:val="both"/>
+        <w:rPr>
+          <w:rFonts w:ascii="Calibri" w:eastAsia="Calibri" w:hAnsi="Calibri" w:cs="Calibri"/>
+          <w:color w:val="16191F"/>
+          <w:sz w:val="24"/>
+          <w:szCs w:val="24"/>
+          <w:lang w:val="en-US"/>
+        </w:rPr>
+      </w:pPr>
+      <w:r>
+        <w:rPr>
+          <w:rFonts w:ascii="Calibri" w:eastAsia="Calibri" w:hAnsi="Calibri" w:cs="Calibri"/>
+          <w:color w:val="16191F"/>
+          <w:sz w:val="24"/>
+          <w:szCs w:val="24"/>
+          <w:lang w:val="en-US"/>
+        </w:rPr>
+        <w:t>Additionally, I learned how to use the UNLOAD command to export Redshift data to S3 in both CSV and Parquet formats. Finally, I explored loading Parquet data into Redshift and using default column values when the source file does not contain all the table columns.</w:t>
+      </w:r>
+    </w:p>
+    <w:p>
+      <w:pPr>
+        <w:jc w:val="both"/>
+        <w:rPr>
+          <w:rFonts w:ascii="Calibri" w:eastAsia="Calibri" w:hAnsi="Calibri" w:cs="Calibri"/>
+          <w:color w:val="16191F"/>
+          <w:sz w:val="24"/>
+          <w:szCs w:val="24"/>
+          <w:lang w:val="en-US"/>
+        </w:rPr>
+      </w:pPr>
+    </w:p>
+    <w:p>
+      <w:pPr>
+        <w:jc w:val="both"/>
+        <w:rPr>
+          <w:rFonts w:ascii="Calibri" w:eastAsia="Calibri" w:hAnsi="Calibri" w:cs="Calibri"/>
+          <w:color w:val="16191F"/>
+          <w:sz w:val="24"/>
+          <w:szCs w:val="24"/>
+          <w:lang w:val="en-US"/>
+        </w:rPr>
+      </w:pPr>
+      <w:r>
+        <w:rPr>
+          <w:rFonts w:ascii="Calibri" w:eastAsia="Calibri" w:hAnsi="Calibri" w:cs="Calibri"/>
+          <w:color w:val="16191F"/>
+          <w:sz w:val="24"/>
+          <w:szCs w:val="24"/>
+          <w:lang w:val="en-US"/>
+        </w:rPr>
+        <w:t xml:space="preserve">Overall, this hands-on project strengthened my understanding of </w:t>
+      </w:r>
+      <w:r>
+        <w:rPr>
+          <w:rFonts w:ascii="Calibri" w:eastAsia="Calibri" w:hAnsi="Calibri" w:cs="Calibri"/>
+          <w:b/>
+          <w:bCs/>
+          <w:color w:val="16191F"/>
+          <w:sz w:val="24"/>
+          <w:szCs w:val="24"/>
+          <w:lang w:val="en-US"/>
+        </w:rPr>
+        <w:t>data ingestion, data loading, file formats, error handling, and data movement between Amazon S3 and Amazon Redshift</w:t>
+      </w:r>
+      <w:r>
+        <w:rPr>
+          <w:rFonts w:ascii="Calibri" w:eastAsia="Calibri" w:hAnsi="Calibri" w:cs="Calibri"/>
+          <w:color w:val="16191F"/>
+          <w:sz w:val="24"/>
+          <w:szCs w:val="24"/>
+          <w:lang w:val="en-US"/>
+        </w:rPr>
+        <w:t xml:space="preserve"> - </w:t>
+      </w:r>
+      <w:r>
+        <w:rPr>
+          <w:rFonts w:ascii="Calibri" w:eastAsia="Calibri" w:hAnsi="Calibri" w:cs="Calibri"/>
+          <w:color w:val="16191F"/>
+          <w:sz w:val="24"/>
+          <w:szCs w:val="24"/>
+          <w:lang w:val="en-US"/>
+        </w:rPr>
+        <w:t>essential concepts for building efficient AWS data engineering and ETL workflows.</w:t>
+      </w:r>
+    </w:p>
     <w:p>
       <w:pPr>
         <w:jc w:val="both"/>
@@ -5130,7 +6715,6 @@
   <w:style w:type="character" w:default="1" w:styleId="DefaultParagraphFont">
     <w:name w:val="Default Paragraph Font"/>
     <w:uiPriority w:val="1"/>
-    <w:semiHidden/>
     <w:unhideWhenUsed/>
   </w:style>
   <w:style w:type="table" w:default="1" w:styleId="TableNormal">

</xml_diff>